<commit_message>
Update linkks in template bhsh.docx
</commit_message>
<xml_diff>
--- a/templates/bhsh.docx
+++ b/templates/bhsh.docx
@@ -1,11 +1,11 @@
 
 <file path=word/document.xml><?xml version="1.0" encoding="utf-8"?>
-<w:document xmlns:wpc="http://schemas.microsoft.com/office/word/2010/wordprocessingCanvas" xmlns:cx="http://schemas.microsoft.com/office/drawing/2014/chartex" xmlns:cx1="http://schemas.microsoft.com/office/drawing/2015/9/8/chartex" xmlns:cx2="http://schemas.microsoft.com/office/drawing/2015/10/21/chartex" xmlns:cx3="http://schemas.microsoft.com/office/drawing/2016/5/9/chartex" xmlns:cx4="http://schemas.microsoft.com/office/drawing/2016/5/10/chartex" xmlns:cx5="http://schemas.microsoft.com/office/drawing/2016/5/11/chartex" xmlns:cx6="http://schemas.microsoft.com/office/drawing/2016/5/12/chartex" xmlns:cx7="http://schemas.microsoft.com/office/drawing/2016/5/13/chartex" xmlns:cx8="http://schemas.microsoft.com/office/drawing/2016/5/14/chartex" xmlns:mc="http://schemas.openxmlformats.org/markup-compatibility/2006" xmlns:aink="http://schemas.microsoft.com/office/drawing/2016/ink" xmlns:am3d="http://schemas.microsoft.com/office/drawing/2017/model3d" xmlns:o="urn:schemas-microsoft-com:office:office" xmlns:oel="http://schemas.microsoft.com/office/2019/extlst" xmlns:r="http://schemas.openxmlformats.org/officeDocument/2006/relationships" xmlns:m="http://schemas.openxmlformats.org/officeDocument/2006/math" xmlns:v="urn:schemas-microsoft-com:vml" xmlns:wp14="http://schemas.microsoft.com/office/word/2010/wordprocessingDrawing" xmlns:wp="http://schemas.openxmlformats.org/drawingml/2006/wordprocessingDrawing" xmlns:w10="urn:schemas-microsoft-com:office:word" xmlns:w="http://schemas.openxmlformats.org/wordprocessingml/2006/main" xmlns:w14="http://schemas.microsoft.com/office/word/2010/wordml" xmlns:w15="http://schemas.microsoft.com/office/word/2012/wordml" xmlns:w16cex="http://schemas.microsoft.com/office/word/2018/wordml/cex" xmlns:w16cid="http://schemas.microsoft.com/office/word/2016/wordml/cid" xmlns:w16="http://schemas.microsoft.com/office/word/2018/wordml" xmlns:w16du="http://schemas.microsoft.com/office/word/2023/wordml/word16du" xmlns:w16sdtdh="http://schemas.microsoft.com/office/word/2020/wordml/sdtdatahash" xmlns:w16sdtfl="http://schemas.microsoft.com/office/word/2024/wordml/sdtformatlock" xmlns:w16se="http://schemas.microsoft.com/office/word/2015/wordml/symex" xmlns:wpg="http://schemas.microsoft.com/office/word/2010/wordprocessingGroup" xmlns:wpi="http://schemas.microsoft.com/office/word/2010/wordprocessingInk" xmlns:wne="http://schemas.microsoft.com/office/word/2006/wordml" xmlns:wps="http://schemas.microsoft.com/office/word/2010/wordprocessingShape" mc:Ignorable="w14 w15 w16se w16cid w16 w16cex w16sdtdh w16sdtfl w16du wp14">
+<w:document xmlns:wpc="http://schemas.microsoft.com/office/word/2010/wordprocessingCanvas" xmlns:cx="http://schemas.microsoft.com/office/drawing/2014/chartex" xmlns:cx1="http://schemas.microsoft.com/office/drawing/2015/9/8/chartex" xmlns:cx2="http://schemas.microsoft.com/office/drawing/2015/10/21/chartex" xmlns:cx3="http://schemas.microsoft.com/office/drawing/2016/5/9/chartex" xmlns:cx4="http://schemas.microsoft.com/office/drawing/2016/5/10/chartex" xmlns:cx5="http://schemas.microsoft.com/office/drawing/2016/5/11/chartex" xmlns:cx6="http://schemas.microsoft.com/office/drawing/2016/5/12/chartex" xmlns:cx7="http://schemas.microsoft.com/office/drawing/2016/5/13/chartex" xmlns:cx8="http://schemas.microsoft.com/office/drawing/2016/5/14/chartex" xmlns:mc="http://schemas.openxmlformats.org/markup-compatibility/2006" xmlns:aink="http://schemas.microsoft.com/office/drawing/2016/ink" xmlns:am3d="http://schemas.microsoft.com/office/drawing/2017/model3d" xmlns:o="urn:schemas-microsoft-com:office:office" xmlns:oel="http://schemas.microsoft.com/office/2019/extlst" xmlns:r="http://schemas.openxmlformats.org/officeDocument/2006/relationships" xmlns:m="http://schemas.openxmlformats.org/officeDocument/2006/math" xmlns:v="urn:schemas-microsoft-com:vml" xmlns:wp14="http://schemas.microsoft.com/office/word/2010/wordprocessingDrawing" xmlns:wp="http://schemas.openxmlformats.org/drawingml/2006/wordprocessingDrawing" xmlns:w10="urn:schemas-microsoft-com:office:word" xmlns:w="http://schemas.openxmlformats.org/wordprocessingml/2006/main" xmlns:w14="http://schemas.microsoft.com/office/word/2010/wordml" xmlns:w15="http://schemas.microsoft.com/office/word/2012/wordml" xmlns:w16cex="http://schemas.microsoft.com/office/word/2018/wordml/cex" xmlns:w16cid="http://schemas.microsoft.com/office/word/2016/wordml/cid" xmlns:w16="http://schemas.microsoft.com/office/word/2018/wordml" xmlns:w16sdtdh="http://schemas.microsoft.com/office/word/2020/wordml/sdtdatahash" xmlns:w16se="http://schemas.microsoft.com/office/word/2015/wordml/symex" xmlns:wpg="http://schemas.microsoft.com/office/word/2010/wordprocessingGroup" xmlns:wpi="http://schemas.microsoft.com/office/word/2010/wordprocessingInk" xmlns:wne="http://schemas.microsoft.com/office/word/2006/wordml" xmlns:wps="http://schemas.microsoft.com/office/word/2010/wordprocessingShape" mc:Ignorable="w14 w15 w16se w16cid w16 w16cex w16sdtdh wp14">
   <w:background w:color="DEECFC"/>
   <w:body>
     <w:p>
       <w:pPr>
-        <w:pStyle w:val="Titre1"/>
+        <w:pStyle w:val="Heading1"/>
       </w:pPr>
       <w:bookmarkStart w:id="0" w:name="_Toc214439872"/>
       <w:bookmarkStart w:id="1" w:name="_Toc214442139"/>
@@ -122,13 +122,29 @@
           <w:szCs w:val="16"/>
           <w:lang w:bidi="fr-FR"/>
         </w:rPr>
-        <w:t xml:space="preserve"> %}</w:t>
+        <w:t xml:space="preserve"> </w:t>
+      </w:r>
+      <w:proofErr w:type="gramStart"/>
+      <w:r>
+        <w:rPr>
+          <w:sz w:val="16"/>
+          <w:szCs w:val="16"/>
+          <w:lang w:bidi="fr-FR"/>
+        </w:rPr>
+        <w:t>%}</w:t>
       </w:r>
       <w:r>
         <w:rPr>
-          <w:rStyle w:val="Titre1Car"/>
-        </w:rPr>
-        <w:t>Prévision météorologiques</w:t>
+          <w:rStyle w:val="Heading1Char"/>
+        </w:rPr>
+        <w:t>Prévision</w:t>
+      </w:r>
+      <w:proofErr w:type="gramEnd"/>
+      <w:r>
+        <w:rPr>
+          <w:rStyle w:val="Heading1Char"/>
+        </w:rPr>
+        <w:t xml:space="preserve"> météorologiques</w:t>
       </w:r>
     </w:p>
     <w:p>
@@ -200,6 +216,7 @@
           <w:lang w:val="en-US" w:bidi="fr-FR"/>
         </w:rPr>
       </w:pPr>
+      <w:proofErr w:type="gramStart"/>
       <w:r>
         <w:rPr>
           <w:sz w:val="16"/>
@@ -215,7 +232,16 @@
           <w:szCs w:val="16"/>
           <w:lang w:val="en-US" w:bidi="fr-FR"/>
         </w:rPr>
-        <w:t>img_data</w:t>
+        <w:t>img</w:t>
+      </w:r>
+      <w:proofErr w:type="gramEnd"/>
+      <w:r>
+        <w:rPr>
+          <w:sz w:val="16"/>
+          <w:szCs w:val="16"/>
+          <w:lang w:val="en-US" w:bidi="fr-FR"/>
+        </w:rPr>
+        <w:t>_data</w:t>
       </w:r>
       <w:proofErr w:type="spellEnd"/>
       <w:r>
@@ -270,18 +296,28 @@
           <w:lang w:val="en-US" w:bidi="fr-FR"/>
         </w:rPr>
       </w:pPr>
+      <w:proofErr w:type="gramStart"/>
       <w:r>
         <w:rPr>
           <w:sz w:val="16"/>
           <w:szCs w:val="16"/>
           <w:lang w:val="en-US" w:bidi="fr-FR"/>
         </w:rPr>
-        <w:t xml:space="preserve">Source : </w:t>
+        <w:t>Source :</w:t>
+      </w:r>
+      <w:proofErr w:type="gramEnd"/>
+      <w:r>
+        <w:rPr>
+          <w:sz w:val="16"/>
+          <w:szCs w:val="16"/>
+          <w:lang w:val="en-US" w:bidi="fr-FR"/>
+        </w:rPr>
+        <w:t xml:space="preserve"> </w:t>
       </w:r>
       <w:hyperlink r:id="rId10" w:history="1">
         <w:r>
           <w:rPr>
-            <w:rStyle w:val="Lienhypertexte"/>
+            <w:rStyle w:val="Hyperlink"/>
             <w:szCs w:val="16"/>
             <w:lang w:val="en-US" w:bidi="fr-FR"/>
           </w:rPr>
@@ -325,7 +361,7 @@
     </w:p>
     <w:p>
       <w:pPr>
-        <w:pStyle w:val="Titre1"/>
+        <w:pStyle w:val="Heading1"/>
         <w:rPr>
           <w:lang w:val="en-US" w:bidi="fr-FR"/>
         </w:rPr>
@@ -336,11 +372,19 @@
       <w:bookmarkStart w:id="9" w:name="_Toc214442382"/>
       <w:bookmarkStart w:id="10" w:name="_Toc214442641"/>
       <w:bookmarkStart w:id="11" w:name="_Toc214443470"/>
+      <w:proofErr w:type="spellStart"/>
       <w:r>
         <w:rPr>
           <w:lang w:val="en-US" w:bidi="fr-FR"/>
         </w:rPr>
-        <w:t xml:space="preserve">Données </w:t>
+        <w:t>Données</w:t>
+      </w:r>
+      <w:proofErr w:type="spellEnd"/>
+      <w:r>
+        <w:rPr>
+          <w:lang w:val="en-US" w:bidi="fr-FR"/>
+        </w:rPr>
+        <w:t xml:space="preserve"> </w:t>
       </w:r>
       <w:proofErr w:type="spellStart"/>
       <w:r>
@@ -359,7 +403,7 @@
     </w:p>
     <w:tbl>
       <w:tblPr>
-        <w:tblStyle w:val="Tableausimple2"/>
+        <w:tblStyle w:val="PlainTable2"/>
         <w:tblW w:w="0" w:type="auto"/>
         <w:tblLook w:val="04A0" w:firstRow="1" w:lastRow="0" w:firstColumn="1" w:lastColumn="0" w:noHBand="0" w:noVBand="1"/>
       </w:tblPr>
@@ -571,16 +615,26 @@
           <w:szCs w:val="16"/>
           <w:lang w:val="en-US"/>
         </w:rPr>
-        <w:t xml:space="preserve"> %}</w:t>
+        <w:t xml:space="preserve"> </w:t>
       </w:r>
+      <w:proofErr w:type="gramStart"/>
       <w:r>
         <w:rPr>
           <w:sz w:val="16"/>
           <w:szCs w:val="16"/>
           <w:lang w:val="en-US"/>
         </w:rPr>
+        <w:t>%}</w:t>
+      </w:r>
+      <w:r>
+        <w:rPr>
+          <w:sz w:val="16"/>
+          <w:szCs w:val="16"/>
+          <w:lang w:val="en-US"/>
+        </w:rPr>
         <w:t>{</w:t>
       </w:r>
+      <w:proofErr w:type="gramEnd"/>
       <w:r>
         <w:rPr>
           <w:sz w:val="16"/>
@@ -660,7 +714,7 @@
     </w:p>
     <w:p>
       <w:pPr>
-        <w:pStyle w:val="Titre1"/>
+        <w:pStyle w:val="Heading1"/>
         <w:rPr>
           <w:lang w:val="en-US" w:bidi="fr-FR"/>
         </w:rPr>
@@ -671,12 +725,20 @@
       <w:bookmarkStart w:id="15" w:name="_Toc214442383"/>
       <w:bookmarkStart w:id="16" w:name="_Toc214442642"/>
       <w:bookmarkStart w:id="17" w:name="_Toc214443471"/>
+      <w:proofErr w:type="spellStart"/>
       <w:r>
         <w:rPr>
           <w:lang w:val="en-US" w:bidi="fr-FR"/>
         </w:rPr>
         <w:lastRenderedPageBreak/>
-        <w:t xml:space="preserve">Données </w:t>
+        <w:t>Données</w:t>
+      </w:r>
+      <w:proofErr w:type="spellEnd"/>
+      <w:r>
+        <w:rPr>
+          <w:lang w:val="en-US" w:bidi="fr-FR"/>
+        </w:rPr>
+        <w:t xml:space="preserve"> </w:t>
       </w:r>
       <w:proofErr w:type="spellStart"/>
       <w:r>
@@ -695,7 +757,7 @@
     </w:p>
     <w:tbl>
       <w:tblPr>
-        <w:tblStyle w:val="Tableausimple2"/>
+        <w:tblStyle w:val="PlainTable2"/>
         <w:tblW w:w="0" w:type="auto"/>
         <w:tblLook w:val="04A0" w:firstRow="1" w:lastRow="0" w:firstColumn="1" w:lastColumn="0" w:noHBand="0" w:noVBand="1"/>
       </w:tblPr>
@@ -929,6 +991,7 @@
           <w:lang w:val="en-US"/>
         </w:rPr>
       </w:pPr>
+      <w:proofErr w:type="gramStart"/>
       <w:r>
         <w:rPr>
           <w:sz w:val="16"/>
@@ -944,7 +1007,16 @@
           <w:szCs w:val="16"/>
           <w:lang w:val="en-US"/>
         </w:rPr>
-        <w:t>img_data</w:t>
+        <w:t>img</w:t>
+      </w:r>
+      <w:proofErr w:type="gramEnd"/>
+      <w:r>
+        <w:rPr>
+          <w:sz w:val="16"/>
+          <w:szCs w:val="16"/>
+          <w:lang w:val="en-US"/>
+        </w:rPr>
+        <w:t>_data</w:t>
       </w:r>
       <w:proofErr w:type="spellEnd"/>
       <w:r>
@@ -1034,7 +1106,7 @@
     </w:p>
     <w:p>
       <w:pPr>
-        <w:pStyle w:val="Titre1"/>
+        <w:pStyle w:val="Heading1"/>
         <w:rPr>
           <w:lang w:bidi="fr-FR"/>
         </w:rPr>
@@ -1065,6 +1137,7 @@
           <w:sz w:val="14"/>
         </w:rPr>
       </w:pPr>
+      <w:proofErr w:type="gramStart"/>
       <w:r>
         <w:rPr>
           <w:sz w:val="14"/>
@@ -1076,7 +1149,14 @@
         <w:rPr>
           <w:sz w:val="14"/>
         </w:rPr>
-        <w:t>couranto_txt</w:t>
+        <w:t>couranto</w:t>
+      </w:r>
+      <w:proofErr w:type="gramEnd"/>
+      <w:r>
+        <w:rPr>
+          <w:sz w:val="14"/>
+        </w:rPr>
+        <w:t>_txt</w:t>
       </w:r>
       <w:proofErr w:type="spellEnd"/>
       <w:r>
@@ -1093,6 +1173,7 @@
           <w:sz w:val="14"/>
         </w:rPr>
       </w:pPr>
+      <w:proofErr w:type="gramStart"/>
       <w:r>
         <w:rPr>
           <w:sz w:val="14"/>
@@ -1104,7 +1185,14 @@
         <w:rPr>
           <w:sz w:val="14"/>
         </w:rPr>
-        <w:t>couranto_img</w:t>
+        <w:t>couranto</w:t>
+      </w:r>
+      <w:proofErr w:type="gramEnd"/>
+      <w:r>
+        <w:rPr>
+          <w:sz w:val="14"/>
+        </w:rPr>
+        <w:t>_img</w:t>
       </w:r>
       <w:proofErr w:type="spellEnd"/>
       <w:r>
@@ -1144,7 +1232,7 @@
     </w:p>
     <w:p>
       <w:pPr>
-        <w:pStyle w:val="Titre1"/>
+        <w:pStyle w:val="Heading1"/>
         <w:rPr>
           <w:lang w:bidi="fr-FR"/>
         </w:rPr>
@@ -1175,6 +1263,7 @@
           <w:sz w:val="14"/>
         </w:rPr>
       </w:pPr>
+      <w:proofErr w:type="gramStart"/>
       <w:r>
         <w:rPr>
           <w:sz w:val="14"/>
@@ -1186,7 +1275,14 @@
         <w:rPr>
           <w:sz w:val="14"/>
         </w:rPr>
-        <w:t>temperature_img</w:t>
+        <w:t>temperature</w:t>
+      </w:r>
+      <w:proofErr w:type="gramEnd"/>
+      <w:r>
+        <w:rPr>
+          <w:sz w:val="14"/>
+        </w:rPr>
+        <w:t>_img</w:t>
       </w:r>
       <w:proofErr w:type="spellEnd"/>
       <w:r>
@@ -1198,7 +1294,7 @@
     </w:p>
     <w:tbl>
       <w:tblPr>
-        <w:tblStyle w:val="TableauGrille2-Accentuation3"/>
+        <w:tblStyle w:val="GridTable2-Accent3"/>
         <w:tblW w:w="0" w:type="auto"/>
         <w:tblLook w:val="04A0" w:firstRow="1" w:lastRow="0" w:firstColumn="1" w:lastColumn="0" w:noHBand="0" w:noVBand="1"/>
       </w:tblPr>
@@ -1478,13 +1574,27 @@
               <w:rPr>
                 <w:sz w:val="14"/>
               </w:rPr>
-              <w:t>t_data.</w:t>
+              <w:t>t_</w:t>
+            </w:r>
+            <w:proofErr w:type="gramStart"/>
+            <w:r>
+              <w:rPr>
+                <w:sz w:val="14"/>
+              </w:rPr>
+              <w:t>data.</w:t>
             </w:r>
             <w:r>
               <w:rPr>
                 <w:sz w:val="14"/>
               </w:rPr>
-              <w:t>station_name</w:t>
+              <w:t>station</w:t>
+            </w:r>
+            <w:proofErr w:type="gramEnd"/>
+            <w:r>
+              <w:rPr>
+                <w:sz w:val="14"/>
+              </w:rPr>
+              <w:t>_name</w:t>
             </w:r>
             <w:proofErr w:type="spellEnd"/>
             <w:r>
@@ -1518,7 +1628,14 @@
               <w:rPr>
                 <w:sz w:val="14"/>
               </w:rPr>
-              <w:t>t_data.</w:t>
+              <w:t>t_</w:t>
+            </w:r>
+            <w:proofErr w:type="gramStart"/>
+            <w:r>
+              <w:rPr>
+                <w:sz w:val="14"/>
+              </w:rPr>
+              <w:t>data.</w:t>
             </w:r>
             <w:r>
               <w:rPr>
@@ -1527,6 +1644,7 @@
               <w:t>tmin</w:t>
             </w:r>
             <w:proofErr w:type="spellEnd"/>
+            <w:proofErr w:type="gramEnd"/>
             <w:r>
               <w:rPr>
                 <w:sz w:val="14"/>
@@ -1558,7 +1676,14 @@
               <w:rPr>
                 <w:sz w:val="14"/>
               </w:rPr>
-              <w:t>t_data.</w:t>
+              <w:t>t_</w:t>
+            </w:r>
+            <w:proofErr w:type="gramStart"/>
+            <w:r>
+              <w:rPr>
+                <w:sz w:val="14"/>
+              </w:rPr>
+              <w:t>data.</w:t>
             </w:r>
             <w:r>
               <w:rPr>
@@ -1567,6 +1692,7 @@
               <w:t>tmax</w:t>
             </w:r>
             <w:proofErr w:type="spellEnd"/>
+            <w:proofErr w:type="gramEnd"/>
             <w:r>
               <w:rPr>
                 <w:sz w:val="14"/>
@@ -1598,7 +1724,14 @@
               <w:rPr>
                 <w:sz w:val="14"/>
               </w:rPr>
-              <w:t>t_data.</w:t>
+              <w:t>t_</w:t>
+            </w:r>
+            <w:proofErr w:type="gramStart"/>
+            <w:r>
+              <w:rPr>
+                <w:sz w:val="14"/>
+              </w:rPr>
+              <w:t>data.</w:t>
             </w:r>
             <w:r>
               <w:rPr>
@@ -1607,6 +1740,7 @@
               <w:t>tmoy</w:t>
             </w:r>
             <w:proofErr w:type="spellEnd"/>
+            <w:proofErr w:type="gramEnd"/>
             <w:r>
               <w:rPr>
                 <w:sz w:val="14"/>
@@ -1650,11 +1784,19 @@
             <w:r>
               <w:t xml:space="preserve"> </w:t>
             </w:r>
+            <w:proofErr w:type="gramStart"/>
             <w:r>
               <w:rPr>
                 <w:sz w:val="14"/>
               </w:rPr>
-              <w:t>nb_jours_sup_</w:t>
+              <w:t>nb</w:t>
+            </w:r>
+            <w:proofErr w:type="gramEnd"/>
+            <w:r>
+              <w:rPr>
+                <w:sz w:val="14"/>
+              </w:rPr>
+              <w:t>_jours_sup_</w:t>
             </w:r>
             <w:r>
               <w:rPr>
@@ -1699,11 +1841,19 @@
             <w:r>
               <w:t xml:space="preserve"> </w:t>
             </w:r>
+            <w:proofErr w:type="gramStart"/>
             <w:r>
               <w:rPr>
                 <w:sz w:val="14"/>
               </w:rPr>
-              <w:t>nb_jours_</w:t>
+              <w:t>nb</w:t>
+            </w:r>
+            <w:proofErr w:type="gramEnd"/>
+            <w:r>
+              <w:rPr>
+                <w:sz w:val="14"/>
+              </w:rPr>
+              <w:t>_jours_</w:t>
             </w:r>
             <w:r>
               <w:rPr>
@@ -1819,7 +1969,7 @@
     </w:p>
     <w:p>
       <w:pPr>
-        <w:pStyle w:val="Titre1"/>
+        <w:pStyle w:val="Heading1"/>
         <w:rPr>
           <w:lang w:bidi="fr-FR"/>
         </w:rPr>
@@ -1850,6 +2000,7 @@
           <w:sz w:val="14"/>
         </w:rPr>
       </w:pPr>
+      <w:proofErr w:type="gramStart"/>
       <w:r>
         <w:rPr>
           <w:sz w:val="14"/>
@@ -1861,7 +2012,14 @@
         <w:rPr>
           <w:sz w:val="14"/>
         </w:rPr>
-        <w:t>onde_img</w:t>
+        <w:t>onde</w:t>
+      </w:r>
+      <w:proofErr w:type="gramEnd"/>
+      <w:r>
+        <w:rPr>
+          <w:sz w:val="14"/>
+        </w:rPr>
+        <w:t>_img</w:t>
       </w:r>
       <w:proofErr w:type="spellEnd"/>
       <w:r>
@@ -1906,11 +2064,12 @@
           <w:sz w:val="14"/>
         </w:rPr>
         <w:sectPr>
-          <w:headerReference w:type="default" r:id="rId11"/>
-          <w:footerReference w:type="even" r:id="rId12"/>
-          <w:footerReference w:type="default" r:id="rId13"/>
-          <w:headerReference w:type="first" r:id="rId14"/>
-          <w:footerReference w:type="first" r:id="rId15"/>
+          <w:headerReference w:type="even" r:id="rId11"/>
+          <w:headerReference w:type="default" r:id="rId12"/>
+          <w:footerReference w:type="even" r:id="rId13"/>
+          <w:footerReference w:type="default" r:id="rId14"/>
+          <w:headerReference w:type="first" r:id="rId15"/>
+          <w:footerReference w:type="first" r:id="rId16"/>
           <w:pgSz w:w="11906" w:h="16838" w:code="9"/>
           <w:pgMar w:top="360" w:right="360" w:bottom="360" w:left="360" w:header="340" w:footer="432" w:gutter="0"/>
           <w:cols w:space="720"/>
@@ -1924,7 +2083,7 @@
         <w:spacing w:line="276" w:lineRule="auto"/>
         <w:ind w:left="3261"/>
         <w:rPr>
-          <w:rStyle w:val="Titre1Car"/>
+          <w:rStyle w:val="Heading1Char"/>
         </w:rPr>
       </w:pPr>
       <w:r>
@@ -1946,7 +2105,14 @@
         <w:rPr>
           <w:sz w:val="14"/>
         </w:rPr>
-        <w:t xml:space="preserve"> %}</w:t>
+        <w:t xml:space="preserve"> </w:t>
+      </w:r>
+      <w:proofErr w:type="gramStart"/>
+      <w:r>
+        <w:rPr>
+          <w:sz w:val="14"/>
+        </w:rPr>
+        <w:t>%}</w:t>
       </w:r>
       <w:bookmarkStart w:id="36" w:name="_Toc214439878"/>
       <w:bookmarkStart w:id="37" w:name="_Toc214442145"/>
@@ -1956,9 +2122,16 @@
       <w:bookmarkStart w:id="41" w:name="_Toc214443475"/>
       <w:r>
         <w:rPr>
-          <w:rStyle w:val="Titre1Car"/>
-        </w:rPr>
-        <w:t>Communications externes</w:t>
+          <w:rStyle w:val="Heading1Char"/>
+        </w:rPr>
+        <w:t>Communications</w:t>
+      </w:r>
+      <w:proofErr w:type="gramEnd"/>
+      <w:r>
+        <w:rPr>
+          <w:rStyle w:val="Heading1Char"/>
+        </w:rPr>
+        <w:t xml:space="preserve"> externes</w:t>
       </w:r>
       <w:bookmarkEnd w:id="36"/>
       <w:bookmarkEnd w:id="37"/>
@@ -2018,6 +2191,7 @@
           <w:sz w:val="24"/>
         </w:rPr>
       </w:pPr>
+      <w:proofErr w:type="gramStart"/>
       <w:r>
         <w:rPr>
           <w:color w:val="29519B" w:themeColor="accent3"/>
@@ -2031,7 +2205,15 @@
           <w:color w:val="29519B" w:themeColor="accent3"/>
           <w:sz w:val="24"/>
         </w:rPr>
-        <w:t>t_data.title</w:t>
+        <w:t>t</w:t>
+      </w:r>
+      <w:proofErr w:type="gramEnd"/>
+      <w:r>
+        <w:rPr>
+          <w:color w:val="29519B" w:themeColor="accent3"/>
+          <w:sz w:val="24"/>
+        </w:rPr>
+        <w:t>_data.title</w:t>
       </w:r>
       <w:proofErr w:type="spellEnd"/>
       <w:r>
@@ -2051,6 +2233,7 @@
           <w:szCs w:val="20"/>
         </w:rPr>
       </w:pPr>
+      <w:proofErr w:type="gramStart"/>
       <w:r>
         <w:rPr>
           <w:color w:val="6990D7" w:themeColor="accent3" w:themeTint="99"/>
@@ -2064,21 +2247,15 @@
           <w:color w:val="6990D7" w:themeColor="accent3" w:themeTint="99"/>
           <w:szCs w:val="20"/>
         </w:rPr>
-        <w:t>t_data.</w:t>
+        <w:t>t</w:t>
       </w:r>
+      <w:proofErr w:type="gramEnd"/>
       <w:r>
         <w:rPr>
           <w:color w:val="6990D7" w:themeColor="accent3" w:themeTint="99"/>
           <w:szCs w:val="20"/>
         </w:rPr>
-        <w:t>sub</w:t>
-      </w:r>
-      <w:r>
-        <w:rPr>
-          <w:color w:val="6990D7" w:themeColor="accent3" w:themeTint="99"/>
-          <w:szCs w:val="20"/>
-        </w:rPr>
-        <w:t>title</w:t>
+        <w:t>_data.subtitle</w:t>
       </w:r>
       <w:proofErr w:type="spellEnd"/>
       <w:r>
@@ -2097,6 +2274,7 @@
           <w:sz w:val="14"/>
         </w:rPr>
       </w:pPr>
+      <w:proofErr w:type="gramStart"/>
       <w:r>
         <w:rPr>
           <w:sz w:val="14"/>
@@ -2108,7 +2286,14 @@
         <w:rPr>
           <w:sz w:val="14"/>
         </w:rPr>
-        <w:t>t_data.</w:t>
+        <w:t>t</w:t>
+      </w:r>
+      <w:proofErr w:type="gramEnd"/>
+      <w:r>
+        <w:rPr>
+          <w:sz w:val="14"/>
+        </w:rPr>
+        <w:t>_data.</w:t>
       </w:r>
       <w:r>
         <w:rPr>
@@ -2141,6 +2326,7 @@
           <w:szCs w:val="20"/>
         </w:rPr>
       </w:pPr>
+      <w:proofErr w:type="gramStart"/>
       <w:r>
         <w:rPr>
           <w:szCs w:val="20"/>
@@ -2152,7 +2338,14 @@
         <w:rPr>
           <w:szCs w:val="20"/>
         </w:rPr>
-        <w:t>t_data.comment</w:t>
+        <w:t>t</w:t>
+      </w:r>
+      <w:proofErr w:type="gramEnd"/>
+      <w:r>
+        <w:rPr>
+          <w:szCs w:val="20"/>
+        </w:rPr>
+        <w:t>_data.comment</w:t>
       </w:r>
       <w:proofErr w:type="spellEnd"/>
       <w:r>
@@ -2237,8 +2430,8 @@
       </w:pPr>
     </w:p>
     <w:sectPr>
-      <w:headerReference w:type="first" r:id="rId16"/>
-      <w:footerReference w:type="first" r:id="rId17"/>
+      <w:headerReference w:type="first" r:id="rId17"/>
+      <w:footerReference w:type="first" r:id="rId18"/>
       <w:pgSz w:w="11906" w:h="16838" w:code="9"/>
       <w:pgMar w:top="360" w:right="360" w:bottom="360" w:left="360" w:header="340" w:footer="432" w:gutter="0"/>
       <w:cols w:space="720"/>
@@ -2250,7 +2443,7 @@
 </file>
 
 <file path=word/endnotes.xml><?xml version="1.0" encoding="utf-8"?>
-<w:endnotes xmlns:wpc="http://schemas.microsoft.com/office/word/2010/wordprocessingCanvas" xmlns:cx="http://schemas.microsoft.com/office/drawing/2014/chartex" xmlns:cx1="http://schemas.microsoft.com/office/drawing/2015/9/8/chartex" xmlns:cx2="http://schemas.microsoft.com/office/drawing/2015/10/21/chartex" xmlns:cx3="http://schemas.microsoft.com/office/drawing/2016/5/9/chartex" xmlns:cx4="http://schemas.microsoft.com/office/drawing/2016/5/10/chartex" xmlns:cx5="http://schemas.microsoft.com/office/drawing/2016/5/11/chartex" xmlns:cx6="http://schemas.microsoft.com/office/drawing/2016/5/12/chartex" xmlns:cx7="http://schemas.microsoft.com/office/drawing/2016/5/13/chartex" xmlns:cx8="http://schemas.microsoft.com/office/drawing/2016/5/14/chartex" xmlns:mc="http://schemas.openxmlformats.org/markup-compatibility/2006" xmlns:aink="http://schemas.microsoft.com/office/drawing/2016/ink" xmlns:am3d="http://schemas.microsoft.com/office/drawing/2017/model3d" xmlns:o="urn:schemas-microsoft-com:office:office" xmlns:oel="http://schemas.microsoft.com/office/2019/extlst" xmlns:r="http://schemas.openxmlformats.org/officeDocument/2006/relationships" xmlns:m="http://schemas.openxmlformats.org/officeDocument/2006/math" xmlns:v="urn:schemas-microsoft-com:vml" xmlns:wp14="http://schemas.microsoft.com/office/word/2010/wordprocessingDrawing" xmlns:wp="http://schemas.openxmlformats.org/drawingml/2006/wordprocessingDrawing" xmlns:w10="urn:schemas-microsoft-com:office:word" xmlns:w="http://schemas.openxmlformats.org/wordprocessingml/2006/main" xmlns:w14="http://schemas.microsoft.com/office/word/2010/wordml" xmlns:w15="http://schemas.microsoft.com/office/word/2012/wordml" xmlns:w16cex="http://schemas.microsoft.com/office/word/2018/wordml/cex" xmlns:w16cid="http://schemas.microsoft.com/office/word/2016/wordml/cid" xmlns:w16="http://schemas.microsoft.com/office/word/2018/wordml" xmlns:w16du="http://schemas.microsoft.com/office/word/2023/wordml/word16du" xmlns:w16sdtdh="http://schemas.microsoft.com/office/word/2020/wordml/sdtdatahash" xmlns:w16sdtfl="http://schemas.microsoft.com/office/word/2024/wordml/sdtformatlock" xmlns:w16se="http://schemas.microsoft.com/office/word/2015/wordml/symex" xmlns:wpg="http://schemas.microsoft.com/office/word/2010/wordprocessingGroup" xmlns:wpi="http://schemas.microsoft.com/office/word/2010/wordprocessingInk" xmlns:wne="http://schemas.microsoft.com/office/word/2006/wordml" xmlns:wps="http://schemas.microsoft.com/office/word/2010/wordprocessingShape" mc:Ignorable="w14 w15 w16se w16cid w16 w16cex w16sdtdh w16sdtfl w16du wp14">
+<w:endnotes xmlns:wpc="http://schemas.microsoft.com/office/word/2010/wordprocessingCanvas" xmlns:cx="http://schemas.microsoft.com/office/drawing/2014/chartex" xmlns:cx1="http://schemas.microsoft.com/office/drawing/2015/9/8/chartex" xmlns:cx2="http://schemas.microsoft.com/office/drawing/2015/10/21/chartex" xmlns:cx3="http://schemas.microsoft.com/office/drawing/2016/5/9/chartex" xmlns:cx4="http://schemas.microsoft.com/office/drawing/2016/5/10/chartex" xmlns:cx5="http://schemas.microsoft.com/office/drawing/2016/5/11/chartex" xmlns:cx6="http://schemas.microsoft.com/office/drawing/2016/5/12/chartex" xmlns:cx7="http://schemas.microsoft.com/office/drawing/2016/5/13/chartex" xmlns:cx8="http://schemas.microsoft.com/office/drawing/2016/5/14/chartex" xmlns:mc="http://schemas.openxmlformats.org/markup-compatibility/2006" xmlns:aink="http://schemas.microsoft.com/office/drawing/2016/ink" xmlns:am3d="http://schemas.microsoft.com/office/drawing/2017/model3d" xmlns:o="urn:schemas-microsoft-com:office:office" xmlns:oel="http://schemas.microsoft.com/office/2019/extlst" xmlns:r="http://schemas.openxmlformats.org/officeDocument/2006/relationships" xmlns:m="http://schemas.openxmlformats.org/officeDocument/2006/math" xmlns:v="urn:schemas-microsoft-com:vml" xmlns:wp14="http://schemas.microsoft.com/office/word/2010/wordprocessingDrawing" xmlns:wp="http://schemas.openxmlformats.org/drawingml/2006/wordprocessingDrawing" xmlns:w10="urn:schemas-microsoft-com:office:word" xmlns:w="http://schemas.openxmlformats.org/wordprocessingml/2006/main" xmlns:w14="http://schemas.microsoft.com/office/word/2010/wordml" xmlns:w15="http://schemas.microsoft.com/office/word/2012/wordml" xmlns:w16cex="http://schemas.microsoft.com/office/word/2018/wordml/cex" xmlns:w16cid="http://schemas.microsoft.com/office/word/2016/wordml/cid" xmlns:w16="http://schemas.microsoft.com/office/word/2018/wordml" xmlns:w16sdtdh="http://schemas.microsoft.com/office/word/2020/wordml/sdtdatahash" xmlns:w16se="http://schemas.microsoft.com/office/word/2015/wordml/symex" xmlns:wpg="http://schemas.microsoft.com/office/word/2010/wordprocessingGroup" xmlns:wpi="http://schemas.microsoft.com/office/word/2010/wordprocessingInk" xmlns:wne="http://schemas.microsoft.com/office/word/2006/wordml" xmlns:wps="http://schemas.microsoft.com/office/word/2010/wordprocessingShape" mc:Ignorable="w14 w15 w16se w16cid w16 w16cex w16sdtdh wp14">
   <w:endnote w:type="separator" w:id="-1">
     <w:p>
       <w:r>
@@ -2269,45 +2462,45 @@
 </file>
 
 <file path=word/footer1.xml><?xml version="1.0" encoding="utf-8"?>
-<w:ftr xmlns:wpc="http://schemas.microsoft.com/office/word/2010/wordprocessingCanvas" xmlns:cx="http://schemas.microsoft.com/office/drawing/2014/chartex" xmlns:cx1="http://schemas.microsoft.com/office/drawing/2015/9/8/chartex" xmlns:cx2="http://schemas.microsoft.com/office/drawing/2015/10/21/chartex" xmlns:cx3="http://schemas.microsoft.com/office/drawing/2016/5/9/chartex" xmlns:cx4="http://schemas.microsoft.com/office/drawing/2016/5/10/chartex" xmlns:cx5="http://schemas.microsoft.com/office/drawing/2016/5/11/chartex" xmlns:cx6="http://schemas.microsoft.com/office/drawing/2016/5/12/chartex" xmlns:cx7="http://schemas.microsoft.com/office/drawing/2016/5/13/chartex" xmlns:cx8="http://schemas.microsoft.com/office/drawing/2016/5/14/chartex" xmlns:mc="http://schemas.openxmlformats.org/markup-compatibility/2006" xmlns:aink="http://schemas.microsoft.com/office/drawing/2016/ink" xmlns:am3d="http://schemas.microsoft.com/office/drawing/2017/model3d" xmlns:o="urn:schemas-microsoft-com:office:office" xmlns:oel="http://schemas.microsoft.com/office/2019/extlst" xmlns:r="http://schemas.openxmlformats.org/officeDocument/2006/relationships" xmlns:m="http://schemas.openxmlformats.org/officeDocument/2006/math" xmlns:v="urn:schemas-microsoft-com:vml" xmlns:wp14="http://schemas.microsoft.com/office/word/2010/wordprocessingDrawing" xmlns:wp="http://schemas.openxmlformats.org/drawingml/2006/wordprocessingDrawing" xmlns:w10="urn:schemas-microsoft-com:office:word" xmlns:w="http://schemas.openxmlformats.org/wordprocessingml/2006/main" xmlns:w14="http://schemas.microsoft.com/office/word/2010/wordml" xmlns:w15="http://schemas.microsoft.com/office/word/2012/wordml" xmlns:w16cex="http://schemas.microsoft.com/office/word/2018/wordml/cex" xmlns:w16cid="http://schemas.microsoft.com/office/word/2016/wordml/cid" xmlns:w16="http://schemas.microsoft.com/office/word/2018/wordml" xmlns:w16du="http://schemas.microsoft.com/office/word/2023/wordml/word16du" xmlns:w16sdtdh="http://schemas.microsoft.com/office/word/2020/wordml/sdtdatahash" xmlns:w16sdtfl="http://schemas.microsoft.com/office/word/2024/wordml/sdtformatlock" xmlns:w16se="http://schemas.microsoft.com/office/word/2015/wordml/symex" xmlns:wpg="http://schemas.microsoft.com/office/word/2010/wordprocessingGroup" xmlns:wpi="http://schemas.microsoft.com/office/word/2010/wordprocessingInk" xmlns:wne="http://schemas.microsoft.com/office/word/2006/wordml" xmlns:wps="http://schemas.microsoft.com/office/word/2010/wordprocessingShape" mc:Ignorable="w14 w15 w16se w16cid w16 w16cex w16sdtdh w16sdtfl w16du wp14">
+<w:ftr xmlns:wpc="http://schemas.microsoft.com/office/word/2010/wordprocessingCanvas" xmlns:cx="http://schemas.microsoft.com/office/drawing/2014/chartex" xmlns:cx1="http://schemas.microsoft.com/office/drawing/2015/9/8/chartex" xmlns:cx2="http://schemas.microsoft.com/office/drawing/2015/10/21/chartex" xmlns:cx3="http://schemas.microsoft.com/office/drawing/2016/5/9/chartex" xmlns:cx4="http://schemas.microsoft.com/office/drawing/2016/5/10/chartex" xmlns:cx5="http://schemas.microsoft.com/office/drawing/2016/5/11/chartex" xmlns:cx6="http://schemas.microsoft.com/office/drawing/2016/5/12/chartex" xmlns:cx7="http://schemas.microsoft.com/office/drawing/2016/5/13/chartex" xmlns:cx8="http://schemas.microsoft.com/office/drawing/2016/5/14/chartex" xmlns:mc="http://schemas.openxmlformats.org/markup-compatibility/2006" xmlns:aink="http://schemas.microsoft.com/office/drawing/2016/ink" xmlns:am3d="http://schemas.microsoft.com/office/drawing/2017/model3d" xmlns:o="urn:schemas-microsoft-com:office:office" xmlns:oel="http://schemas.microsoft.com/office/2019/extlst" xmlns:r="http://schemas.openxmlformats.org/officeDocument/2006/relationships" xmlns:m="http://schemas.openxmlformats.org/officeDocument/2006/math" xmlns:v="urn:schemas-microsoft-com:vml" xmlns:wp14="http://schemas.microsoft.com/office/word/2010/wordprocessingDrawing" xmlns:wp="http://schemas.openxmlformats.org/drawingml/2006/wordprocessingDrawing" xmlns:w10="urn:schemas-microsoft-com:office:word" xmlns:w="http://schemas.openxmlformats.org/wordprocessingml/2006/main" xmlns:w14="http://schemas.microsoft.com/office/word/2010/wordml" xmlns:w15="http://schemas.microsoft.com/office/word/2012/wordml" xmlns:w16cex="http://schemas.microsoft.com/office/word/2018/wordml/cex" xmlns:w16cid="http://schemas.microsoft.com/office/word/2016/wordml/cid" xmlns:w16="http://schemas.microsoft.com/office/word/2018/wordml" xmlns:w16sdtdh="http://schemas.microsoft.com/office/word/2020/wordml/sdtdatahash" xmlns:w16se="http://schemas.microsoft.com/office/word/2015/wordml/symex" xmlns:wpg="http://schemas.microsoft.com/office/word/2010/wordprocessingGroup" xmlns:wpi="http://schemas.microsoft.com/office/word/2010/wordprocessingInk" xmlns:wne="http://schemas.microsoft.com/office/word/2006/wordml" xmlns:wps="http://schemas.microsoft.com/office/word/2010/wordprocessingShape" mc:Ignorable="w14 w15 w16se w16cid w16 w16cex w16sdtdh wp14">
   <w:p>
     <w:pPr>
-      <w:pStyle w:val="Pieddepage"/>
+      <w:pStyle w:val="Footer"/>
       <w:rPr>
-        <w:rStyle w:val="Numrodepage"/>
+        <w:rStyle w:val="PageNumber"/>
       </w:rPr>
     </w:pPr>
     <w:r>
       <w:rPr>
-        <w:rStyle w:val="Numrodepage"/>
+        <w:rStyle w:val="PageNumber"/>
         <w:lang w:bidi="fr-FR"/>
       </w:rPr>
       <w:fldChar w:fldCharType="begin"/>
     </w:r>
     <w:r>
       <w:rPr>
-        <w:rStyle w:val="Numrodepage"/>
+        <w:rStyle w:val="PageNumber"/>
         <w:lang w:bidi="fr-FR"/>
       </w:rPr>
       <w:instrText xml:space="preserve">PAGE  </w:instrText>
     </w:r>
     <w:r>
       <w:rPr>
-        <w:rStyle w:val="Numrodepage"/>
+        <w:rStyle w:val="PageNumber"/>
         <w:lang w:bidi="fr-FR"/>
       </w:rPr>
       <w:fldChar w:fldCharType="separate"/>
     </w:r>
     <w:r>
       <w:rPr>
-        <w:rStyle w:val="Numrodepage"/>
+        <w:rStyle w:val="PageNumber"/>
         <w:lang w:bidi="fr-FR"/>
       </w:rPr>
       <w:t>1</w:t>
     </w:r>
     <w:r>
       <w:rPr>
-        <w:rStyle w:val="Numrodepage"/>
+        <w:rStyle w:val="PageNumber"/>
         <w:lang w:bidi="fr-FR"/>
       </w:rPr>
       <w:fldChar w:fldCharType="end"/>
@@ -2315,14 +2508,14 @@
   </w:p>
   <w:p>
     <w:pPr>
-      <w:pStyle w:val="Pieddepage"/>
+      <w:pStyle w:val="Footer"/>
     </w:pPr>
   </w:p>
 </w:ftr>
 </file>
 
 <file path=word/footer2.xml><?xml version="1.0" encoding="utf-8"?>
-<w:ftr xmlns:wpc="http://schemas.microsoft.com/office/word/2010/wordprocessingCanvas" xmlns:cx="http://schemas.microsoft.com/office/drawing/2014/chartex" xmlns:cx1="http://schemas.microsoft.com/office/drawing/2015/9/8/chartex" xmlns:cx2="http://schemas.microsoft.com/office/drawing/2015/10/21/chartex" xmlns:cx3="http://schemas.microsoft.com/office/drawing/2016/5/9/chartex" xmlns:cx4="http://schemas.microsoft.com/office/drawing/2016/5/10/chartex" xmlns:cx5="http://schemas.microsoft.com/office/drawing/2016/5/11/chartex" xmlns:cx6="http://schemas.microsoft.com/office/drawing/2016/5/12/chartex" xmlns:cx7="http://schemas.microsoft.com/office/drawing/2016/5/13/chartex" xmlns:cx8="http://schemas.microsoft.com/office/drawing/2016/5/14/chartex" xmlns:mc="http://schemas.openxmlformats.org/markup-compatibility/2006" xmlns:aink="http://schemas.microsoft.com/office/drawing/2016/ink" xmlns:am3d="http://schemas.microsoft.com/office/drawing/2017/model3d" xmlns:o="urn:schemas-microsoft-com:office:office" xmlns:oel="http://schemas.microsoft.com/office/2019/extlst" xmlns:r="http://schemas.openxmlformats.org/officeDocument/2006/relationships" xmlns:m="http://schemas.openxmlformats.org/officeDocument/2006/math" xmlns:v="urn:schemas-microsoft-com:vml" xmlns:wp14="http://schemas.microsoft.com/office/word/2010/wordprocessingDrawing" xmlns:wp="http://schemas.openxmlformats.org/drawingml/2006/wordprocessingDrawing" xmlns:w10="urn:schemas-microsoft-com:office:word" xmlns:w="http://schemas.openxmlformats.org/wordprocessingml/2006/main" xmlns:w14="http://schemas.microsoft.com/office/word/2010/wordml" xmlns:w15="http://schemas.microsoft.com/office/word/2012/wordml" xmlns:w16cex="http://schemas.microsoft.com/office/word/2018/wordml/cex" xmlns:w16cid="http://schemas.microsoft.com/office/word/2016/wordml/cid" xmlns:w16="http://schemas.microsoft.com/office/word/2018/wordml" xmlns:w16du="http://schemas.microsoft.com/office/word/2023/wordml/word16du" xmlns:w16sdtdh="http://schemas.microsoft.com/office/word/2020/wordml/sdtdatahash" xmlns:w16sdtfl="http://schemas.microsoft.com/office/word/2024/wordml/sdtformatlock" xmlns:w16se="http://schemas.microsoft.com/office/word/2015/wordml/symex" xmlns:wpg="http://schemas.microsoft.com/office/word/2010/wordprocessingGroup" xmlns:wpi="http://schemas.microsoft.com/office/word/2010/wordprocessingInk" xmlns:wne="http://schemas.microsoft.com/office/word/2006/wordml" xmlns:wps="http://schemas.microsoft.com/office/word/2010/wordprocessingShape" mc:Ignorable="w14 w15 w16se w16cid w16 w16cex w16sdtdh w16sdtfl w16du wp14">
+<w:ftr xmlns:wpc="http://schemas.microsoft.com/office/word/2010/wordprocessingCanvas" xmlns:cx="http://schemas.microsoft.com/office/drawing/2014/chartex" xmlns:cx1="http://schemas.microsoft.com/office/drawing/2015/9/8/chartex" xmlns:cx2="http://schemas.microsoft.com/office/drawing/2015/10/21/chartex" xmlns:cx3="http://schemas.microsoft.com/office/drawing/2016/5/9/chartex" xmlns:cx4="http://schemas.microsoft.com/office/drawing/2016/5/10/chartex" xmlns:cx5="http://schemas.microsoft.com/office/drawing/2016/5/11/chartex" xmlns:cx6="http://schemas.microsoft.com/office/drawing/2016/5/12/chartex" xmlns:cx7="http://schemas.microsoft.com/office/drawing/2016/5/13/chartex" xmlns:cx8="http://schemas.microsoft.com/office/drawing/2016/5/14/chartex" xmlns:mc="http://schemas.openxmlformats.org/markup-compatibility/2006" xmlns:aink="http://schemas.microsoft.com/office/drawing/2016/ink" xmlns:am3d="http://schemas.microsoft.com/office/drawing/2017/model3d" xmlns:o="urn:schemas-microsoft-com:office:office" xmlns:oel="http://schemas.microsoft.com/office/2019/extlst" xmlns:r="http://schemas.openxmlformats.org/officeDocument/2006/relationships" xmlns:m="http://schemas.openxmlformats.org/officeDocument/2006/math" xmlns:v="urn:schemas-microsoft-com:vml" xmlns:wp14="http://schemas.microsoft.com/office/word/2010/wordprocessingDrawing" xmlns:wp="http://schemas.openxmlformats.org/drawingml/2006/wordprocessingDrawing" xmlns:w10="urn:schemas-microsoft-com:office:word" xmlns:w="http://schemas.openxmlformats.org/wordprocessingml/2006/main" xmlns:w14="http://schemas.microsoft.com/office/word/2010/wordml" xmlns:w15="http://schemas.microsoft.com/office/word/2012/wordml" xmlns:w16cex="http://schemas.microsoft.com/office/word/2018/wordml/cex" xmlns:w16cid="http://schemas.microsoft.com/office/word/2016/wordml/cid" xmlns:w16="http://schemas.microsoft.com/office/word/2018/wordml" xmlns:w16sdtdh="http://schemas.microsoft.com/office/word/2020/wordml/sdtdatahash" xmlns:w16se="http://schemas.microsoft.com/office/word/2015/wordml/symex" xmlns:wpg="http://schemas.microsoft.com/office/word/2010/wordprocessingGroup" xmlns:wpi="http://schemas.microsoft.com/office/word/2010/wordprocessingInk" xmlns:wne="http://schemas.microsoft.com/office/word/2006/wordml" xmlns:wps="http://schemas.microsoft.com/office/word/2010/wordprocessingShape" mc:Ignorable="w14 w15 w16se w16cid w16 w16cex w16sdtdh wp14">
   <w:sdt>
     <w:sdtPr>
       <w:rPr>
@@ -2334,11 +2527,10 @@
         <w:docPartUnique/>
       </w:docPartObj>
     </w:sdtPr>
-    <w:sdtEndPr/>
     <w:sdtContent>
       <w:p>
         <w:pPr>
-          <w:pStyle w:val="Pieddepage"/>
+          <w:pStyle w:val="Footer"/>
           <w:jc w:val="right"/>
           <w:rPr>
             <w:sz w:val="18"/>
@@ -3285,7 +3477,7 @@
                 </wp:anchor>
               </w:drawing>
             </mc:Choice>
-            <mc:Fallback>
+            <mc:Fallback xmlns:w16sdtfl="http://schemas.microsoft.com/office/word/2024/wordml/sdtformatlock" xmlns:w16du="http://schemas.microsoft.com/office/word/2023/wordml/word16du">
               <w:pict>
                 <v:group w14:anchorId="6EA37291" id="Groupe 3" o:spid="_x0000_s1026" style="position:absolute;margin-left:-31.35pt;margin-top:-289.85pt;width:19.85pt;height:289.55pt;z-index:251758592;mso-position-horizontal:right;mso-position-horizontal-relative:page" coordsize="2520,36772" o:gfxdata="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">
                   <v:rect id="Rectangle 1" o:spid="_x0000_s1027" style="position:absolute;width:2520;height:720;visibility:visible;mso-wrap-style:square;v-text-anchor:top" o:gfxdata="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" filled="f" stroked="f"/>
@@ -3386,7 +3578,7 @@
                           <w:txbxContent>
                             <w:p>
                               <w:pPr>
-                                <w:pStyle w:val="Pieddepage"/>
+                                <w:pStyle w:val="Footer"/>
                                 <w:pBdr>
                                   <w:top w:val="single" w:sz="12" w:space="1" w:color="29519B" w:themeColor="accent3"/>
                                   <w:bottom w:val="single" w:sz="48" w:space="1" w:color="29519B" w:themeColor="accent3"/>
@@ -3489,7 +3681,7 @@
                 </wp:anchor>
               </w:drawing>
             </mc:Choice>
-            <mc:Fallback>
+            <mc:Fallback xmlns:w16sdtfl="http://schemas.microsoft.com/office/word/2024/wordml/sdtformatlock" xmlns:w16du="http://schemas.microsoft.com/office/word/2023/wordml/word16du">
               <w:pict>
                 <v:shapetype w14:anchorId="396B00BA" id="_x0000_t176" coordsize="21600,21600" o:spt="176" adj="2700" path="m@0,qx0@0l0@2qy@0,21600l@1,21600qx21600@2l21600@0qy@1,xe">
                   <v:stroke joinstyle="miter"/>
@@ -3613,10 +3805,10 @@
 </file>
 
 <file path=word/footer3.xml><?xml version="1.0" encoding="utf-8"?>
-<w:ftr xmlns:wpc="http://schemas.microsoft.com/office/word/2010/wordprocessingCanvas" xmlns:cx="http://schemas.microsoft.com/office/drawing/2014/chartex" xmlns:cx1="http://schemas.microsoft.com/office/drawing/2015/9/8/chartex" xmlns:cx2="http://schemas.microsoft.com/office/drawing/2015/10/21/chartex" xmlns:cx3="http://schemas.microsoft.com/office/drawing/2016/5/9/chartex" xmlns:cx4="http://schemas.microsoft.com/office/drawing/2016/5/10/chartex" xmlns:cx5="http://schemas.microsoft.com/office/drawing/2016/5/11/chartex" xmlns:cx6="http://schemas.microsoft.com/office/drawing/2016/5/12/chartex" xmlns:cx7="http://schemas.microsoft.com/office/drawing/2016/5/13/chartex" xmlns:cx8="http://schemas.microsoft.com/office/drawing/2016/5/14/chartex" xmlns:mc="http://schemas.openxmlformats.org/markup-compatibility/2006" xmlns:aink="http://schemas.microsoft.com/office/drawing/2016/ink" xmlns:am3d="http://schemas.microsoft.com/office/drawing/2017/model3d" xmlns:o="urn:schemas-microsoft-com:office:office" xmlns:oel="http://schemas.microsoft.com/office/2019/extlst" xmlns:r="http://schemas.openxmlformats.org/officeDocument/2006/relationships" xmlns:m="http://schemas.openxmlformats.org/officeDocument/2006/math" xmlns:v="urn:schemas-microsoft-com:vml" xmlns:wp14="http://schemas.microsoft.com/office/word/2010/wordprocessingDrawing" xmlns:wp="http://schemas.openxmlformats.org/drawingml/2006/wordprocessingDrawing" xmlns:w10="urn:schemas-microsoft-com:office:word" xmlns:w="http://schemas.openxmlformats.org/wordprocessingml/2006/main" xmlns:w14="http://schemas.microsoft.com/office/word/2010/wordml" xmlns:w15="http://schemas.microsoft.com/office/word/2012/wordml" xmlns:w16cex="http://schemas.microsoft.com/office/word/2018/wordml/cex" xmlns:w16cid="http://schemas.microsoft.com/office/word/2016/wordml/cid" xmlns:w16="http://schemas.microsoft.com/office/word/2018/wordml" xmlns:w16du="http://schemas.microsoft.com/office/word/2023/wordml/word16du" xmlns:w16sdtdh="http://schemas.microsoft.com/office/word/2020/wordml/sdtdatahash" xmlns:w16sdtfl="http://schemas.microsoft.com/office/word/2024/wordml/sdtformatlock" xmlns:w16se="http://schemas.microsoft.com/office/word/2015/wordml/symex" xmlns:wpg="http://schemas.microsoft.com/office/word/2010/wordprocessingGroup" xmlns:wpi="http://schemas.microsoft.com/office/word/2010/wordprocessingInk" xmlns:wne="http://schemas.microsoft.com/office/word/2006/wordml" xmlns:wps="http://schemas.microsoft.com/office/word/2010/wordprocessingShape" mc:Ignorable="w14 w15 w16se w16cid w16 w16cex w16sdtdh w16sdtfl w16du wp14">
+<w:ftr xmlns:wpc="http://schemas.microsoft.com/office/word/2010/wordprocessingCanvas" xmlns:cx="http://schemas.microsoft.com/office/drawing/2014/chartex" xmlns:cx1="http://schemas.microsoft.com/office/drawing/2015/9/8/chartex" xmlns:cx2="http://schemas.microsoft.com/office/drawing/2015/10/21/chartex" xmlns:cx3="http://schemas.microsoft.com/office/drawing/2016/5/9/chartex" xmlns:cx4="http://schemas.microsoft.com/office/drawing/2016/5/10/chartex" xmlns:cx5="http://schemas.microsoft.com/office/drawing/2016/5/11/chartex" xmlns:cx6="http://schemas.microsoft.com/office/drawing/2016/5/12/chartex" xmlns:cx7="http://schemas.microsoft.com/office/drawing/2016/5/13/chartex" xmlns:cx8="http://schemas.microsoft.com/office/drawing/2016/5/14/chartex" xmlns:mc="http://schemas.openxmlformats.org/markup-compatibility/2006" xmlns:aink="http://schemas.microsoft.com/office/drawing/2016/ink" xmlns:am3d="http://schemas.microsoft.com/office/drawing/2017/model3d" xmlns:o="urn:schemas-microsoft-com:office:office" xmlns:oel="http://schemas.microsoft.com/office/2019/extlst" xmlns:r="http://schemas.openxmlformats.org/officeDocument/2006/relationships" xmlns:m="http://schemas.openxmlformats.org/officeDocument/2006/math" xmlns:v="urn:schemas-microsoft-com:vml" xmlns:wp14="http://schemas.microsoft.com/office/word/2010/wordprocessingDrawing" xmlns:wp="http://schemas.openxmlformats.org/drawingml/2006/wordprocessingDrawing" xmlns:w10="urn:schemas-microsoft-com:office:word" xmlns:w="http://schemas.openxmlformats.org/wordprocessingml/2006/main" xmlns:w14="http://schemas.microsoft.com/office/word/2010/wordml" xmlns:w15="http://schemas.microsoft.com/office/word/2012/wordml" xmlns:w16cex="http://schemas.microsoft.com/office/word/2018/wordml/cex" xmlns:w16cid="http://schemas.microsoft.com/office/word/2016/wordml/cid" xmlns:w16="http://schemas.microsoft.com/office/word/2018/wordml" xmlns:w16sdtdh="http://schemas.microsoft.com/office/word/2020/wordml/sdtdatahash" xmlns:w16se="http://schemas.microsoft.com/office/word/2015/wordml/symex" xmlns:wpg="http://schemas.microsoft.com/office/word/2010/wordprocessingGroup" xmlns:wpi="http://schemas.microsoft.com/office/word/2010/wordprocessingInk" xmlns:wne="http://schemas.microsoft.com/office/word/2006/wordml" xmlns:wps="http://schemas.microsoft.com/office/word/2010/wordprocessingShape" mc:Ignorable="w14 w15 w16se w16cid w16 w16cex w16sdtdh wp14">
   <w:p>
     <w:pPr>
-      <w:pStyle w:val="Pieddepage"/>
+      <w:pStyle w:val="Footer"/>
     </w:pPr>
     <w:r>
       <w:rPr>
@@ -3694,7 +3886,7 @@
                           <w:sdtContent>
                             <w:p>
                               <w:pPr>
-                                <w:pStyle w:val="En-ttedetabledesmatires"/>
+                                <w:pStyle w:val="TOCHeading"/>
                                 <w:rPr>
                                   <w:rFonts w:cs="Open Sans"/>
                                   <w:szCs w:val="28"/>
@@ -3710,7 +3902,7 @@
                             </w:p>
                             <w:p>
                               <w:pPr>
-                                <w:pStyle w:val="TM1"/>
+                                <w:pStyle w:val="TOC1"/>
                                 <w:tabs>
                                   <w:tab w:val="right" w:leader="dot" w:pos="11176"/>
                                 </w:tabs>
@@ -3739,7 +3931,7 @@
                               <w:hyperlink w:anchor="_Toc214442381" w:history="1">
                                 <w:r>
                                   <w:rPr>
-                                    <w:rStyle w:val="Lienhypertexte"/>
+                                    <w:rStyle w:val="Hyperlink"/>
                                     <w:noProof/>
                                   </w:rPr>
                                   <w:t>Synthèse</w:t>
@@ -3796,7 +3988,7 @@
                             </w:p>
                             <w:p>
                               <w:pPr>
-                                <w:pStyle w:val="TM1"/>
+                                <w:pStyle w:val="TOC1"/>
                                 <w:tabs>
                                   <w:tab w:val="right" w:leader="dot" w:pos="11176"/>
                                 </w:tabs>
@@ -3816,7 +4008,7 @@
                               <w:hyperlink w:anchor="_Toc214442382" w:history="1">
                                 <w:r>
                                   <w:rPr>
-                                    <w:rStyle w:val="Lienhypertexte"/>
+                                    <w:rStyle w:val="Hyperlink"/>
                                     <w:noProof/>
                                     <w:lang w:val="en-US" w:bidi="fr-FR"/>
                                   </w:rPr>
@@ -3874,7 +4066,7 @@
                             </w:p>
                             <w:p>
                               <w:pPr>
-                                <w:pStyle w:val="TM1"/>
+                                <w:pStyle w:val="TOC1"/>
                                 <w:tabs>
                                   <w:tab w:val="right" w:leader="dot" w:pos="11176"/>
                                 </w:tabs>
@@ -3894,7 +4086,7 @@
                               <w:hyperlink w:anchor="_Toc214442383" w:history="1">
                                 <w:r>
                                   <w:rPr>
-                                    <w:rStyle w:val="Lienhypertexte"/>
+                                    <w:rStyle w:val="Hyperlink"/>
                                     <w:noProof/>
                                     <w:lang w:val="en-US" w:bidi="fr-FR"/>
                                   </w:rPr>
@@ -3952,7 +4144,7 @@
                             </w:p>
                             <w:p>
                               <w:pPr>
-                                <w:pStyle w:val="TM1"/>
+                                <w:pStyle w:val="TOC1"/>
                                 <w:tabs>
                                   <w:tab w:val="right" w:leader="dot" w:pos="11176"/>
                                 </w:tabs>
@@ -3972,7 +4164,7 @@
                               <w:hyperlink w:anchor="_Toc214442384" w:history="1">
                                 <w:r>
                                   <w:rPr>
-                                    <w:rStyle w:val="Lienhypertexte"/>
+                                    <w:rStyle w:val="Hyperlink"/>
                                     <w:noProof/>
                                     <w:lang w:bidi="fr-FR"/>
                                   </w:rPr>
@@ -4030,7 +4222,7 @@
                             </w:p>
                             <w:p>
                               <w:pPr>
-                                <w:pStyle w:val="TM1"/>
+                                <w:pStyle w:val="TOC1"/>
                                 <w:tabs>
                                   <w:tab w:val="right" w:leader="dot" w:pos="11176"/>
                                 </w:tabs>
@@ -4050,7 +4242,7 @@
                               <w:hyperlink w:anchor="_Toc214442385" w:history="1">
                                 <w:r>
                                   <w:rPr>
-                                    <w:rStyle w:val="Lienhypertexte"/>
+                                    <w:rStyle w:val="Hyperlink"/>
                                     <w:noProof/>
                                     <w:lang w:bidi="fr-FR"/>
                                   </w:rPr>
@@ -4108,7 +4300,7 @@
                             </w:p>
                             <w:p>
                               <w:pPr>
-                                <w:pStyle w:val="TM1"/>
+                                <w:pStyle w:val="TOC1"/>
                                 <w:tabs>
                                   <w:tab w:val="right" w:leader="dot" w:pos="11176"/>
                                 </w:tabs>
@@ -4128,7 +4320,7 @@
                               <w:hyperlink w:anchor="_Toc214442386" w:history="1">
                                 <w:r>
                                   <w:rPr>
-                                    <w:rStyle w:val="Lienhypertexte"/>
+                                    <w:rStyle w:val="Hyperlink"/>
                                     <w:noProof/>
                                     <w:lang w:bidi="fr-FR"/>
                                   </w:rPr>
@@ -4186,7 +4378,7 @@
                             </w:p>
                             <w:p>
                               <w:pPr>
-                                <w:pStyle w:val="TM1"/>
+                                <w:pStyle w:val="TOC1"/>
                                 <w:tabs>
                                   <w:tab w:val="right" w:leader="dot" w:pos="11176"/>
                                 </w:tabs>
@@ -4206,7 +4398,7 @@
                               <w:hyperlink w:anchor="_Toc214442387" w:history="1">
                                 <w:r>
                                   <w:rPr>
-                                    <w:rStyle w:val="Lienhypertexte"/>
+                                    <w:rStyle w:val="Hyperlink"/>
                                     <w:noProof/>
                                     <w:lang w:val="en-US" w:bidi="fr-FR"/>
                                   </w:rPr>
@@ -4297,7 +4489,7 @@
               <v:stroke joinstyle="miter"/>
               <v:path gradientshapeok="t" o:connecttype="rect"/>
             </v:shapetype>
-            <v:shape id="Zone de texte 2" o:spid="_x0000_s1028" type="#_x0000_t202" style="position:absolute;margin-left:935.7pt;margin-top:43.2pt;width:170.05pt;height:253.85pt;z-index:251768832;visibility:visible;mso-wrap-style:square;mso-width-percent:0;mso-height-percent:0;mso-wrap-distance-left:9pt;mso-wrap-distance-top:3.6pt;mso-wrap-distance-right:9pt;mso-wrap-distance-bottom:3.6pt;mso-position-horizontal:absolute;mso-position-horizontal-relative:page;mso-position-vertical:absolute;mso-position-vertical-relative:text;mso-width-percent:0;mso-height-percent:0;mso-width-relative:margin;mso-height-relative:margin;v-text-anchor:top" o:gfxdata="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" filled="f" stroked="f">
+            <v:shape id="Zone de texte 2" o:spid="_x0000_s1028" type="#_x0000_t202" style="position:absolute;margin-left:935.7pt;margin-top:43.2pt;width:170.05pt;height:253.85pt;z-index:251768832;visibility:visible;mso-wrap-style:square;mso-width-percent:0;mso-height-percent:0;mso-wrap-distance-left:9pt;mso-wrap-distance-top:3.6pt;mso-wrap-distance-right:9pt;mso-wrap-distance-bottom:3.6pt;mso-position-horizontal:absolute;mso-position-horizontal-relative:page;mso-position-vertical:absolute;mso-position-vertical-relative:text;mso-width-percent:0;mso-height-percent:0;mso-width-relative:margin;mso-height-relative:margin;v-text-anchor:top" o:gfxdata="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" filled="f" stroked="f">
               <v:textbox>
                 <w:txbxContent>
                   <w:sdt>
@@ -4323,7 +4515,7 @@
                     <w:sdtContent>
                       <w:p>
                         <w:pPr>
-                          <w:pStyle w:val="En-ttedetabledesmatires"/>
+                          <w:pStyle w:val="TOCHeading"/>
                           <w:rPr>
                             <w:rFonts w:cs="Open Sans"/>
                             <w:szCs w:val="28"/>
@@ -4339,7 +4531,7 @@
                       </w:p>
                       <w:p>
                         <w:pPr>
-                          <w:pStyle w:val="TM1"/>
+                          <w:pStyle w:val="TOC1"/>
                           <w:tabs>
                             <w:tab w:val="right" w:leader="dot" w:pos="11176"/>
                           </w:tabs>
@@ -4368,7 +4560,7 @@
                         <w:hyperlink w:anchor="_Toc214442381" w:history="1">
                           <w:r>
                             <w:rPr>
-                              <w:rStyle w:val="Lienhypertexte"/>
+                              <w:rStyle w:val="Hyperlink"/>
                               <w:noProof/>
                             </w:rPr>
                             <w:t>Synthèse</w:t>
@@ -4425,7 +4617,7 @@
                       </w:p>
                       <w:p>
                         <w:pPr>
-                          <w:pStyle w:val="TM1"/>
+                          <w:pStyle w:val="TOC1"/>
                           <w:tabs>
                             <w:tab w:val="right" w:leader="dot" w:pos="11176"/>
                           </w:tabs>
@@ -4445,7 +4637,7 @@
                         <w:hyperlink w:anchor="_Toc214442382" w:history="1">
                           <w:r>
                             <w:rPr>
-                              <w:rStyle w:val="Lienhypertexte"/>
+                              <w:rStyle w:val="Hyperlink"/>
                               <w:noProof/>
                               <w:lang w:val="en-US" w:bidi="fr-FR"/>
                             </w:rPr>
@@ -4503,7 +4695,7 @@
                       </w:p>
                       <w:p>
                         <w:pPr>
-                          <w:pStyle w:val="TM1"/>
+                          <w:pStyle w:val="TOC1"/>
                           <w:tabs>
                             <w:tab w:val="right" w:leader="dot" w:pos="11176"/>
                           </w:tabs>
@@ -4523,7 +4715,7 @@
                         <w:hyperlink w:anchor="_Toc214442383" w:history="1">
                           <w:r>
                             <w:rPr>
-                              <w:rStyle w:val="Lienhypertexte"/>
+                              <w:rStyle w:val="Hyperlink"/>
                               <w:noProof/>
                               <w:lang w:val="en-US" w:bidi="fr-FR"/>
                             </w:rPr>
@@ -4581,7 +4773,7 @@
                       </w:p>
                       <w:p>
                         <w:pPr>
-                          <w:pStyle w:val="TM1"/>
+                          <w:pStyle w:val="TOC1"/>
                           <w:tabs>
                             <w:tab w:val="right" w:leader="dot" w:pos="11176"/>
                           </w:tabs>
@@ -4601,7 +4793,7 @@
                         <w:hyperlink w:anchor="_Toc214442384" w:history="1">
                           <w:r>
                             <w:rPr>
-                              <w:rStyle w:val="Lienhypertexte"/>
+                              <w:rStyle w:val="Hyperlink"/>
                               <w:noProof/>
                               <w:lang w:bidi="fr-FR"/>
                             </w:rPr>
@@ -4659,7 +4851,7 @@
                       </w:p>
                       <w:p>
                         <w:pPr>
-                          <w:pStyle w:val="TM1"/>
+                          <w:pStyle w:val="TOC1"/>
                           <w:tabs>
                             <w:tab w:val="right" w:leader="dot" w:pos="11176"/>
                           </w:tabs>
@@ -4679,7 +4871,7 @@
                         <w:hyperlink w:anchor="_Toc214442385" w:history="1">
                           <w:r>
                             <w:rPr>
-                              <w:rStyle w:val="Lienhypertexte"/>
+                              <w:rStyle w:val="Hyperlink"/>
                               <w:noProof/>
                               <w:lang w:bidi="fr-FR"/>
                             </w:rPr>
@@ -4737,7 +4929,7 @@
                       </w:p>
                       <w:p>
                         <w:pPr>
-                          <w:pStyle w:val="TM1"/>
+                          <w:pStyle w:val="TOC1"/>
                           <w:tabs>
                             <w:tab w:val="right" w:leader="dot" w:pos="11176"/>
                           </w:tabs>
@@ -4757,7 +4949,7 @@
                         <w:hyperlink w:anchor="_Toc214442386" w:history="1">
                           <w:r>
                             <w:rPr>
-                              <w:rStyle w:val="Lienhypertexte"/>
+                              <w:rStyle w:val="Hyperlink"/>
                               <w:noProof/>
                               <w:lang w:bidi="fr-FR"/>
                             </w:rPr>
@@ -4815,7 +5007,7 @@
                       </w:p>
                       <w:p>
                         <w:pPr>
-                          <w:pStyle w:val="TM1"/>
+                          <w:pStyle w:val="TOC1"/>
                           <w:tabs>
                             <w:tab w:val="right" w:leader="dot" w:pos="11176"/>
                           </w:tabs>
@@ -4835,7 +5027,7 @@
                         <w:hyperlink w:anchor="_Toc214442387" w:history="1">
                           <w:r>
                             <w:rPr>
-                              <w:rStyle w:val="Lienhypertexte"/>
+                              <w:rStyle w:val="Hyperlink"/>
                               <w:noProof/>
                               <w:lang w:val="en-US" w:bidi="fr-FR"/>
                             </w:rPr>
@@ -4998,7 +5190,7 @@
                           <w:sdtContent>
                             <w:p>
                               <w:pPr>
-                                <w:pStyle w:val="En-ttedetabledesmatires"/>
+                                <w:pStyle w:val="TOCHeading"/>
                                 <w:rPr>
                                   <w:szCs w:val="28"/>
                                 </w:rPr>
@@ -5012,7 +5204,7 @@
                             </w:p>
                             <w:p>
                               <w:pPr>
-                                <w:pStyle w:val="TM1"/>
+                                <w:pStyle w:val="TOC1"/>
                                 <w:tabs>
                                   <w:tab w:val="right" w:leader="dot" w:pos="11176"/>
                                 </w:tabs>
@@ -5049,7 +5241,7 @@
                               <w:hyperlink w:anchor="_Toc214442223" w:history="1">
                                 <w:r>
                                   <w:rPr>
-                                    <w:rStyle w:val="Lienhypertexte"/>
+                                    <w:rStyle w:val="Hyperlink"/>
                                     <w:noProof/>
                                   </w:rPr>
                                   <w:t>Synthèse</w:t>
@@ -5106,7 +5298,7 @@
                             </w:p>
                             <w:p>
                               <w:pPr>
-                                <w:pStyle w:val="TM1"/>
+                                <w:pStyle w:val="TOC1"/>
                                 <w:tabs>
                                   <w:tab w:val="right" w:leader="dot" w:pos="11176"/>
                                 </w:tabs>
@@ -5125,7 +5317,7 @@
                               <w:hyperlink w:anchor="_Toc214442224" w:history="1">
                                 <w:r>
                                   <w:rPr>
-                                    <w:rStyle w:val="Lienhypertexte"/>
+                                    <w:rStyle w:val="Hyperlink"/>
                                     <w:noProof/>
                                     <w:lang w:val="en-US" w:bidi="fr-FR"/>
                                   </w:rPr>
@@ -5183,7 +5375,7 @@
                             </w:p>
                             <w:p>
                               <w:pPr>
-                                <w:pStyle w:val="TM1"/>
+                                <w:pStyle w:val="TOC1"/>
                                 <w:tabs>
                                   <w:tab w:val="right" w:leader="dot" w:pos="11176"/>
                                 </w:tabs>
@@ -5202,7 +5394,7 @@
                               <w:hyperlink w:anchor="_Toc214442225" w:history="1">
                                 <w:r>
                                   <w:rPr>
-                                    <w:rStyle w:val="Lienhypertexte"/>
+                                    <w:rStyle w:val="Hyperlink"/>
                                     <w:noProof/>
                                     <w:lang w:val="en-US" w:bidi="fr-FR"/>
                                   </w:rPr>
@@ -5260,7 +5452,7 @@
                             </w:p>
                             <w:p>
                               <w:pPr>
-                                <w:pStyle w:val="TM1"/>
+                                <w:pStyle w:val="TOC1"/>
                                 <w:tabs>
                                   <w:tab w:val="right" w:leader="dot" w:pos="11176"/>
                                 </w:tabs>
@@ -5279,7 +5471,7 @@
                               <w:hyperlink w:anchor="_Toc214442226" w:history="1">
                                 <w:r>
                                   <w:rPr>
-                                    <w:rStyle w:val="Lienhypertexte"/>
+                                    <w:rStyle w:val="Hyperlink"/>
                                     <w:noProof/>
                                     <w:lang w:bidi="fr-FR"/>
                                   </w:rPr>
@@ -5337,7 +5529,7 @@
                             </w:p>
                             <w:p>
                               <w:pPr>
-                                <w:pStyle w:val="TM1"/>
+                                <w:pStyle w:val="TOC1"/>
                                 <w:tabs>
                                   <w:tab w:val="right" w:leader="dot" w:pos="11176"/>
                                 </w:tabs>
@@ -5356,7 +5548,7 @@
                               <w:hyperlink w:anchor="_Toc214442227" w:history="1">
                                 <w:r>
                                   <w:rPr>
-                                    <w:rStyle w:val="Lienhypertexte"/>
+                                    <w:rStyle w:val="Hyperlink"/>
                                     <w:noProof/>
                                     <w:lang w:bidi="fr-FR"/>
                                   </w:rPr>
@@ -5414,7 +5606,7 @@
                             </w:p>
                             <w:p>
                               <w:pPr>
-                                <w:pStyle w:val="TM1"/>
+                                <w:pStyle w:val="TOC1"/>
                                 <w:tabs>
                                   <w:tab w:val="right" w:leader="dot" w:pos="11176"/>
                                 </w:tabs>
@@ -5433,7 +5625,7 @@
                               <w:hyperlink w:anchor="_Toc214442228" w:history="1">
                                 <w:r>
                                   <w:rPr>
-                                    <w:rStyle w:val="Lienhypertexte"/>
+                                    <w:rStyle w:val="Hyperlink"/>
                                     <w:noProof/>
                                     <w:lang w:bidi="fr-FR"/>
                                   </w:rPr>
@@ -5491,7 +5683,7 @@
                             </w:p>
                             <w:p>
                               <w:pPr>
-                                <w:pStyle w:val="TM1"/>
+                                <w:pStyle w:val="TOC1"/>
                                 <w:tabs>
                                   <w:tab w:val="right" w:leader="dot" w:pos="11176"/>
                                 </w:tabs>
@@ -5510,7 +5702,7 @@
                               <w:hyperlink w:anchor="_Toc214442229" w:history="1">
                                 <w:r>
                                   <w:rPr>
-                                    <w:rStyle w:val="Lienhypertexte"/>
+                                    <w:rStyle w:val="Hyperlink"/>
                                     <w:noProof/>
                                     <w:lang w:val="en-US" w:bidi="fr-FR"/>
                                   </w:rPr>
@@ -5609,7 +5801,7 @@
         </mc:Choice>
         <mc:Fallback>
           <w:pict>
-            <v:shape w14:anchorId="5DEC5A3C" id="_x0000_s1029" type="#_x0000_t202" style="position:absolute;margin-left:8374.25pt;margin-top:10154.05pt;width:159.1pt;height:334.7pt;z-index:251766784;visibility:visible;mso-wrap-style:square;mso-width-percent:0;mso-height-percent:0;mso-wrap-distance-left:9pt;mso-wrap-distance-top:3.6pt;mso-wrap-distance-right:9pt;mso-wrap-distance-bottom:3.6pt;mso-position-horizontal:absolute;mso-position-horizontal-relative:text;mso-position-vertical:absolute;mso-position-vertical-relative:text;mso-width-percent:0;mso-height-percent:0;mso-width-relative:margin;mso-height-relative:margin;v-text-anchor:top" o:gfxdata="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" filled="f" stroked="f" strokeweight="1.5pt">
+            <v:shape w14:anchorId="5DEC5A3C" id="_x0000_s1029" type="#_x0000_t202" style="position:absolute;margin-left:8374.25pt;margin-top:10154.05pt;width:159.1pt;height:334.7pt;z-index:251766784;visibility:visible;mso-wrap-style:square;mso-width-percent:0;mso-height-percent:0;mso-wrap-distance-left:9pt;mso-wrap-distance-top:3.6pt;mso-wrap-distance-right:9pt;mso-wrap-distance-bottom:3.6pt;mso-position-horizontal:absolute;mso-position-horizontal-relative:text;mso-position-vertical:absolute;mso-position-vertical-relative:text;mso-width-percent:0;mso-height-percent:0;mso-width-relative:margin;mso-height-relative:margin;v-text-anchor:top" o:gfxdata="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" filled="f" stroked="f" strokeweight="1.5pt">
               <v:textbox>
                 <w:txbxContent>
                   <w:sdt>
@@ -5636,7 +5828,7 @@
                     <w:sdtContent>
                       <w:p>
                         <w:pPr>
-                          <w:pStyle w:val="En-ttedetabledesmatires"/>
+                          <w:pStyle w:val="TOCHeading"/>
                           <w:rPr>
                             <w:szCs w:val="28"/>
                           </w:rPr>
@@ -5650,7 +5842,7 @@
                       </w:p>
                       <w:p>
                         <w:pPr>
-                          <w:pStyle w:val="TM1"/>
+                          <w:pStyle w:val="TOC1"/>
                           <w:tabs>
                             <w:tab w:val="right" w:leader="dot" w:pos="11176"/>
                           </w:tabs>
@@ -5687,7 +5879,7 @@
                         <w:hyperlink w:anchor="_Toc214442223" w:history="1">
                           <w:r>
                             <w:rPr>
-                              <w:rStyle w:val="Lienhypertexte"/>
+                              <w:rStyle w:val="Hyperlink"/>
                               <w:noProof/>
                             </w:rPr>
                             <w:t>Synthèse</w:t>
@@ -5744,7 +5936,7 @@
                       </w:p>
                       <w:p>
                         <w:pPr>
-                          <w:pStyle w:val="TM1"/>
+                          <w:pStyle w:val="TOC1"/>
                           <w:tabs>
                             <w:tab w:val="right" w:leader="dot" w:pos="11176"/>
                           </w:tabs>
@@ -5763,7 +5955,7 @@
                         <w:hyperlink w:anchor="_Toc214442224" w:history="1">
                           <w:r>
                             <w:rPr>
-                              <w:rStyle w:val="Lienhypertexte"/>
+                              <w:rStyle w:val="Hyperlink"/>
                               <w:noProof/>
                               <w:lang w:val="en-US" w:bidi="fr-FR"/>
                             </w:rPr>
@@ -5821,7 +6013,7 @@
                       </w:p>
                       <w:p>
                         <w:pPr>
-                          <w:pStyle w:val="TM1"/>
+                          <w:pStyle w:val="TOC1"/>
                           <w:tabs>
                             <w:tab w:val="right" w:leader="dot" w:pos="11176"/>
                           </w:tabs>
@@ -5840,7 +6032,7 @@
                         <w:hyperlink w:anchor="_Toc214442225" w:history="1">
                           <w:r>
                             <w:rPr>
-                              <w:rStyle w:val="Lienhypertexte"/>
+                              <w:rStyle w:val="Hyperlink"/>
                               <w:noProof/>
                               <w:lang w:val="en-US" w:bidi="fr-FR"/>
                             </w:rPr>
@@ -5898,7 +6090,7 @@
                       </w:p>
                       <w:p>
                         <w:pPr>
-                          <w:pStyle w:val="TM1"/>
+                          <w:pStyle w:val="TOC1"/>
                           <w:tabs>
                             <w:tab w:val="right" w:leader="dot" w:pos="11176"/>
                           </w:tabs>
@@ -5917,7 +6109,7 @@
                         <w:hyperlink w:anchor="_Toc214442226" w:history="1">
                           <w:r>
                             <w:rPr>
-                              <w:rStyle w:val="Lienhypertexte"/>
+                              <w:rStyle w:val="Hyperlink"/>
                               <w:noProof/>
                               <w:lang w:bidi="fr-FR"/>
                             </w:rPr>
@@ -5975,7 +6167,7 @@
                       </w:p>
                       <w:p>
                         <w:pPr>
-                          <w:pStyle w:val="TM1"/>
+                          <w:pStyle w:val="TOC1"/>
                           <w:tabs>
                             <w:tab w:val="right" w:leader="dot" w:pos="11176"/>
                           </w:tabs>
@@ -5994,7 +6186,7 @@
                         <w:hyperlink w:anchor="_Toc214442227" w:history="1">
                           <w:r>
                             <w:rPr>
-                              <w:rStyle w:val="Lienhypertexte"/>
+                              <w:rStyle w:val="Hyperlink"/>
                               <w:noProof/>
                               <w:lang w:bidi="fr-FR"/>
                             </w:rPr>
@@ -6052,7 +6244,7 @@
                       </w:p>
                       <w:p>
                         <w:pPr>
-                          <w:pStyle w:val="TM1"/>
+                          <w:pStyle w:val="TOC1"/>
                           <w:tabs>
                             <w:tab w:val="right" w:leader="dot" w:pos="11176"/>
                           </w:tabs>
@@ -6071,7 +6263,7 @@
                         <w:hyperlink w:anchor="_Toc214442228" w:history="1">
                           <w:r>
                             <w:rPr>
-                              <w:rStyle w:val="Lienhypertexte"/>
+                              <w:rStyle w:val="Hyperlink"/>
                               <w:noProof/>
                               <w:lang w:bidi="fr-FR"/>
                             </w:rPr>
@@ -6129,7 +6321,7 @@
                       </w:p>
                       <w:p>
                         <w:pPr>
-                          <w:pStyle w:val="TM1"/>
+                          <w:pStyle w:val="TOC1"/>
                           <w:tabs>
                             <w:tab w:val="right" w:leader="dot" w:pos="11176"/>
                           </w:tabs>
@@ -6148,7 +6340,7 @@
                         <w:hyperlink w:anchor="_Toc214442229" w:history="1">
                           <w:r>
                             <w:rPr>
-                              <w:rStyle w:val="Lienhypertexte"/>
+                              <w:rStyle w:val="Hyperlink"/>
                               <w:noProof/>
                               <w:lang w:val="en-US" w:bidi="fr-FR"/>
                             </w:rPr>
@@ -7177,7 +7369,7 @@
             </wp:anchor>
           </w:drawing>
         </mc:Choice>
-        <mc:Fallback>
+        <mc:Fallback xmlns:w16sdtfl="http://schemas.microsoft.com/office/word/2024/wordml/sdtformatlock" xmlns:w16du="http://schemas.microsoft.com/office/word/2023/wordml/word16du">
           <w:pict>
             <v:group w14:anchorId="2C31F8F1" id="Groupe 3" o:spid="_x0000_s1026" style="position:absolute;margin-left:0;margin-top:-289.75pt;width:19.85pt;height:289.55pt;z-index:251762688;mso-position-horizontal:left;mso-position-horizontal-relative:page" coordsize="2520,36772" o:gfxdata="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">
               <v:rect id="Rectangle 1" o:spid="_x0000_s1027" style="position:absolute;width:2520;height:720;visibility:visible;mso-wrap-style:square;v-text-anchor:top" o:gfxdata="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" filled="f" stroked="f"/>
@@ -7216,10 +7408,10 @@
 </file>
 
 <file path=word/footer4.xml><?xml version="1.0" encoding="utf-8"?>
-<w:ftr xmlns:wpc="http://schemas.microsoft.com/office/word/2010/wordprocessingCanvas" xmlns:cx="http://schemas.microsoft.com/office/drawing/2014/chartex" xmlns:cx1="http://schemas.microsoft.com/office/drawing/2015/9/8/chartex" xmlns:cx2="http://schemas.microsoft.com/office/drawing/2015/10/21/chartex" xmlns:cx3="http://schemas.microsoft.com/office/drawing/2016/5/9/chartex" xmlns:cx4="http://schemas.microsoft.com/office/drawing/2016/5/10/chartex" xmlns:cx5="http://schemas.microsoft.com/office/drawing/2016/5/11/chartex" xmlns:cx6="http://schemas.microsoft.com/office/drawing/2016/5/12/chartex" xmlns:cx7="http://schemas.microsoft.com/office/drawing/2016/5/13/chartex" xmlns:cx8="http://schemas.microsoft.com/office/drawing/2016/5/14/chartex" xmlns:mc="http://schemas.openxmlformats.org/markup-compatibility/2006" xmlns:aink="http://schemas.microsoft.com/office/drawing/2016/ink" xmlns:am3d="http://schemas.microsoft.com/office/drawing/2017/model3d" xmlns:o="urn:schemas-microsoft-com:office:office" xmlns:oel="http://schemas.microsoft.com/office/2019/extlst" xmlns:r="http://schemas.openxmlformats.org/officeDocument/2006/relationships" xmlns:m="http://schemas.openxmlformats.org/officeDocument/2006/math" xmlns:v="urn:schemas-microsoft-com:vml" xmlns:wp14="http://schemas.microsoft.com/office/word/2010/wordprocessingDrawing" xmlns:wp="http://schemas.openxmlformats.org/drawingml/2006/wordprocessingDrawing" xmlns:w10="urn:schemas-microsoft-com:office:word" xmlns:w="http://schemas.openxmlformats.org/wordprocessingml/2006/main" xmlns:w14="http://schemas.microsoft.com/office/word/2010/wordml" xmlns:w15="http://schemas.microsoft.com/office/word/2012/wordml" xmlns:w16cex="http://schemas.microsoft.com/office/word/2018/wordml/cex" xmlns:w16cid="http://schemas.microsoft.com/office/word/2016/wordml/cid" xmlns:w16="http://schemas.microsoft.com/office/word/2018/wordml" xmlns:w16du="http://schemas.microsoft.com/office/word/2023/wordml/word16du" xmlns:w16sdtdh="http://schemas.microsoft.com/office/word/2020/wordml/sdtdatahash" xmlns:w16sdtfl="http://schemas.microsoft.com/office/word/2024/wordml/sdtformatlock" xmlns:w16se="http://schemas.microsoft.com/office/word/2015/wordml/symex" xmlns:wpg="http://schemas.microsoft.com/office/word/2010/wordprocessingGroup" xmlns:wpi="http://schemas.microsoft.com/office/word/2010/wordprocessingInk" xmlns:wne="http://schemas.microsoft.com/office/word/2006/wordml" xmlns:wps="http://schemas.microsoft.com/office/word/2010/wordprocessingShape" mc:Ignorable="w14 w15 w16se w16cid w16 w16cex w16sdtdh w16sdtfl w16du wp14">
+<w:ftr xmlns:wpc="http://schemas.microsoft.com/office/word/2010/wordprocessingCanvas" xmlns:cx="http://schemas.microsoft.com/office/drawing/2014/chartex" xmlns:cx1="http://schemas.microsoft.com/office/drawing/2015/9/8/chartex" xmlns:cx2="http://schemas.microsoft.com/office/drawing/2015/10/21/chartex" xmlns:cx3="http://schemas.microsoft.com/office/drawing/2016/5/9/chartex" xmlns:cx4="http://schemas.microsoft.com/office/drawing/2016/5/10/chartex" xmlns:cx5="http://schemas.microsoft.com/office/drawing/2016/5/11/chartex" xmlns:cx6="http://schemas.microsoft.com/office/drawing/2016/5/12/chartex" xmlns:cx7="http://schemas.microsoft.com/office/drawing/2016/5/13/chartex" xmlns:cx8="http://schemas.microsoft.com/office/drawing/2016/5/14/chartex" xmlns:mc="http://schemas.openxmlformats.org/markup-compatibility/2006" xmlns:aink="http://schemas.microsoft.com/office/drawing/2016/ink" xmlns:am3d="http://schemas.microsoft.com/office/drawing/2017/model3d" xmlns:o="urn:schemas-microsoft-com:office:office" xmlns:oel="http://schemas.microsoft.com/office/2019/extlst" xmlns:r="http://schemas.openxmlformats.org/officeDocument/2006/relationships" xmlns:m="http://schemas.openxmlformats.org/officeDocument/2006/math" xmlns:v="urn:schemas-microsoft-com:vml" xmlns:wp14="http://schemas.microsoft.com/office/word/2010/wordprocessingDrawing" xmlns:wp="http://schemas.openxmlformats.org/drawingml/2006/wordprocessingDrawing" xmlns:w10="urn:schemas-microsoft-com:office:word" xmlns:w="http://schemas.openxmlformats.org/wordprocessingml/2006/main" xmlns:w14="http://schemas.microsoft.com/office/word/2010/wordml" xmlns:w15="http://schemas.microsoft.com/office/word/2012/wordml" xmlns:w16cex="http://schemas.microsoft.com/office/word/2018/wordml/cex" xmlns:w16cid="http://schemas.microsoft.com/office/word/2016/wordml/cid" xmlns:w16="http://schemas.microsoft.com/office/word/2018/wordml" xmlns:w16sdtdh="http://schemas.microsoft.com/office/word/2020/wordml/sdtdatahash" xmlns:w16se="http://schemas.microsoft.com/office/word/2015/wordml/symex" xmlns:wpg="http://schemas.microsoft.com/office/word/2010/wordprocessingGroup" xmlns:wpi="http://schemas.microsoft.com/office/word/2010/wordprocessingInk" xmlns:wne="http://schemas.microsoft.com/office/word/2006/wordml" xmlns:wps="http://schemas.microsoft.com/office/word/2010/wordprocessingShape" mc:Ignorable="w14 w15 w16se w16cid w16 w16cex w16sdtdh wp14">
   <w:p>
     <w:pPr>
-      <w:pStyle w:val="Pieddepage"/>
+      <w:pStyle w:val="Footer"/>
     </w:pPr>
     <w:r>
       <w:rPr>
@@ -7288,7 +7480,7 @@
                       <w:txbxContent>
                         <w:p>
                           <w:pPr>
-                            <w:pStyle w:val="Pieddepage"/>
+                            <w:pStyle w:val="Footer"/>
                             <w:pBdr>
                               <w:top w:val="single" w:sz="12" w:space="1" w:color="29519B" w:themeColor="accent3"/>
                               <w:bottom w:val="single" w:sz="48" w:space="1" w:color="29519B" w:themeColor="accent3"/>
@@ -7405,7 +7597,7 @@
             </wp:anchor>
           </w:drawing>
         </mc:Choice>
-        <mc:Fallback>
+        <mc:Fallback xmlns:w16sdtfl="http://schemas.microsoft.com/office/word/2024/wordml/sdtformatlock" xmlns:w16du="http://schemas.microsoft.com/office/word/2023/wordml/word16du">
           <w:pict>
             <v:shapetype w14:anchorId="0C82747C" id="_x0000_t176" coordsize="21600,21600" o:spt="176" adj="2700" path="m@0,qx0@0l0@2qy@0,21600l@1,21600qx21600@2l21600@0qy@1,xe">
               <v:stroke joinstyle="miter"/>
@@ -7541,7 +7733,7 @@
 </file>
 
 <file path=word/footnotes.xml><?xml version="1.0" encoding="utf-8"?>
-<w:footnotes xmlns:wpc="http://schemas.microsoft.com/office/word/2010/wordprocessingCanvas" xmlns:cx="http://schemas.microsoft.com/office/drawing/2014/chartex" xmlns:cx1="http://schemas.microsoft.com/office/drawing/2015/9/8/chartex" xmlns:cx2="http://schemas.microsoft.com/office/drawing/2015/10/21/chartex" xmlns:cx3="http://schemas.microsoft.com/office/drawing/2016/5/9/chartex" xmlns:cx4="http://schemas.microsoft.com/office/drawing/2016/5/10/chartex" xmlns:cx5="http://schemas.microsoft.com/office/drawing/2016/5/11/chartex" xmlns:cx6="http://schemas.microsoft.com/office/drawing/2016/5/12/chartex" xmlns:cx7="http://schemas.microsoft.com/office/drawing/2016/5/13/chartex" xmlns:cx8="http://schemas.microsoft.com/office/drawing/2016/5/14/chartex" xmlns:mc="http://schemas.openxmlformats.org/markup-compatibility/2006" xmlns:aink="http://schemas.microsoft.com/office/drawing/2016/ink" xmlns:am3d="http://schemas.microsoft.com/office/drawing/2017/model3d" xmlns:o="urn:schemas-microsoft-com:office:office" xmlns:oel="http://schemas.microsoft.com/office/2019/extlst" xmlns:r="http://schemas.openxmlformats.org/officeDocument/2006/relationships" xmlns:m="http://schemas.openxmlformats.org/officeDocument/2006/math" xmlns:v="urn:schemas-microsoft-com:vml" xmlns:wp14="http://schemas.microsoft.com/office/word/2010/wordprocessingDrawing" xmlns:wp="http://schemas.openxmlformats.org/drawingml/2006/wordprocessingDrawing" xmlns:w10="urn:schemas-microsoft-com:office:word" xmlns:w="http://schemas.openxmlformats.org/wordprocessingml/2006/main" xmlns:w14="http://schemas.microsoft.com/office/word/2010/wordml" xmlns:w15="http://schemas.microsoft.com/office/word/2012/wordml" xmlns:w16cex="http://schemas.microsoft.com/office/word/2018/wordml/cex" xmlns:w16cid="http://schemas.microsoft.com/office/word/2016/wordml/cid" xmlns:w16="http://schemas.microsoft.com/office/word/2018/wordml" xmlns:w16du="http://schemas.microsoft.com/office/word/2023/wordml/word16du" xmlns:w16sdtdh="http://schemas.microsoft.com/office/word/2020/wordml/sdtdatahash" xmlns:w16sdtfl="http://schemas.microsoft.com/office/word/2024/wordml/sdtformatlock" xmlns:w16se="http://schemas.microsoft.com/office/word/2015/wordml/symex" xmlns:wpg="http://schemas.microsoft.com/office/word/2010/wordprocessingGroup" xmlns:wpi="http://schemas.microsoft.com/office/word/2010/wordprocessingInk" xmlns:wne="http://schemas.microsoft.com/office/word/2006/wordml" xmlns:wps="http://schemas.microsoft.com/office/word/2010/wordprocessingShape" mc:Ignorable="w14 w15 w16se w16cid w16 w16cex w16sdtdh w16sdtfl w16du wp14">
+<w:footnotes xmlns:wpc="http://schemas.microsoft.com/office/word/2010/wordprocessingCanvas" xmlns:cx="http://schemas.microsoft.com/office/drawing/2014/chartex" xmlns:cx1="http://schemas.microsoft.com/office/drawing/2015/9/8/chartex" xmlns:cx2="http://schemas.microsoft.com/office/drawing/2015/10/21/chartex" xmlns:cx3="http://schemas.microsoft.com/office/drawing/2016/5/9/chartex" xmlns:cx4="http://schemas.microsoft.com/office/drawing/2016/5/10/chartex" xmlns:cx5="http://schemas.microsoft.com/office/drawing/2016/5/11/chartex" xmlns:cx6="http://schemas.microsoft.com/office/drawing/2016/5/12/chartex" xmlns:cx7="http://schemas.microsoft.com/office/drawing/2016/5/13/chartex" xmlns:cx8="http://schemas.microsoft.com/office/drawing/2016/5/14/chartex" xmlns:mc="http://schemas.openxmlformats.org/markup-compatibility/2006" xmlns:aink="http://schemas.microsoft.com/office/drawing/2016/ink" xmlns:am3d="http://schemas.microsoft.com/office/drawing/2017/model3d" xmlns:o="urn:schemas-microsoft-com:office:office" xmlns:oel="http://schemas.microsoft.com/office/2019/extlst" xmlns:r="http://schemas.openxmlformats.org/officeDocument/2006/relationships" xmlns:m="http://schemas.openxmlformats.org/officeDocument/2006/math" xmlns:v="urn:schemas-microsoft-com:vml" xmlns:wp14="http://schemas.microsoft.com/office/word/2010/wordprocessingDrawing" xmlns:wp="http://schemas.openxmlformats.org/drawingml/2006/wordprocessingDrawing" xmlns:w10="urn:schemas-microsoft-com:office:word" xmlns:w="http://schemas.openxmlformats.org/wordprocessingml/2006/main" xmlns:w14="http://schemas.microsoft.com/office/word/2010/wordml" xmlns:w15="http://schemas.microsoft.com/office/word/2012/wordml" xmlns:w16cex="http://schemas.microsoft.com/office/word/2018/wordml/cex" xmlns:w16cid="http://schemas.microsoft.com/office/word/2016/wordml/cid" xmlns:w16="http://schemas.microsoft.com/office/word/2018/wordml" xmlns:w16sdtdh="http://schemas.microsoft.com/office/word/2020/wordml/sdtdatahash" xmlns:w16se="http://schemas.microsoft.com/office/word/2015/wordml/symex" xmlns:wpg="http://schemas.microsoft.com/office/word/2010/wordprocessingGroup" xmlns:wpi="http://schemas.microsoft.com/office/word/2010/wordprocessingInk" xmlns:wne="http://schemas.microsoft.com/office/word/2006/wordml" xmlns:wps="http://schemas.microsoft.com/office/word/2010/wordprocessingShape" mc:Ignorable="w14 w15 w16se w16cid w16 w16cex w16sdtdh wp14">
   <w:footnote w:type="separator" w:id="-1">
     <w:p>
       <w:r>
@@ -7560,11 +7752,22 @@
 </file>
 
 <file path=word/header1.xml><?xml version="1.0" encoding="utf-8"?>
-<w:hdr xmlns:wpc="http://schemas.microsoft.com/office/word/2010/wordprocessingCanvas" xmlns:cx="http://schemas.microsoft.com/office/drawing/2014/chartex" xmlns:cx1="http://schemas.microsoft.com/office/drawing/2015/9/8/chartex" xmlns:cx2="http://schemas.microsoft.com/office/drawing/2015/10/21/chartex" xmlns:cx3="http://schemas.microsoft.com/office/drawing/2016/5/9/chartex" xmlns:cx4="http://schemas.microsoft.com/office/drawing/2016/5/10/chartex" xmlns:cx5="http://schemas.microsoft.com/office/drawing/2016/5/11/chartex" xmlns:cx6="http://schemas.microsoft.com/office/drawing/2016/5/12/chartex" xmlns:cx7="http://schemas.microsoft.com/office/drawing/2016/5/13/chartex" xmlns:cx8="http://schemas.microsoft.com/office/drawing/2016/5/14/chartex" xmlns:mc="http://schemas.openxmlformats.org/markup-compatibility/2006" xmlns:aink="http://schemas.microsoft.com/office/drawing/2016/ink" xmlns:am3d="http://schemas.microsoft.com/office/drawing/2017/model3d" xmlns:o="urn:schemas-microsoft-com:office:office" xmlns:oel="http://schemas.microsoft.com/office/2019/extlst" xmlns:r="http://schemas.openxmlformats.org/officeDocument/2006/relationships" xmlns:m="http://schemas.openxmlformats.org/officeDocument/2006/math" xmlns:v="urn:schemas-microsoft-com:vml" xmlns:wp14="http://schemas.microsoft.com/office/word/2010/wordprocessingDrawing" xmlns:wp="http://schemas.openxmlformats.org/drawingml/2006/wordprocessingDrawing" xmlns:w10="urn:schemas-microsoft-com:office:word" xmlns:w="http://schemas.openxmlformats.org/wordprocessingml/2006/main" xmlns:w14="http://schemas.microsoft.com/office/word/2010/wordml" xmlns:w15="http://schemas.microsoft.com/office/word/2012/wordml" xmlns:w16cex="http://schemas.microsoft.com/office/word/2018/wordml/cex" xmlns:w16cid="http://schemas.microsoft.com/office/word/2016/wordml/cid" xmlns:w16="http://schemas.microsoft.com/office/word/2018/wordml" xmlns:w16du="http://schemas.microsoft.com/office/word/2023/wordml/word16du" xmlns:w16sdtdh="http://schemas.microsoft.com/office/word/2020/wordml/sdtdatahash" xmlns:w16sdtfl="http://schemas.microsoft.com/office/word/2024/wordml/sdtformatlock" xmlns:w16se="http://schemas.microsoft.com/office/word/2015/wordml/symex" xmlns:wpg="http://schemas.microsoft.com/office/word/2010/wordprocessingGroup" xmlns:wpi="http://schemas.microsoft.com/office/word/2010/wordprocessingInk" xmlns:wne="http://schemas.microsoft.com/office/word/2006/wordml" xmlns:wps="http://schemas.microsoft.com/office/word/2010/wordprocessingShape" mc:Ignorable="w14 w15 w16se w16cid w16 w16cex w16sdtdh w16sdtfl w16du wp14">
+<w:hdr xmlns:wpc="http://schemas.microsoft.com/office/word/2010/wordprocessingCanvas" xmlns:cx="http://schemas.microsoft.com/office/drawing/2014/chartex" xmlns:cx1="http://schemas.microsoft.com/office/drawing/2015/9/8/chartex" xmlns:cx2="http://schemas.microsoft.com/office/drawing/2015/10/21/chartex" xmlns:cx3="http://schemas.microsoft.com/office/drawing/2016/5/9/chartex" xmlns:cx4="http://schemas.microsoft.com/office/drawing/2016/5/10/chartex" xmlns:cx5="http://schemas.microsoft.com/office/drawing/2016/5/11/chartex" xmlns:cx6="http://schemas.microsoft.com/office/drawing/2016/5/12/chartex" xmlns:cx7="http://schemas.microsoft.com/office/drawing/2016/5/13/chartex" xmlns:cx8="http://schemas.microsoft.com/office/drawing/2016/5/14/chartex" xmlns:mc="http://schemas.openxmlformats.org/markup-compatibility/2006" xmlns:aink="http://schemas.microsoft.com/office/drawing/2016/ink" xmlns:am3d="http://schemas.microsoft.com/office/drawing/2017/model3d" xmlns:o="urn:schemas-microsoft-com:office:office" xmlns:oel="http://schemas.microsoft.com/office/2019/extlst" xmlns:r="http://schemas.openxmlformats.org/officeDocument/2006/relationships" xmlns:m="http://schemas.openxmlformats.org/officeDocument/2006/math" xmlns:v="urn:schemas-microsoft-com:vml" xmlns:wp14="http://schemas.microsoft.com/office/word/2010/wordprocessingDrawing" xmlns:wp="http://schemas.openxmlformats.org/drawingml/2006/wordprocessingDrawing" xmlns:w10="urn:schemas-microsoft-com:office:word" xmlns:w="http://schemas.openxmlformats.org/wordprocessingml/2006/main" xmlns:w14="http://schemas.microsoft.com/office/word/2010/wordml" xmlns:w15="http://schemas.microsoft.com/office/word/2012/wordml" xmlns:w16cex="http://schemas.microsoft.com/office/word/2018/wordml/cex" xmlns:w16cid="http://schemas.microsoft.com/office/word/2016/wordml/cid" xmlns:w16="http://schemas.microsoft.com/office/word/2018/wordml" xmlns:w16sdtdh="http://schemas.microsoft.com/office/word/2020/wordml/sdtdatahash" xmlns:w16se="http://schemas.microsoft.com/office/word/2015/wordml/symex" xmlns:wpg="http://schemas.microsoft.com/office/word/2010/wordprocessingGroup" xmlns:wpi="http://schemas.microsoft.com/office/word/2010/wordprocessingInk" xmlns:wne="http://schemas.microsoft.com/office/word/2006/wordml" xmlns:wps="http://schemas.microsoft.com/office/word/2010/wordprocessingShape" mc:Ignorable="w14 w15 w16se w16cid w16 w16cex w16sdtdh wp14">
   <w:p>
     <w:pPr>
-      <w:pStyle w:val="En-tte"/>
+      <w:pStyle w:val="Header"/>
     </w:pPr>
+  </w:p>
+</w:hdr>
+</file>
+
+<file path=word/header2.xml><?xml version="1.0" encoding="utf-8"?>
+<w:hdr xmlns:wpc="http://schemas.microsoft.com/office/word/2010/wordprocessingCanvas" xmlns:cx="http://schemas.microsoft.com/office/drawing/2014/chartex" xmlns:cx1="http://schemas.microsoft.com/office/drawing/2015/9/8/chartex" xmlns:cx2="http://schemas.microsoft.com/office/drawing/2015/10/21/chartex" xmlns:cx3="http://schemas.microsoft.com/office/drawing/2016/5/9/chartex" xmlns:cx4="http://schemas.microsoft.com/office/drawing/2016/5/10/chartex" xmlns:cx5="http://schemas.microsoft.com/office/drawing/2016/5/11/chartex" xmlns:cx6="http://schemas.microsoft.com/office/drawing/2016/5/12/chartex" xmlns:cx7="http://schemas.microsoft.com/office/drawing/2016/5/13/chartex" xmlns:cx8="http://schemas.microsoft.com/office/drawing/2016/5/14/chartex" xmlns:mc="http://schemas.openxmlformats.org/markup-compatibility/2006" xmlns:aink="http://schemas.microsoft.com/office/drawing/2016/ink" xmlns:am3d="http://schemas.microsoft.com/office/drawing/2017/model3d" xmlns:o="urn:schemas-microsoft-com:office:office" xmlns:oel="http://schemas.microsoft.com/office/2019/extlst" xmlns:r="http://schemas.openxmlformats.org/officeDocument/2006/relationships" xmlns:m="http://schemas.openxmlformats.org/officeDocument/2006/math" xmlns:v="urn:schemas-microsoft-com:vml" xmlns:wp14="http://schemas.microsoft.com/office/word/2010/wordprocessingDrawing" xmlns:wp="http://schemas.openxmlformats.org/drawingml/2006/wordprocessingDrawing" xmlns:w10="urn:schemas-microsoft-com:office:word" xmlns:w="http://schemas.openxmlformats.org/wordprocessingml/2006/main" xmlns:w14="http://schemas.microsoft.com/office/word/2010/wordml" xmlns:w15="http://schemas.microsoft.com/office/word/2012/wordml" xmlns:w16cex="http://schemas.microsoft.com/office/word/2018/wordml/cex" xmlns:w16cid="http://schemas.microsoft.com/office/word/2016/wordml/cid" xmlns:w16="http://schemas.microsoft.com/office/word/2018/wordml" xmlns:w16sdtdh="http://schemas.microsoft.com/office/word/2020/wordml/sdtdatahash" xmlns:w16se="http://schemas.microsoft.com/office/word/2015/wordml/symex" xmlns:wpg="http://schemas.microsoft.com/office/word/2010/wordprocessingGroup" xmlns:wpi="http://schemas.microsoft.com/office/word/2010/wordprocessingInk" xmlns:wne="http://schemas.microsoft.com/office/word/2006/wordml" xmlns:wps="http://schemas.microsoft.com/office/word/2010/wordprocessingShape" mc:Ignorable="w14 w15 w16se w16cid w16 w16cex w16sdtdh wp14">
+  <w:p>
+    <w:pPr>
+      <w:pStyle w:val="Header"/>
+    </w:pPr>
+    <w:proofErr w:type="gramStart"/>
     <w:r>
       <w:rPr>
         <w:rFonts w:cs="Open Sans"/>
@@ -7578,7 +7781,15 @@
         <w:rFonts w:cs="Open Sans"/>
         <w:sz w:val="24"/>
       </w:rPr>
-      <w:t>date_publication</w:t>
+      <w:t>date</w:t>
+    </w:r>
+    <w:proofErr w:type="gramEnd"/>
+    <w:r>
+      <w:rPr>
+        <w:rFonts w:cs="Open Sans"/>
+        <w:sz w:val="24"/>
+      </w:rPr>
+      <w:t>_publication</w:t>
     </w:r>
     <w:proofErr w:type="spellEnd"/>
     <w:r>
@@ -7616,11 +7827,11 @@
 </w:hdr>
 </file>
 
-<file path=word/header2.xml><?xml version="1.0" encoding="utf-8"?>
-<w:hdr xmlns:wpc="http://schemas.microsoft.com/office/word/2010/wordprocessingCanvas" xmlns:cx="http://schemas.microsoft.com/office/drawing/2014/chartex" xmlns:cx1="http://schemas.microsoft.com/office/drawing/2015/9/8/chartex" xmlns:cx2="http://schemas.microsoft.com/office/drawing/2015/10/21/chartex" xmlns:cx3="http://schemas.microsoft.com/office/drawing/2016/5/9/chartex" xmlns:cx4="http://schemas.microsoft.com/office/drawing/2016/5/10/chartex" xmlns:cx5="http://schemas.microsoft.com/office/drawing/2016/5/11/chartex" xmlns:cx6="http://schemas.microsoft.com/office/drawing/2016/5/12/chartex" xmlns:cx7="http://schemas.microsoft.com/office/drawing/2016/5/13/chartex" xmlns:cx8="http://schemas.microsoft.com/office/drawing/2016/5/14/chartex" xmlns:mc="http://schemas.openxmlformats.org/markup-compatibility/2006" xmlns:aink="http://schemas.microsoft.com/office/drawing/2016/ink" xmlns:am3d="http://schemas.microsoft.com/office/drawing/2017/model3d" xmlns:o="urn:schemas-microsoft-com:office:office" xmlns:oel="http://schemas.microsoft.com/office/2019/extlst" xmlns:r="http://schemas.openxmlformats.org/officeDocument/2006/relationships" xmlns:m="http://schemas.openxmlformats.org/officeDocument/2006/math" xmlns:v="urn:schemas-microsoft-com:vml" xmlns:wp14="http://schemas.microsoft.com/office/word/2010/wordprocessingDrawing" xmlns:wp="http://schemas.openxmlformats.org/drawingml/2006/wordprocessingDrawing" xmlns:w10="urn:schemas-microsoft-com:office:word" xmlns:w="http://schemas.openxmlformats.org/wordprocessingml/2006/main" xmlns:w14="http://schemas.microsoft.com/office/word/2010/wordml" xmlns:w15="http://schemas.microsoft.com/office/word/2012/wordml" xmlns:w16cex="http://schemas.microsoft.com/office/word/2018/wordml/cex" xmlns:w16cid="http://schemas.microsoft.com/office/word/2016/wordml/cid" xmlns:w16="http://schemas.microsoft.com/office/word/2018/wordml" xmlns:w16du="http://schemas.microsoft.com/office/word/2023/wordml/word16du" xmlns:w16sdtdh="http://schemas.microsoft.com/office/word/2020/wordml/sdtdatahash" xmlns:w16sdtfl="http://schemas.microsoft.com/office/word/2024/wordml/sdtformatlock" xmlns:w16se="http://schemas.microsoft.com/office/word/2015/wordml/symex" xmlns:wpg="http://schemas.microsoft.com/office/word/2010/wordprocessingGroup" xmlns:wpi="http://schemas.microsoft.com/office/word/2010/wordprocessingInk" xmlns:wne="http://schemas.microsoft.com/office/word/2006/wordml" xmlns:wps="http://schemas.microsoft.com/office/word/2010/wordprocessingShape" mc:Ignorable="w14 w15 w16se w16cid w16 w16cex w16sdtdh w16sdtfl w16du wp14">
+<file path=word/header3.xml><?xml version="1.0" encoding="utf-8"?>
+<w:hdr xmlns:wpc="http://schemas.microsoft.com/office/word/2010/wordprocessingCanvas" xmlns:cx="http://schemas.microsoft.com/office/drawing/2014/chartex" xmlns:cx1="http://schemas.microsoft.com/office/drawing/2015/9/8/chartex" xmlns:cx2="http://schemas.microsoft.com/office/drawing/2015/10/21/chartex" xmlns:cx3="http://schemas.microsoft.com/office/drawing/2016/5/9/chartex" xmlns:cx4="http://schemas.microsoft.com/office/drawing/2016/5/10/chartex" xmlns:cx5="http://schemas.microsoft.com/office/drawing/2016/5/11/chartex" xmlns:cx6="http://schemas.microsoft.com/office/drawing/2016/5/12/chartex" xmlns:cx7="http://schemas.microsoft.com/office/drawing/2016/5/13/chartex" xmlns:cx8="http://schemas.microsoft.com/office/drawing/2016/5/14/chartex" xmlns:mc="http://schemas.openxmlformats.org/markup-compatibility/2006" xmlns:aink="http://schemas.microsoft.com/office/drawing/2016/ink" xmlns:am3d="http://schemas.microsoft.com/office/drawing/2017/model3d" xmlns:o="urn:schemas-microsoft-com:office:office" xmlns:oel="http://schemas.microsoft.com/office/2019/extlst" xmlns:r="http://schemas.openxmlformats.org/officeDocument/2006/relationships" xmlns:m="http://schemas.openxmlformats.org/officeDocument/2006/math" xmlns:v="urn:schemas-microsoft-com:vml" xmlns:wp14="http://schemas.microsoft.com/office/word/2010/wordprocessingDrawing" xmlns:wp="http://schemas.openxmlformats.org/drawingml/2006/wordprocessingDrawing" xmlns:w10="urn:schemas-microsoft-com:office:word" xmlns:w="http://schemas.openxmlformats.org/wordprocessingml/2006/main" xmlns:w14="http://schemas.microsoft.com/office/word/2010/wordml" xmlns:w15="http://schemas.microsoft.com/office/word/2012/wordml" xmlns:w16cex="http://schemas.microsoft.com/office/word/2018/wordml/cex" xmlns:w16cid="http://schemas.microsoft.com/office/word/2016/wordml/cid" xmlns:w16="http://schemas.microsoft.com/office/word/2018/wordml" xmlns:w16sdtdh="http://schemas.microsoft.com/office/word/2020/wordml/sdtdatahash" xmlns:w16se="http://schemas.microsoft.com/office/word/2015/wordml/symex" xmlns:wpg="http://schemas.microsoft.com/office/word/2010/wordprocessingGroup" xmlns:wpi="http://schemas.microsoft.com/office/word/2010/wordprocessingInk" xmlns:wne="http://schemas.microsoft.com/office/word/2006/wordml" xmlns:wps="http://schemas.microsoft.com/office/word/2010/wordprocessingShape" mc:Ignorable="w14 w15 w16se w16cid w16 w16cex w16sdtdh wp14">
   <w:p>
     <w:pPr>
-      <w:pStyle w:val="En-tte"/>
+      <w:pStyle w:val="Header"/>
       <w:rPr>
         <w:rFonts w:cs="Open Sans"/>
         <w:b/>
@@ -7708,7 +7919,7 @@
             </wp:anchor>
           </w:drawing>
         </mc:Choice>
-        <mc:Fallback>
+        <mc:Fallback xmlns:w16sdtfl="http://schemas.microsoft.com/office/word/2024/wordml/sdtformatlock" xmlns:w16du="http://schemas.microsoft.com/office/word/2023/wordml/word16du">
           <w:pict>
             <v:rect w14:anchorId="0E799C5E" id="Rectangle 1" o:spid="_x0000_s1026" style="position:absolute;margin-left:424.85pt;margin-top:30.65pt;width:170.05pt;height:5.65pt;z-index:251698176;visibility:visible;mso-wrap-style:square;mso-width-percent:0;mso-height-percent:0;mso-wrap-distance-left:9pt;mso-wrap-distance-top:0;mso-wrap-distance-right:9pt;mso-wrap-distance-bottom:0;mso-position-horizontal:absolute;mso-position-horizontal-relative:page;mso-position-vertical:absolute;mso-position-vertical-relative:text;mso-width-percent:0;mso-height-percent:0;mso-width-relative:margin;mso-height-relative:margin;v-text-anchor:top" o:gfxdata="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" fillcolor="#98d2dd" stroked="f">
               <w10:wrap anchorx="page"/>
@@ -7793,7 +8004,7 @@
             </wp:anchor>
           </w:drawing>
         </mc:Choice>
-        <mc:Fallback>
+        <mc:Fallback xmlns:w16sdtfl="http://schemas.microsoft.com/office/word/2024/wordml/sdtformatlock" xmlns:w16du="http://schemas.microsoft.com/office/word/2023/wordml/word16du">
           <w:pict>
             <v:rect w14:anchorId="4C5FA81D" id="Rectangle 1" o:spid="_x0000_s1026" style="position:absolute;margin-left:424.85pt;margin-top:18.8pt;width:170.05pt;height:5.65pt;z-index:251697152;visibility:visible;mso-wrap-style:square;mso-width-percent:0;mso-height-percent:0;mso-wrap-distance-left:9pt;mso-wrap-distance-top:0;mso-wrap-distance-right:9pt;mso-wrap-distance-bottom:0;mso-position-horizontal:absolute;mso-position-horizontal-relative:page;mso-position-vertical:absolute;mso-position-vertical-relative:text;mso-width-percent:0;mso-height-percent:0;mso-width-relative:margin;mso-height-relative:margin;v-text-anchor:top" o:gfxdata="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" fillcolor="#98d2dd" stroked="f">
               <w10:wrap anchorx="page"/>
@@ -7878,7 +8089,7 @@
             </wp:anchor>
           </w:drawing>
         </mc:Choice>
-        <mc:Fallback>
+        <mc:Fallback xmlns:w16sdtfl="http://schemas.microsoft.com/office/word/2024/wordml/sdtformatlock" xmlns:w16du="http://schemas.microsoft.com/office/word/2023/wordml/word16du">
           <w:pict>
             <v:rect w14:anchorId="219082C7" id="Rectangle 1" o:spid="_x0000_s1026" style="position:absolute;margin-left:424.85pt;margin-top:42.45pt;width:170.05pt;height:5.65pt;z-index:251699200;visibility:visible;mso-wrap-style:square;mso-width-percent:0;mso-height-percent:0;mso-wrap-distance-left:9pt;mso-wrap-distance-top:0;mso-wrap-distance-right:9pt;mso-wrap-distance-bottom:0;mso-position-horizontal:absolute;mso-position-horizontal-relative:page;mso-position-vertical:absolute;mso-position-vertical-relative:text;mso-width-percent:0;mso-height-percent:0;mso-width-relative:margin;mso-height-relative:margin;v-text-anchor:top" o:gfxdata="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" fillcolor="#98d2dd" stroked="f">
               <w10:wrap anchorx="page"/>
@@ -8038,7 +8249,7 @@
             </wp:anchor>
           </w:drawing>
         </mc:Choice>
-        <mc:Fallback>
+        <mc:Fallback xmlns:w16sdtfl="http://schemas.microsoft.com/office/word/2024/wordml/sdtformatlock" xmlns:w16du="http://schemas.microsoft.com/office/word/2023/wordml/word16du">
           <w:pict>
             <v:rect w14:anchorId="3043482A" id="Rectangle 1" o:spid="_x0000_s1026" style="position:absolute;margin-left:425pt;margin-top:6.5pt;width:170.1pt;height:5.65pt;z-index:251695104;visibility:visible;mso-wrap-style:square;mso-width-percent:0;mso-height-percent:0;mso-wrap-distance-left:9pt;mso-wrap-distance-top:0;mso-wrap-distance-right:9pt;mso-wrap-distance-bottom:0;mso-position-horizontal:absolute;mso-position-horizontal-relative:page;mso-position-vertical:absolute;mso-position-vertical-relative:text;mso-width-percent:0;mso-height-percent:0;mso-width-relative:margin;mso-height-relative:margin;v-text-anchor:top" o:gfxdata="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" fillcolor="#98d2dd" stroked="f">
               <w10:wrap anchorx="page"/>
@@ -8125,7 +8336,7 @@
             </wp:anchor>
           </w:drawing>
         </mc:Choice>
-        <mc:Fallback>
+        <mc:Fallback xmlns:w16sdtfl="http://schemas.microsoft.com/office/word/2024/wordml/sdtformatlock" xmlns:w16du="http://schemas.microsoft.com/office/word/2023/wordml/word16du">
           <w:pict>
             <v:rect w14:anchorId="095CA7C6" id="Rectangle 1" o:spid="_x0000_s1026" style="position:absolute;margin-left:424.85pt;margin-top:-5.35pt;width:170.1pt;height:5.65pt;z-index:251693056;visibility:visible;mso-wrap-style:square;mso-width-percent:0;mso-height-percent:0;mso-wrap-distance-left:9pt;mso-wrap-distance-top:0;mso-wrap-distance-right:9pt;mso-wrap-distance-bottom:0;mso-position-horizontal:absolute;mso-position-horizontal-relative:page;mso-position-vertical:absolute;mso-position-vertical-relative:text;mso-width-percent:0;mso-height-percent:0;mso-width-relative:margin;mso-height-relative:margin;v-text-anchor:top" o:gfxdata="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" fillcolor="#98d2dd" stroked="f">
               <w10:wrap anchorx="page"/>
@@ -8212,7 +8423,7 @@
             </wp:anchor>
           </w:drawing>
         </mc:Choice>
-        <mc:Fallback>
+        <mc:Fallback xmlns:w16sdtfl="http://schemas.microsoft.com/office/word/2024/wordml/sdtformatlock" xmlns:w16du="http://schemas.microsoft.com/office/word/2023/wordml/word16du">
           <w:pict>
             <v:rect w14:anchorId="5C6012BF" id="Rectangle 1" o:spid="_x0000_s1026" style="position:absolute;margin-left:425pt;margin-top:-17.25pt;width:170.1pt;height:5.65pt;z-index:251691008;visibility:visible;mso-wrap-style:square;mso-width-percent:0;mso-height-percent:0;mso-wrap-distance-left:9pt;mso-wrap-distance-top:0;mso-wrap-distance-right:9pt;mso-wrap-distance-bottom:0;mso-position-horizontal:absolute;mso-position-horizontal-relative:page;mso-position-vertical:absolute;mso-position-vertical-relative:text;mso-width-percent:0;mso-height-percent:0;mso-width-relative:margin;mso-height-relative:margin;v-text-anchor:top" o:gfxdata="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" fillcolor="#98d2dd" stroked="f">
               <w10:wrap anchorx="page"/>
@@ -8237,7 +8448,7 @@
   </w:p>
   <w:p>
     <w:pPr>
-      <w:pStyle w:val="En-tte"/>
+      <w:pStyle w:val="Header"/>
       <w:rPr>
         <w:noProof/>
         <w:color w:val="29519B"/>
@@ -8330,7 +8541,7 @@
                           <w:sdtContent>
                             <w:p>
                               <w:pPr>
-                                <w:pStyle w:val="En-ttedetabledesmatires"/>
+                                <w:pStyle w:val="TOCHeading"/>
                                 <w:ind w:left="142" w:hanging="142"/>
                                 <w:rPr>
                                   <w:color w:val="FFFFFF" w:themeColor="light1"/>
@@ -8345,7 +8556,7 @@
                             </w:p>
                             <w:p>
                               <w:pPr>
-                                <w:pStyle w:val="TM1"/>
+                                <w:pStyle w:val="TOC1"/>
                                 <w:tabs>
                                   <w:tab w:val="right" w:leader="dot" w:pos="11176"/>
                                 </w:tabs>
@@ -8383,7 +8594,7 @@
                               <w:hyperlink w:anchor="_Toc214443469" w:history="1">
                                 <w:r>
                                   <w:rPr>
-                                    <w:rStyle w:val="Lienhypertexte"/>
+                                    <w:rStyle w:val="Hyperlink"/>
                                     <w:noProof/>
                                   </w:rPr>
                                   <w:t>Synthèse</w:t>
@@ -8440,7 +8651,7 @@
                             </w:p>
                             <w:p>
                               <w:pPr>
-                                <w:pStyle w:val="TM1"/>
+                                <w:pStyle w:val="TOC1"/>
                                 <w:tabs>
                                   <w:tab w:val="right" w:leader="dot" w:pos="11176"/>
                                 </w:tabs>
@@ -8460,7 +8671,7 @@
                               <w:hyperlink w:anchor="_Toc214443470" w:history="1">
                                 <w:r>
                                   <w:rPr>
-                                    <w:rStyle w:val="Lienhypertexte"/>
+                                    <w:rStyle w:val="Hyperlink"/>
                                     <w:noProof/>
                                     <w:lang w:val="en-US" w:bidi="fr-FR"/>
                                   </w:rPr>
@@ -8518,7 +8729,7 @@
                             </w:p>
                             <w:p>
                               <w:pPr>
-                                <w:pStyle w:val="TM1"/>
+                                <w:pStyle w:val="TOC1"/>
                                 <w:tabs>
                                   <w:tab w:val="right" w:leader="dot" w:pos="11176"/>
                                 </w:tabs>
@@ -8538,7 +8749,7 @@
                               <w:hyperlink w:anchor="_Toc214443471" w:history="1">
                                 <w:r>
                                   <w:rPr>
-                                    <w:rStyle w:val="Lienhypertexte"/>
+                                    <w:rStyle w:val="Hyperlink"/>
                                     <w:noProof/>
                                     <w:lang w:val="en-US" w:bidi="fr-FR"/>
                                   </w:rPr>
@@ -8596,7 +8807,7 @@
                             </w:p>
                             <w:p>
                               <w:pPr>
-                                <w:pStyle w:val="TM1"/>
+                                <w:pStyle w:val="TOC1"/>
                                 <w:tabs>
                                   <w:tab w:val="right" w:leader="dot" w:pos="11176"/>
                                 </w:tabs>
@@ -8616,7 +8827,7 @@
                               <w:hyperlink w:anchor="_Toc214443472" w:history="1">
                                 <w:r>
                                   <w:rPr>
-                                    <w:rStyle w:val="Lienhypertexte"/>
+                                    <w:rStyle w:val="Hyperlink"/>
                                     <w:noProof/>
                                     <w:lang w:bidi="fr-FR"/>
                                   </w:rPr>
@@ -8674,7 +8885,7 @@
                             </w:p>
                             <w:p>
                               <w:pPr>
-                                <w:pStyle w:val="TM1"/>
+                                <w:pStyle w:val="TOC1"/>
                                 <w:tabs>
                                   <w:tab w:val="right" w:leader="dot" w:pos="11176"/>
                                 </w:tabs>
@@ -8694,7 +8905,7 @@
                               <w:hyperlink w:anchor="_Toc214443473" w:history="1">
                                 <w:r>
                                   <w:rPr>
-                                    <w:rStyle w:val="Lienhypertexte"/>
+                                    <w:rStyle w:val="Hyperlink"/>
                                     <w:noProof/>
                                     <w:lang w:bidi="fr-FR"/>
                                   </w:rPr>
@@ -8752,7 +8963,7 @@
                             </w:p>
                             <w:p>
                               <w:pPr>
-                                <w:pStyle w:val="TM1"/>
+                                <w:pStyle w:val="TOC1"/>
                                 <w:tabs>
                                   <w:tab w:val="right" w:leader="dot" w:pos="11176"/>
                                 </w:tabs>
@@ -8772,7 +8983,7 @@
                               <w:hyperlink w:anchor="_Toc214443474" w:history="1">
                                 <w:r>
                                   <w:rPr>
-                                    <w:rStyle w:val="Lienhypertexte"/>
+                                    <w:rStyle w:val="Hyperlink"/>
                                     <w:noProof/>
                                     <w:lang w:bidi="fr-FR"/>
                                   </w:rPr>
@@ -8830,7 +9041,7 @@
                             </w:p>
                             <w:p>
                               <w:pPr>
-                                <w:pStyle w:val="TM1"/>
+                                <w:pStyle w:val="TOC1"/>
                                 <w:tabs>
                                   <w:tab w:val="right" w:leader="dot" w:pos="11176"/>
                                 </w:tabs>
@@ -8850,7 +9061,7 @@
                               <w:hyperlink w:anchor="_Toc214443475" w:history="1">
                                 <w:r>
                                   <w:rPr>
-                                    <w:rStyle w:val="Lienhypertexte"/>
+                                    <w:rStyle w:val="Hyperlink"/>
                                     <w:noProof/>
                                     <w:lang w:val="en-US" w:bidi="fr-FR"/>
                                   </w:rPr>
@@ -9012,7 +9223,7 @@
                               <w:hyperlink r:id="rId2" w:history="1">
                                 <w:r>
                                   <w:rPr>
-                                    <w:rStyle w:val="Lienhypertexte"/>
+                                    <w:rStyle w:val="Hyperlink"/>
                                     <w:rFonts w:cs="Open Sans"/>
                                     <w:szCs w:val="16"/>
                                   </w:rPr>
@@ -9117,7 +9328,7 @@
                               <w:hyperlink r:id="rId3" w:history="1">
                                 <w:r>
                                   <w:rPr>
-                                    <w:rStyle w:val="Lienhypertexte"/>
+                                    <w:rStyle w:val="Hyperlink"/>
                                     <w:rFonts w:cs="Open Sans"/>
                                     <w:szCs w:val="16"/>
                                   </w:rPr>
@@ -9222,7 +9433,7 @@
                               <w:hyperlink r:id="rId4" w:history="1">
                                 <w:r>
                                   <w:rPr>
-                                    <w:rStyle w:val="Lienhypertexte"/>
+                                    <w:rStyle w:val="Hyperlink"/>
                                     <w:rFonts w:cs="Open Sans"/>
                                     <w:szCs w:val="16"/>
                                   </w:rPr>
@@ -9286,6 +9497,7 @@
                                   <w:szCs w:val="16"/>
                                 </w:rPr>
                               </w:pPr>
+                              <w:proofErr w:type="gramStart"/>
                               <w:r>
                                 <w:rPr>
                                   <w:rFonts w:cs="Open Sans"/>
@@ -9293,7 +9505,17 @@
                                   <w:sz w:val="16"/>
                                   <w:szCs w:val="16"/>
                                 </w:rPr>
-                                <w:t>données sur les eaux</w:t>
+                                <w:t>données</w:t>
+                              </w:r>
+                              <w:proofErr w:type="gramEnd"/>
+                              <w:r>
+                                <w:rPr>
+                                  <w:rFonts w:cs="Open Sans"/>
+                                  <w:color w:val="FFFFFF" w:themeColor="light1"/>
+                                  <w:sz w:val="16"/>
+                                  <w:szCs w:val="16"/>
+                                </w:rPr>
+                                <w:t xml:space="preserve"> sur les eaux</w:t>
                               </w:r>
                             </w:p>
                             <w:p>
@@ -9310,7 +9532,7 @@
                               <w:hyperlink r:id="rId5" w:history="1">
                                 <w:r>
                                   <w:rPr>
-                                    <w:rStyle w:val="Lienhypertexte"/>
+                                    <w:rStyle w:val="Hyperlink"/>
                                     <w:rFonts w:cs="Open Sans"/>
                                     <w:szCs w:val="16"/>
                                   </w:rPr>
@@ -9374,6 +9596,7 @@
                                   <w:szCs w:val="16"/>
                                 </w:rPr>
                               </w:pPr>
+                              <w:proofErr w:type="gramStart"/>
                               <w:r>
                                 <w:rPr>
                                   <w:rFonts w:cs="Open Sans"/>
@@ -9381,7 +9604,17 @@
                                   <w:sz w:val="16"/>
                                   <w:szCs w:val="16"/>
                                 </w:rPr>
-                                <w:t>qualité des cours d'eau et des</w:t>
+                                <w:t>qualité</w:t>
+                              </w:r>
+                              <w:proofErr w:type="gramEnd"/>
+                              <w:r>
+                                <w:rPr>
+                                  <w:rFonts w:cs="Open Sans"/>
+                                  <w:color w:val="FFFFFF" w:themeColor="light1"/>
+                                  <w:sz w:val="16"/>
+                                  <w:szCs w:val="16"/>
+                                </w:rPr>
+                                <w:t xml:space="preserve"> des cours d'eau et des</w:t>
                               </w:r>
                             </w:p>
                             <w:p>
@@ -9394,13 +9627,23 @@
                                   <w:szCs w:val="16"/>
                                 </w:rPr>
                               </w:pPr>
+                              <w:proofErr w:type="gramStart"/>
                               <w:r>
                                 <w:rPr>
                                   <w:color w:val="FFFFFF" w:themeColor="light1"/>
                                   <w:sz w:val="16"/>
                                   <w:szCs w:val="16"/>
                                 </w:rPr>
-                                <w:t>plans d'eau de l'OFB</w:t>
+                                <w:t>plans</w:t>
+                              </w:r>
+                              <w:proofErr w:type="gramEnd"/>
+                              <w:r>
+                                <w:rPr>
+                                  <w:color w:val="FFFFFF" w:themeColor="light1"/>
+                                  <w:sz w:val="16"/>
+                                  <w:szCs w:val="16"/>
+                                </w:rPr>
+                                <w:t xml:space="preserve"> d'eau de l'OFB</w:t>
                               </w:r>
                             </w:p>
                             <w:p>
@@ -9416,20 +9659,20 @@
                               <w:hyperlink r:id="rId6" w:history="1">
                                 <w:r>
                                   <w:rPr>
-                                    <w:rStyle w:val="Lienhypertexte"/>
+                                    <w:rStyle w:val="Hyperlink"/>
                                     <w:szCs w:val="16"/>
                                   </w:rPr>
                                   <w:t>https://naiades.</w:t>
                                 </w:r>
                                 <w:r>
                                   <w:rPr>
-                                    <w:rStyle w:val="Lienhypertexte"/>
+                                    <w:rStyle w:val="Hyperlink"/>
                                   </w:rPr>
                                   <w:t>eaufrance</w:t>
                                 </w:r>
                                 <w:r>
                                   <w:rPr>
-                                    <w:rStyle w:val="Lienhypertexte"/>
+                                    <w:rStyle w:val="Hyperlink"/>
                                     <w:szCs w:val="16"/>
                                   </w:rPr>
                                   <w:t>.fr/</w:t>
@@ -9470,7 +9713,7 @@
               <v:stroke joinstyle="miter"/>
               <v:path gradientshapeok="t" o:connecttype="rect"/>
             </v:shapetype>
-            <v:shape id="Zone de texte 4" o:spid="_x0000_s1027" type="#_x0000_t202" style="position:absolute;margin-left:411.95pt;margin-top:101.7pt;width:158.35pt;height:673.6pt;z-index:251769856;visibility:visible;mso-wrap-style:square;mso-height-percent:0;mso-wrap-distance-left:9pt;mso-wrap-distance-top:0;mso-wrap-distance-right:9pt;mso-wrap-distance-bottom:0;mso-position-horizontal:absolute;mso-position-horizontal-relative:text;mso-position-vertical:absolute;mso-position-vertical-relative:text;mso-height-percent:0;mso-height-relative:margin;v-text-anchor:top" o:gfxdata="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" filled="f" stroked="f" strokeweight=".5pt">
+            <v:shape id="Zone de texte 4" o:spid="_x0000_s1027" type="#_x0000_t202" style="position:absolute;margin-left:411.95pt;margin-top:101.7pt;width:158.35pt;height:673.6pt;z-index:251769856;visibility:visible;mso-wrap-style:square;mso-height-percent:0;mso-wrap-distance-left:9pt;mso-wrap-distance-top:0;mso-wrap-distance-right:9pt;mso-wrap-distance-bottom:0;mso-position-horizontal:absolute;mso-position-horizontal-relative:text;mso-position-vertical:absolute;mso-position-vertical-relative:text;mso-height-percent:0;mso-height-relative:margin;v-text-anchor:top" o:gfxdata="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" filled="f" stroked="f" strokeweight=".5pt">
               <v:textbox>
                 <w:txbxContent>
                   <w:sdt>
@@ -9496,7 +9739,7 @@
                     <w:sdtContent>
                       <w:p>
                         <w:pPr>
-                          <w:pStyle w:val="En-ttedetabledesmatires"/>
+                          <w:pStyle w:val="TOCHeading"/>
                           <w:ind w:left="142" w:hanging="142"/>
                           <w:rPr>
                             <w:color w:val="FFFFFF" w:themeColor="light1"/>
@@ -9511,7 +9754,7 @@
                       </w:p>
                       <w:p>
                         <w:pPr>
-                          <w:pStyle w:val="TM1"/>
+                          <w:pStyle w:val="TOC1"/>
                           <w:tabs>
                             <w:tab w:val="right" w:leader="dot" w:pos="11176"/>
                           </w:tabs>
@@ -9549,7 +9792,7 @@
                         <w:hyperlink w:anchor="_Toc214443469" w:history="1">
                           <w:r>
                             <w:rPr>
-                              <w:rStyle w:val="Lienhypertexte"/>
+                              <w:rStyle w:val="Hyperlink"/>
                               <w:noProof/>
                             </w:rPr>
                             <w:t>Synthèse</w:t>
@@ -9606,7 +9849,7 @@
                       </w:p>
                       <w:p>
                         <w:pPr>
-                          <w:pStyle w:val="TM1"/>
+                          <w:pStyle w:val="TOC1"/>
                           <w:tabs>
                             <w:tab w:val="right" w:leader="dot" w:pos="11176"/>
                           </w:tabs>
@@ -9626,7 +9869,7 @@
                         <w:hyperlink w:anchor="_Toc214443470" w:history="1">
                           <w:r>
                             <w:rPr>
-                              <w:rStyle w:val="Lienhypertexte"/>
+                              <w:rStyle w:val="Hyperlink"/>
                               <w:noProof/>
                               <w:lang w:val="en-US" w:bidi="fr-FR"/>
                             </w:rPr>
@@ -9684,7 +9927,7 @@
                       </w:p>
                       <w:p>
                         <w:pPr>
-                          <w:pStyle w:val="TM1"/>
+                          <w:pStyle w:val="TOC1"/>
                           <w:tabs>
                             <w:tab w:val="right" w:leader="dot" w:pos="11176"/>
                           </w:tabs>
@@ -9704,7 +9947,7 @@
                         <w:hyperlink w:anchor="_Toc214443471" w:history="1">
                           <w:r>
                             <w:rPr>
-                              <w:rStyle w:val="Lienhypertexte"/>
+                              <w:rStyle w:val="Hyperlink"/>
                               <w:noProof/>
                               <w:lang w:val="en-US" w:bidi="fr-FR"/>
                             </w:rPr>
@@ -9762,7 +10005,7 @@
                       </w:p>
                       <w:p>
                         <w:pPr>
-                          <w:pStyle w:val="TM1"/>
+                          <w:pStyle w:val="TOC1"/>
                           <w:tabs>
                             <w:tab w:val="right" w:leader="dot" w:pos="11176"/>
                           </w:tabs>
@@ -9782,7 +10025,7 @@
                         <w:hyperlink w:anchor="_Toc214443472" w:history="1">
                           <w:r>
                             <w:rPr>
-                              <w:rStyle w:val="Lienhypertexte"/>
+                              <w:rStyle w:val="Hyperlink"/>
                               <w:noProof/>
                               <w:lang w:bidi="fr-FR"/>
                             </w:rPr>
@@ -9840,7 +10083,7 @@
                       </w:p>
                       <w:p>
                         <w:pPr>
-                          <w:pStyle w:val="TM1"/>
+                          <w:pStyle w:val="TOC1"/>
                           <w:tabs>
                             <w:tab w:val="right" w:leader="dot" w:pos="11176"/>
                           </w:tabs>
@@ -9860,7 +10103,7 @@
                         <w:hyperlink w:anchor="_Toc214443473" w:history="1">
                           <w:r>
                             <w:rPr>
-                              <w:rStyle w:val="Lienhypertexte"/>
+                              <w:rStyle w:val="Hyperlink"/>
                               <w:noProof/>
                               <w:lang w:bidi="fr-FR"/>
                             </w:rPr>
@@ -9918,7 +10161,7 @@
                       </w:p>
                       <w:p>
                         <w:pPr>
-                          <w:pStyle w:val="TM1"/>
+                          <w:pStyle w:val="TOC1"/>
                           <w:tabs>
                             <w:tab w:val="right" w:leader="dot" w:pos="11176"/>
                           </w:tabs>
@@ -9938,7 +10181,7 @@
                         <w:hyperlink w:anchor="_Toc214443474" w:history="1">
                           <w:r>
                             <w:rPr>
-                              <w:rStyle w:val="Lienhypertexte"/>
+                              <w:rStyle w:val="Hyperlink"/>
                               <w:noProof/>
                               <w:lang w:bidi="fr-FR"/>
                             </w:rPr>
@@ -9996,7 +10239,7 @@
                       </w:p>
                       <w:p>
                         <w:pPr>
-                          <w:pStyle w:val="TM1"/>
+                          <w:pStyle w:val="TOC1"/>
                           <w:tabs>
                             <w:tab w:val="right" w:leader="dot" w:pos="11176"/>
                           </w:tabs>
@@ -10016,7 +10259,7 @@
                         <w:hyperlink w:anchor="_Toc214443475" w:history="1">
                           <w:r>
                             <w:rPr>
-                              <w:rStyle w:val="Lienhypertexte"/>
+                              <w:rStyle w:val="Hyperlink"/>
                               <w:noProof/>
                               <w:lang w:val="en-US" w:bidi="fr-FR"/>
                             </w:rPr>
@@ -10178,7 +10421,7 @@
                         <w:hyperlink r:id="rId7" w:history="1">
                           <w:r>
                             <w:rPr>
-                              <w:rStyle w:val="Lienhypertexte"/>
+                              <w:rStyle w:val="Hyperlink"/>
                               <w:rFonts w:cs="Open Sans"/>
                               <w:szCs w:val="16"/>
                             </w:rPr>
@@ -10283,7 +10526,7 @@
                         <w:hyperlink r:id="rId8" w:history="1">
                           <w:r>
                             <w:rPr>
-                              <w:rStyle w:val="Lienhypertexte"/>
+                              <w:rStyle w:val="Hyperlink"/>
                               <w:rFonts w:cs="Open Sans"/>
                               <w:szCs w:val="16"/>
                             </w:rPr>
@@ -10388,7 +10631,7 @@
                         <w:hyperlink r:id="rId9" w:history="1">
                           <w:r>
                             <w:rPr>
-                              <w:rStyle w:val="Lienhypertexte"/>
+                              <w:rStyle w:val="Hyperlink"/>
                               <w:rFonts w:cs="Open Sans"/>
                               <w:szCs w:val="16"/>
                             </w:rPr>
@@ -10452,6 +10695,7 @@
                             <w:szCs w:val="16"/>
                           </w:rPr>
                         </w:pPr>
+                        <w:proofErr w:type="gramStart"/>
                         <w:r>
                           <w:rPr>
                             <w:rFonts w:cs="Open Sans"/>
@@ -10459,7 +10703,17 @@
                             <w:sz w:val="16"/>
                             <w:szCs w:val="16"/>
                           </w:rPr>
-                          <w:t>données sur les eaux</w:t>
+                          <w:t>données</w:t>
+                        </w:r>
+                        <w:proofErr w:type="gramEnd"/>
+                        <w:r>
+                          <w:rPr>
+                            <w:rFonts w:cs="Open Sans"/>
+                            <w:color w:val="FFFFFF" w:themeColor="light1"/>
+                            <w:sz w:val="16"/>
+                            <w:szCs w:val="16"/>
+                          </w:rPr>
+                          <w:t xml:space="preserve"> sur les eaux</w:t>
                         </w:r>
                       </w:p>
                       <w:p>
@@ -10476,7 +10730,7 @@
                         <w:hyperlink r:id="rId10" w:history="1">
                           <w:r>
                             <w:rPr>
-                              <w:rStyle w:val="Lienhypertexte"/>
+                              <w:rStyle w:val="Hyperlink"/>
                               <w:rFonts w:cs="Open Sans"/>
                               <w:szCs w:val="16"/>
                             </w:rPr>
@@ -10540,6 +10794,7 @@
                             <w:szCs w:val="16"/>
                           </w:rPr>
                         </w:pPr>
+                        <w:proofErr w:type="gramStart"/>
                         <w:r>
                           <w:rPr>
                             <w:rFonts w:cs="Open Sans"/>
@@ -10547,7 +10802,17 @@
                             <w:sz w:val="16"/>
                             <w:szCs w:val="16"/>
                           </w:rPr>
-                          <w:t>qualité des cours d'eau et des</w:t>
+                          <w:t>qualité</w:t>
+                        </w:r>
+                        <w:proofErr w:type="gramEnd"/>
+                        <w:r>
+                          <w:rPr>
+                            <w:rFonts w:cs="Open Sans"/>
+                            <w:color w:val="FFFFFF" w:themeColor="light1"/>
+                            <w:sz w:val="16"/>
+                            <w:szCs w:val="16"/>
+                          </w:rPr>
+                          <w:t xml:space="preserve"> des cours d'eau et des</w:t>
                         </w:r>
                       </w:p>
                       <w:p>
@@ -10560,13 +10825,23 @@
                             <w:szCs w:val="16"/>
                           </w:rPr>
                         </w:pPr>
+                        <w:proofErr w:type="gramStart"/>
                         <w:r>
                           <w:rPr>
                             <w:color w:val="FFFFFF" w:themeColor="light1"/>
                             <w:sz w:val="16"/>
                             <w:szCs w:val="16"/>
                           </w:rPr>
-                          <w:t>plans d'eau de l'OFB</w:t>
+                          <w:t>plans</w:t>
+                        </w:r>
+                        <w:proofErr w:type="gramEnd"/>
+                        <w:r>
+                          <w:rPr>
+                            <w:color w:val="FFFFFF" w:themeColor="light1"/>
+                            <w:sz w:val="16"/>
+                            <w:szCs w:val="16"/>
+                          </w:rPr>
+                          <w:t xml:space="preserve"> d'eau de l'OFB</w:t>
                         </w:r>
                       </w:p>
                       <w:p>
@@ -10582,20 +10857,20 @@
                         <w:hyperlink r:id="rId11" w:history="1">
                           <w:r>
                             <w:rPr>
-                              <w:rStyle w:val="Lienhypertexte"/>
+                              <w:rStyle w:val="Hyperlink"/>
                               <w:szCs w:val="16"/>
                             </w:rPr>
                             <w:t>https://naiades.</w:t>
                           </w:r>
                           <w:r>
                             <w:rPr>
-                              <w:rStyle w:val="Lienhypertexte"/>
+                              <w:rStyle w:val="Hyperlink"/>
                             </w:rPr>
                             <w:t>eaufrance</w:t>
                           </w:r>
                           <w:r>
                             <w:rPr>
-                              <w:rStyle w:val="Lienhypertexte"/>
+                              <w:rStyle w:val="Hyperlink"/>
                               <w:szCs w:val="16"/>
                             </w:rPr>
                             <w:t>.fr/</w:t>
@@ -10682,7 +10957,7 @@
             </wp:anchor>
           </w:drawing>
         </mc:Choice>
-        <mc:Fallback>
+        <mc:Fallback xmlns:w16sdtfl="http://schemas.microsoft.com/office/word/2024/wordml/sdtformatlock" xmlns:w16du="http://schemas.microsoft.com/office/word/2023/wordml/word16du">
           <w:pict>
             <v:rect w14:anchorId="51AF4899" id="Rectangle 1" o:spid="_x0000_s1026" style="position:absolute;margin-left:424.9pt;margin-top:92.9pt;width:170.05pt;height:690pt;z-index:251702272;visibility:visible;mso-wrap-style:square;mso-width-percent:0;mso-height-percent:0;mso-wrap-distance-left:9pt;mso-wrap-distance-top:0;mso-wrap-distance-right:9pt;mso-wrap-distance-bottom:0;mso-position-horizontal:absolute;mso-position-horizontal-relative:page;mso-position-vertical:absolute;mso-position-vertical-relative:text;mso-width-percent:0;mso-height-percent:0;mso-width-relative:margin;mso-height-relative:margin;v-text-anchor:top" o:gfxdata="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" fillcolor="#29519b [3206]" stroked="f">
               <w10:wrap anchorx="page"/>
@@ -10691,6 +10966,7 @@
         </mc:Fallback>
       </mc:AlternateContent>
     </w:r>
+    <w:proofErr w:type="gramStart"/>
     <w:r>
       <w:rPr>
         <w:rFonts w:cs="Open Sans"/>
@@ -10704,7 +10980,15 @@
         <w:rFonts w:cs="Open Sans"/>
         <w:sz w:val="24"/>
       </w:rPr>
-      <w:t>date_publication</w:t>
+      <w:t>date</w:t>
+    </w:r>
+    <w:proofErr w:type="gramEnd"/>
+    <w:r>
+      <w:rPr>
+        <w:rFonts w:cs="Open Sans"/>
+        <w:sz w:val="24"/>
+      </w:rPr>
+      <w:t>_publication</w:t>
     </w:r>
     <w:proofErr w:type="spellEnd"/>
     <w:r>
@@ -10742,11 +11026,11 @@
 </w:hdr>
 </file>
 
-<file path=word/header3.xml><?xml version="1.0" encoding="utf-8"?>
-<w:hdr xmlns:wpc="http://schemas.microsoft.com/office/word/2010/wordprocessingCanvas" xmlns:cx="http://schemas.microsoft.com/office/drawing/2014/chartex" xmlns:cx1="http://schemas.microsoft.com/office/drawing/2015/9/8/chartex" xmlns:cx2="http://schemas.microsoft.com/office/drawing/2015/10/21/chartex" xmlns:cx3="http://schemas.microsoft.com/office/drawing/2016/5/9/chartex" xmlns:cx4="http://schemas.microsoft.com/office/drawing/2016/5/10/chartex" xmlns:cx5="http://schemas.microsoft.com/office/drawing/2016/5/11/chartex" xmlns:cx6="http://schemas.microsoft.com/office/drawing/2016/5/12/chartex" xmlns:cx7="http://schemas.microsoft.com/office/drawing/2016/5/13/chartex" xmlns:cx8="http://schemas.microsoft.com/office/drawing/2016/5/14/chartex" xmlns:mc="http://schemas.openxmlformats.org/markup-compatibility/2006" xmlns:aink="http://schemas.microsoft.com/office/drawing/2016/ink" xmlns:am3d="http://schemas.microsoft.com/office/drawing/2017/model3d" xmlns:o="urn:schemas-microsoft-com:office:office" xmlns:oel="http://schemas.microsoft.com/office/2019/extlst" xmlns:r="http://schemas.openxmlformats.org/officeDocument/2006/relationships" xmlns:m="http://schemas.openxmlformats.org/officeDocument/2006/math" xmlns:v="urn:schemas-microsoft-com:vml" xmlns:wp14="http://schemas.microsoft.com/office/word/2010/wordprocessingDrawing" xmlns:wp="http://schemas.openxmlformats.org/drawingml/2006/wordprocessingDrawing" xmlns:w10="urn:schemas-microsoft-com:office:word" xmlns:w="http://schemas.openxmlformats.org/wordprocessingml/2006/main" xmlns:w14="http://schemas.microsoft.com/office/word/2010/wordml" xmlns:w15="http://schemas.microsoft.com/office/word/2012/wordml" xmlns:w16cex="http://schemas.microsoft.com/office/word/2018/wordml/cex" xmlns:w16cid="http://schemas.microsoft.com/office/word/2016/wordml/cid" xmlns:w16="http://schemas.microsoft.com/office/word/2018/wordml" xmlns:w16du="http://schemas.microsoft.com/office/word/2023/wordml/word16du" xmlns:w16sdtdh="http://schemas.microsoft.com/office/word/2020/wordml/sdtdatahash" xmlns:w16sdtfl="http://schemas.microsoft.com/office/word/2024/wordml/sdtformatlock" xmlns:w16se="http://schemas.microsoft.com/office/word/2015/wordml/symex" xmlns:wpg="http://schemas.microsoft.com/office/word/2010/wordprocessingGroup" xmlns:wpi="http://schemas.microsoft.com/office/word/2010/wordprocessingInk" xmlns:wne="http://schemas.microsoft.com/office/word/2006/wordml" xmlns:wps="http://schemas.microsoft.com/office/word/2010/wordprocessingShape" mc:Ignorable="w14 w15 w16se w16cid w16 w16cex w16sdtdh w16sdtfl w16du wp14">
+<file path=word/header4.xml><?xml version="1.0" encoding="utf-8"?>
+<w:hdr xmlns:wpc="http://schemas.microsoft.com/office/word/2010/wordprocessingCanvas" xmlns:cx="http://schemas.microsoft.com/office/drawing/2014/chartex" xmlns:cx1="http://schemas.microsoft.com/office/drawing/2015/9/8/chartex" xmlns:cx2="http://schemas.microsoft.com/office/drawing/2015/10/21/chartex" xmlns:cx3="http://schemas.microsoft.com/office/drawing/2016/5/9/chartex" xmlns:cx4="http://schemas.microsoft.com/office/drawing/2016/5/10/chartex" xmlns:cx5="http://schemas.microsoft.com/office/drawing/2016/5/11/chartex" xmlns:cx6="http://schemas.microsoft.com/office/drawing/2016/5/12/chartex" xmlns:cx7="http://schemas.microsoft.com/office/drawing/2016/5/13/chartex" xmlns:cx8="http://schemas.microsoft.com/office/drawing/2016/5/14/chartex" xmlns:mc="http://schemas.openxmlformats.org/markup-compatibility/2006" xmlns:aink="http://schemas.microsoft.com/office/drawing/2016/ink" xmlns:am3d="http://schemas.microsoft.com/office/drawing/2017/model3d" xmlns:o="urn:schemas-microsoft-com:office:office" xmlns:oel="http://schemas.microsoft.com/office/2019/extlst" xmlns:r="http://schemas.openxmlformats.org/officeDocument/2006/relationships" xmlns:m="http://schemas.openxmlformats.org/officeDocument/2006/math" xmlns:v="urn:schemas-microsoft-com:vml" xmlns:wp14="http://schemas.microsoft.com/office/word/2010/wordprocessingDrawing" xmlns:wp="http://schemas.openxmlformats.org/drawingml/2006/wordprocessingDrawing" xmlns:w10="urn:schemas-microsoft-com:office:word" xmlns:w="http://schemas.openxmlformats.org/wordprocessingml/2006/main" xmlns:w14="http://schemas.microsoft.com/office/word/2010/wordml" xmlns:w15="http://schemas.microsoft.com/office/word/2012/wordml" xmlns:w16cex="http://schemas.microsoft.com/office/word/2018/wordml/cex" xmlns:w16cid="http://schemas.microsoft.com/office/word/2016/wordml/cid" xmlns:w16="http://schemas.microsoft.com/office/word/2018/wordml" xmlns:w16sdtdh="http://schemas.microsoft.com/office/word/2020/wordml/sdtdatahash" xmlns:w16se="http://schemas.microsoft.com/office/word/2015/wordml/symex" xmlns:wpg="http://schemas.microsoft.com/office/word/2010/wordprocessingGroup" xmlns:wpi="http://schemas.microsoft.com/office/word/2010/wordprocessingInk" xmlns:wne="http://schemas.microsoft.com/office/word/2006/wordml" xmlns:wps="http://schemas.microsoft.com/office/word/2010/wordprocessingShape" mc:Ignorable="w14 w15 w16se w16cid w16 w16cex w16sdtdh wp14">
   <w:p>
     <w:pPr>
-      <w:pStyle w:val="En-tte"/>
+      <w:pStyle w:val="Header"/>
     </w:pPr>
     <w:r>
       <w:rPr>
@@ -10867,7 +11151,7 @@
                           <w:hyperlink r:id="rId1" w:history="1">
                             <w:r>
                               <w:rPr>
-                                <w:rStyle w:val="Lienhypertexte"/>
+                                <w:rStyle w:val="Hyperlink"/>
                                 <w:rFonts w:cs="Open Sans"/>
                                 <w:szCs w:val="16"/>
                               </w:rPr>
@@ -10934,6 +11218,7 @@
                               <w:szCs w:val="16"/>
                             </w:rPr>
                           </w:pPr>
+                          <w:proofErr w:type="gramStart"/>
                           <w:r>
                             <w:rPr>
                               <w:rFonts w:cs="Open Sans"/>
@@ -10941,7 +11226,17 @@
                               <w:sz w:val="16"/>
                               <w:szCs w:val="16"/>
                             </w:rPr>
-                            <w:t>géologique national</w:t>
+                            <w:t>géologique</w:t>
+                          </w:r>
+                          <w:proofErr w:type="gramEnd"/>
+                          <w:r>
+                            <w:rPr>
+                              <w:rFonts w:cs="Open Sans"/>
+                              <w:color w:val="FFFFFF" w:themeColor="background1"/>
+                              <w:sz w:val="16"/>
+                              <w:szCs w:val="16"/>
+                            </w:rPr>
+                            <w:t xml:space="preserve"> national</w:t>
                           </w:r>
                         </w:p>
                         <w:p>
@@ -10957,7 +11252,7 @@
                           <w:hyperlink r:id="rId2" w:history="1">
                             <w:r>
                               <w:rPr>
-                                <w:rStyle w:val="Lienhypertexte"/>
+                                <w:rStyle w:val="Hyperlink"/>
                                 <w:rFonts w:cs="Open Sans"/>
                                 <w:szCs w:val="16"/>
                               </w:rPr>
@@ -11045,11 +11340,18 @@
                           <w:hyperlink r:id="rId3" w:history="1">
                             <w:r>
                               <w:rPr>
-                                <w:rStyle w:val="Lienhypertexte"/>
+                                <w:rStyle w:val="Hyperlink"/>
+                                <w:sz w:val="20"/>
+                              </w:rPr>
+                              <w:t>h</w:t>
+                            </w:r>
+                            <w:r>
+                              <w:rPr>
+                                <w:rStyle w:val="Hyperlink"/>
                                 <w:rFonts w:cs="Open Sans"/>
                                 <w:szCs w:val="16"/>
                               </w:rPr>
-                              <w:t>https://www.auvergne-rhonealpes.developpementdurable.gouv.fr/bulletins-de-situationhydrologique-a26946.html</w:t>
+                              <w:t>ttps://www.auvergne-rhone-alpes.developpement-durable.gouv.fr/bulletins-de-situation-hydrologique-a24877.html</w:t>
                             </w:r>
                           </w:hyperlink>
                         </w:p>
@@ -11059,10 +11361,17 @@
                             <w:rPr>
                               <w:rFonts w:cs="Open Sans"/>
                               <w:color w:val="FFFFFF" w:themeColor="background1"/>
-                              <w:sz w:val="16"/>
-                              <w:szCs w:val="16"/>
+                              <w:szCs w:val="20"/>
                             </w:rPr>
                           </w:pPr>
+                          <w:r>
+                            <w:rPr>
+                              <w:rFonts w:cs="Open Sans"/>
+                              <w:color w:val="FFFFFF" w:themeColor="background1"/>
+                              <w:szCs w:val="20"/>
+                            </w:rPr>
+                            <w:t>DREAL Bourogne-Franche-Comté</w:t>
+                          </w:r>
                         </w:p>
                         <w:p>
                           <w:pPr>
@@ -11070,74 +11379,71 @@
                             <w:rPr>
                               <w:rFonts w:cs="Open Sans"/>
                               <w:color w:val="FFFFFF" w:themeColor="background1"/>
-                              <w:szCs w:val="20"/>
+                              <w:sz w:val="16"/>
+                              <w:szCs w:val="16"/>
                             </w:rPr>
                           </w:pPr>
                           <w:r>
                             <w:rPr>
                               <w:rFonts w:cs="Open Sans"/>
                               <w:color w:val="FFFFFF" w:themeColor="background1"/>
-                              <w:szCs w:val="20"/>
-                            </w:rPr>
-                            <w:t>DREAL Bourogne-Franche-Comté</w:t>
+                              <w:sz w:val="16"/>
+                              <w:szCs w:val="16"/>
+                            </w:rPr>
+                            <w:t>Situation hydrologique de la</w:t>
+                          </w:r>
+                          <w:r>
+                            <w:rPr>
+                              <w:rFonts w:cs="Open Sans"/>
+                              <w:color w:val="FFFFFF" w:themeColor="background1"/>
+                              <w:sz w:val="16"/>
+                              <w:szCs w:val="16"/>
+                            </w:rPr>
+                            <w:t xml:space="preserve"> </w:t>
+                          </w:r>
+                          <w:r>
+                            <w:rPr>
+                              <w:rFonts w:cs="Open Sans"/>
+                              <w:color w:val="FFFFFF" w:themeColor="background1"/>
+                              <w:sz w:val="16"/>
+                              <w:szCs w:val="16"/>
+                            </w:rPr>
+                            <w:t>DREAL BFC</w:t>
                           </w:r>
                         </w:p>
                         <w:p>
                           <w:pPr>
                             <w:spacing w:before="0" w:after="0"/>
                             <w:rPr>
+                              <w:rStyle w:val="Hyperlink"/>
                               <w:rFonts w:cs="Open Sans"/>
-                              <w:color w:val="FFFFFF" w:themeColor="background1"/>
-                              <w:sz w:val="16"/>
-                              <w:szCs w:val="16"/>
-                            </w:rPr>
-                          </w:pPr>
-                          <w:r>
-                            <w:rPr>
-                              <w:rFonts w:cs="Open Sans"/>
-                              <w:color w:val="FFFFFF" w:themeColor="background1"/>
-                              <w:sz w:val="16"/>
-                              <w:szCs w:val="16"/>
-                            </w:rPr>
-                            <w:t>Situation hydrologique de la</w:t>
-                          </w:r>
-                          <w:r>
-                            <w:rPr>
-                              <w:rFonts w:cs="Open Sans"/>
-                              <w:color w:val="FFFFFF" w:themeColor="background1"/>
-                              <w:sz w:val="16"/>
-                              <w:szCs w:val="16"/>
-                            </w:rPr>
-                            <w:t xml:space="preserve"> </w:t>
-                          </w:r>
-                          <w:r>
-                            <w:rPr>
-                              <w:rFonts w:cs="Open Sans"/>
-                              <w:color w:val="FFFFFF" w:themeColor="background1"/>
-                              <w:sz w:val="16"/>
-                              <w:szCs w:val="16"/>
-                            </w:rPr>
-                            <w:t>DREAL BFC</w:t>
-                          </w:r>
-                        </w:p>
-                        <w:p>
-                          <w:pPr>
-                            <w:spacing w:before="0" w:after="0"/>
-                            <w:rPr>
-                              <w:rFonts w:cs="Open Sans"/>
-                              <w:color w:val="FFFFFF" w:themeColor="background1"/>
-                              <w:sz w:val="16"/>
                               <w:szCs w:val="16"/>
                             </w:rPr>
                           </w:pPr>
                           <w:hyperlink r:id="rId4" w:history="1">
                             <w:r>
                               <w:rPr>
-                                <w:rStyle w:val="Lienhypertexte"/>
+                                <w:rStyle w:val="Hyperlink"/>
                                 <w:rFonts w:cs="Open Sans"/>
                                 <w:szCs w:val="16"/>
                               </w:rPr>
-                              <w:t>https://www.bourgogne-franchecomte.developpement-durable.gouv.fr/ledernier-bulletin-de-situation-hydrologiquea6268.html</w:t>
+                              <w:t>https://www.bourgogne-franche-comte.developpement-durable.gouv.fr/dernie</w:t>
+                            </w:r>
+                            <w:r>
+                              <w:rPr>
+                                <w:rStyle w:val="Hyperlink"/>
+                                <w:rFonts w:cs="Open Sans"/>
+                                <w:szCs w:val="16"/>
+                              </w:rPr>
+                              <w:t>r</w:t>
+                            </w:r>
+                            <w:r>
+                              <w:rPr>
+                                <w:rStyle w:val="Hyperlink"/>
+                                <w:rFonts w:cs="Open Sans"/>
+                                <w:szCs w:val="16"/>
+                              </w:rPr>
+                              <w:t>-bulletin-de-situation-hydrologique-a6268.html</w:t>
                             </w:r>
                           </w:hyperlink>
                         </w:p>
@@ -11147,17 +11453,6 @@
                             <w:rPr>
                               <w:rFonts w:cs="Open Sans"/>
                               <w:color w:val="FFFFFF" w:themeColor="background1"/>
-                              <w:sz w:val="16"/>
-                              <w:szCs w:val="16"/>
-                            </w:rPr>
-                          </w:pPr>
-                        </w:p>
-                        <w:p>
-                          <w:pPr>
-                            <w:spacing w:before="0" w:after="0"/>
-                            <w:rPr>
-                              <w:rFonts w:cs="Open Sans"/>
-                              <w:color w:val="FFFFFF" w:themeColor="background1"/>
                               <w:szCs w:val="20"/>
                             </w:rPr>
                           </w:pPr>
@@ -11225,22 +11520,17 @@
                           <w:pPr>
                             <w:spacing w:before="0" w:after="0"/>
                             <w:rPr>
+                              <w:rStyle w:val="Hyperlink"/>
+                            </w:rPr>
+                          </w:pPr>
+                          <w:r>
+                            <w:rPr>
+                              <w:rStyle w:val="Hyperlink"/>
                               <w:rFonts w:cs="Open Sans"/>
-                              <w:color w:val="FFFFFF" w:themeColor="background1"/>
-                              <w:sz w:val="16"/>
                               <w:szCs w:val="16"/>
                             </w:rPr>
-                          </w:pPr>
-                          <w:hyperlink r:id="rId5" w:history="1">
-                            <w:r>
-                              <w:rPr>
-                                <w:rStyle w:val="Lienhypertexte"/>
-                                <w:rFonts w:cs="Open Sans"/>
-                                <w:szCs w:val="16"/>
-                              </w:rPr>
-                              <w:t>https://meteofrance.fr/actualite/publications/lespublications-de-meteo-france/le-dernierbulletin-de-situation-hydrologique</w:t>
-                            </w:r>
-                          </w:hyperlink>
+                            <w:t>https://meteofrance.fr/actualite/publications/les-publications-de-meteo-france/le-dernier-bulletin-de-situation-hydrologique</w:t>
+                          </w:r>
                         </w:p>
                       </w:txbxContent>
                     </wps:txbx>
@@ -11268,7 +11558,7 @@
               <v:stroke joinstyle="miter"/>
               <v:path gradientshapeok="t" o:connecttype="rect"/>
             </v:shapetype>
-            <v:shape id="Zone de texte 5" o:spid="_x0000_s1030" type="#_x0000_t202" style="position:absolute;margin-left:4.35pt;margin-top:46.8pt;width:162.4pt;height:443.95pt;z-index:251770880;visibility:visible;mso-wrap-style:square;mso-width-percent:0;mso-height-percent:0;mso-wrap-distance-left:9pt;mso-wrap-distance-top:0;mso-wrap-distance-right:9pt;mso-wrap-distance-bottom:0;mso-position-horizontal:absolute;mso-position-horizontal-relative:page;mso-position-vertical:absolute;mso-position-vertical-relative:text;mso-width-percent:0;mso-height-percent:0;mso-width-relative:margin;mso-height-relative:margin;v-text-anchor:top" o:gfxdata="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" filled="f" stroked="f" strokeweight=".5pt">
+            <v:shape id="Zone de texte 5" o:spid="_x0000_s1030" type="#_x0000_t202" style="position:absolute;margin-left:4.35pt;margin-top:46.8pt;width:162.4pt;height:443.95pt;z-index:251770880;visibility:visible;mso-wrap-style:square;mso-width-percent:0;mso-height-percent:0;mso-wrap-distance-left:9pt;mso-wrap-distance-top:0;mso-wrap-distance-right:9pt;mso-wrap-distance-bottom:0;mso-position-horizontal:absolute;mso-position-horizontal-relative:page;mso-position-vertical:absolute;mso-position-vertical-relative:text;mso-width-percent:0;mso-height-percent:0;mso-width-relative:margin;mso-height-relative:margin;v-text-anchor:top" o:gfxdata="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" filled="f" stroked="f" strokeweight=".5pt">
               <v:textbox>
                 <w:txbxContent>
                   <w:p>
@@ -11348,10 +11638,10 @@
                         <w:szCs w:val="16"/>
                       </w:rPr>
                     </w:pPr>
-                    <w:hyperlink r:id="rId6" w:history="1">
+                    <w:hyperlink r:id="rId5" w:history="1">
                       <w:r>
                         <w:rPr>
-                          <w:rStyle w:val="Lienhypertexte"/>
+                          <w:rStyle w:val="Hyperlink"/>
                           <w:rFonts w:cs="Open Sans"/>
                           <w:szCs w:val="16"/>
                         </w:rPr>
@@ -11418,6 +11708,7 @@
                         <w:szCs w:val="16"/>
                       </w:rPr>
                     </w:pPr>
+                    <w:proofErr w:type="gramStart"/>
                     <w:r>
                       <w:rPr>
                         <w:rFonts w:cs="Open Sans"/>
@@ -11425,7 +11716,17 @@
                         <w:sz w:val="16"/>
                         <w:szCs w:val="16"/>
                       </w:rPr>
-                      <w:t>géologique national</w:t>
+                      <w:t>géologique</w:t>
+                    </w:r>
+                    <w:proofErr w:type="gramEnd"/>
+                    <w:r>
+                      <w:rPr>
+                        <w:rFonts w:cs="Open Sans"/>
+                        <w:color w:val="FFFFFF" w:themeColor="background1"/>
+                        <w:sz w:val="16"/>
+                        <w:szCs w:val="16"/>
+                      </w:rPr>
+                      <w:t xml:space="preserve"> national</w:t>
                     </w:r>
                   </w:p>
                   <w:p>
@@ -11438,10 +11739,10 @@
                         <w:szCs w:val="16"/>
                       </w:rPr>
                     </w:pPr>
-                    <w:hyperlink r:id="rId7" w:history="1">
+                    <w:hyperlink r:id="rId6" w:history="1">
                       <w:r>
                         <w:rPr>
-                          <w:rStyle w:val="Lienhypertexte"/>
+                          <w:rStyle w:val="Hyperlink"/>
                           <w:rFonts w:cs="Open Sans"/>
                           <w:szCs w:val="16"/>
                         </w:rPr>
@@ -11526,27 +11827,23 @@
                         <w:szCs w:val="16"/>
                       </w:rPr>
                     </w:pPr>
-                    <w:hyperlink r:id="rId8" w:history="1">
+                    <w:hyperlink r:id="rId7" w:history="1">
                       <w:r>
                         <w:rPr>
-                          <w:rStyle w:val="Lienhypertexte"/>
+                          <w:rStyle w:val="Hyperlink"/>
+                          <w:sz w:val="20"/>
+                        </w:rPr>
+                        <w:t>h</w:t>
+                      </w:r>
+                      <w:r>
+                        <w:rPr>
+                          <w:rStyle w:val="Hyperlink"/>
                           <w:rFonts w:cs="Open Sans"/>
                           <w:szCs w:val="16"/>
                         </w:rPr>
-                        <w:t>https://www.auvergne-rhonealpes.developpementdurable.gouv.fr/bulletins-de-situationhydrologique-a26946.html</w:t>
+                        <w:t>ttps://www.auvergne-rhone-alpes.developpement-durable.gouv.fr/bulletins-de-situation-hydrologique-a24877.html</w:t>
                       </w:r>
                     </w:hyperlink>
-                  </w:p>
-                  <w:p>
-                    <w:pPr>
-                      <w:spacing w:before="0" w:after="0"/>
-                      <w:rPr>
-                        <w:rFonts w:cs="Open Sans"/>
-                        <w:color w:val="FFFFFF" w:themeColor="background1"/>
-                        <w:sz w:val="16"/>
-                        <w:szCs w:val="16"/>
-                      </w:rPr>
-                    </w:pPr>
                   </w:p>
                   <w:p>
                     <w:pPr>
@@ -11608,33 +11905,37 @@
                     <w:pPr>
                       <w:spacing w:before="0" w:after="0"/>
                       <w:rPr>
+                        <w:rStyle w:val="Hyperlink"/>
                         <w:rFonts w:cs="Open Sans"/>
-                        <w:color w:val="FFFFFF" w:themeColor="background1"/>
-                        <w:sz w:val="16"/>
                         <w:szCs w:val="16"/>
                       </w:rPr>
                     </w:pPr>
-                    <w:hyperlink r:id="rId9" w:history="1">
+                    <w:hyperlink r:id="rId8" w:history="1">
                       <w:r>
                         <w:rPr>
-                          <w:rStyle w:val="Lienhypertexte"/>
+                          <w:rStyle w:val="Hyperlink"/>
                           <w:rFonts w:cs="Open Sans"/>
                           <w:szCs w:val="16"/>
                         </w:rPr>
-                        <w:t>https://www.bourgogne-franchecomte.developpement-durable.gouv.fr/ledernier-bulletin-de-situation-hydrologiquea6268.html</w:t>
+                        <w:t>https://www.bourgogne-franche-comte.developpement-durable.gouv.fr/dernie</w:t>
+                      </w:r>
+                      <w:r>
+                        <w:rPr>
+                          <w:rStyle w:val="Hyperlink"/>
+                          <w:rFonts w:cs="Open Sans"/>
+                          <w:szCs w:val="16"/>
+                        </w:rPr>
+                        <w:t>r</w:t>
+                      </w:r>
+                      <w:r>
+                        <w:rPr>
+                          <w:rStyle w:val="Hyperlink"/>
+                          <w:rFonts w:cs="Open Sans"/>
+                          <w:szCs w:val="16"/>
+                        </w:rPr>
+                        <w:t>-bulletin-de-situation-hydrologique-a6268.html</w:t>
                       </w:r>
                     </w:hyperlink>
-                  </w:p>
-                  <w:p>
-                    <w:pPr>
-                      <w:spacing w:before="0" w:after="0"/>
-                      <w:rPr>
-                        <w:rFonts w:cs="Open Sans"/>
-                        <w:color w:val="FFFFFF" w:themeColor="background1"/>
-                        <w:sz w:val="16"/>
-                        <w:szCs w:val="16"/>
-                      </w:rPr>
-                    </w:pPr>
                   </w:p>
                   <w:p>
                     <w:pPr>
@@ -11709,22 +12010,17 @@
                     <w:pPr>
                       <w:spacing w:before="0" w:after="0"/>
                       <w:rPr>
+                        <w:rStyle w:val="Hyperlink"/>
+                      </w:rPr>
+                    </w:pPr>
+                    <w:r>
+                      <w:rPr>
+                        <w:rStyle w:val="Hyperlink"/>
                         <w:rFonts w:cs="Open Sans"/>
-                        <w:color w:val="FFFFFF" w:themeColor="background1"/>
-                        <w:sz w:val="16"/>
                         <w:szCs w:val="16"/>
                       </w:rPr>
-                    </w:pPr>
-                    <w:hyperlink r:id="rId10" w:history="1">
-                      <w:r>
-                        <w:rPr>
-                          <w:rStyle w:val="Lienhypertexte"/>
-                          <w:rFonts w:cs="Open Sans"/>
-                          <w:szCs w:val="16"/>
-                        </w:rPr>
-                        <w:t>https://meteofrance.fr/actualite/publications/lespublications-de-meteo-france/le-dernierbulletin-de-situation-hydrologique</w:t>
-                      </w:r>
-                    </w:hyperlink>
+                      <w:t>https://meteofrance.fr/actualite/publications/les-publications-de-meteo-france/le-dernier-bulletin-de-situation-hydrologique</w:t>
+                    </w:r>
                   </w:p>
                 </w:txbxContent>
               </v:textbox>
@@ -11796,7 +12092,7 @@
             </wp:anchor>
           </w:drawing>
         </mc:Choice>
-        <mc:Fallback>
+        <mc:Fallback xmlns:w16sdtfl="http://schemas.microsoft.com/office/word/2024/wordml/sdtformatlock" xmlns:w16du="http://schemas.microsoft.com/office/word/2023/wordml/word16du">
           <w:pict>
             <v:rect w14:anchorId="2C91C8A9" id="Rectangle 1" o:spid="_x0000_s1026" style="position:absolute;margin-left:0;margin-top:45.1pt;width:170.05pt;height:779pt;z-index:251687935;visibility:visible;mso-wrap-style:square;mso-width-percent:0;mso-height-percent:0;mso-wrap-distance-left:9pt;mso-wrap-distance-top:0;mso-wrap-distance-right:9pt;mso-wrap-distance-bottom:0;mso-position-horizontal:left;mso-position-horizontal-relative:page;mso-position-vertical:absolute;mso-position-vertical-relative:text;mso-width-percent:0;mso-height-percent:0;mso-width-relative:margin;mso-height-relative:margin;v-text-anchor:top" o:gfxdata="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" fillcolor="#29519b [3206]" stroked="f">
               <w10:wrap anchorx="page"/>
@@ -12746,7 +13042,7 @@
             </wp:anchor>
           </w:drawing>
         </mc:Choice>
-        <mc:Fallback>
+        <mc:Fallback xmlns:w16sdtfl="http://schemas.microsoft.com/office/word/2024/wordml/sdtformatlock" xmlns:w16du="http://schemas.microsoft.com/office/word/2023/wordml/word16du">
           <w:pict>
             <v:group w14:anchorId="4DA40426" id="Groupe 3" o:spid="_x0000_s1026" style="position:absolute;margin-left:0;margin-top:.45pt;width:19.85pt;height:289.55pt;z-index:251764736;mso-position-horizontal:left;mso-position-horizontal-relative:right-margin-area" coordsize="2520,36772" o:gfxdata="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">
               <v:rect id="Rectangle 1" o:spid="_x0000_s1027" style="position:absolute;width:2520;height:720;visibility:visible;mso-wrap-style:square;v-text-anchor:top" o:gfxdata="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" filled="f" stroked="f"/>
@@ -12780,6 +13076,7 @@
         </mc:Fallback>
       </mc:AlternateContent>
     </w:r>
+    <w:proofErr w:type="gramStart"/>
     <w:r>
       <w:rPr>
         <w:rFonts w:cs="Open Sans"/>
@@ -12793,7 +13090,15 @@
         <w:rFonts w:cs="Open Sans"/>
         <w:sz w:val="24"/>
       </w:rPr>
-      <w:t>date_publication</w:t>
+      <w:t>date</w:t>
+    </w:r>
+    <w:proofErr w:type="gramEnd"/>
+    <w:r>
+      <w:rPr>
+        <w:rFonts w:cs="Open Sans"/>
+        <w:sz w:val="24"/>
+      </w:rPr>
+      <w:t>_publication</w:t>
     </w:r>
     <w:proofErr w:type="spellEnd"/>
     <w:r>
@@ -12832,7 +13137,7 @@
 </file>
 
 <file path=word/styles.xml><?xml version="1.0" encoding="utf-8"?>
-<w:styles xmlns:mc="http://schemas.openxmlformats.org/markup-compatibility/2006" xmlns:r="http://schemas.openxmlformats.org/officeDocument/2006/relationships" xmlns:w="http://schemas.openxmlformats.org/wordprocessingml/2006/main" xmlns:w14="http://schemas.microsoft.com/office/word/2010/wordml" xmlns:w15="http://schemas.microsoft.com/office/word/2012/wordml" xmlns:w16cex="http://schemas.microsoft.com/office/word/2018/wordml/cex" xmlns:w16cid="http://schemas.microsoft.com/office/word/2016/wordml/cid" xmlns:w16="http://schemas.microsoft.com/office/word/2018/wordml" xmlns:w16du="http://schemas.microsoft.com/office/word/2023/wordml/word16du" xmlns:w16sdtdh="http://schemas.microsoft.com/office/word/2020/wordml/sdtdatahash" xmlns:w16sdtfl="http://schemas.microsoft.com/office/word/2024/wordml/sdtformatlock" xmlns:w16se="http://schemas.microsoft.com/office/word/2015/wordml/symex" mc:Ignorable="w14 w15 w16se w16cid w16 w16cex w16sdtdh w16sdtfl w16du">
+<w:styles xmlns:mc="http://schemas.openxmlformats.org/markup-compatibility/2006" xmlns:r="http://schemas.openxmlformats.org/officeDocument/2006/relationships" xmlns:w="http://schemas.openxmlformats.org/wordprocessingml/2006/main" xmlns:w14="http://schemas.microsoft.com/office/word/2010/wordml" xmlns:w15="http://schemas.microsoft.com/office/word/2012/wordml" xmlns:w16cex="http://schemas.microsoft.com/office/word/2018/wordml/cex" xmlns:w16cid="http://schemas.microsoft.com/office/word/2016/wordml/cid" xmlns:w16="http://schemas.microsoft.com/office/word/2018/wordml" xmlns:w16sdtdh="http://schemas.microsoft.com/office/word/2020/wordml/sdtdatahash" xmlns:w16se="http://schemas.microsoft.com/office/word/2015/wordml/symex" mc:Ignorable="w14 w15 w16se w16cid w16 w16cex w16sdtdh">
   <w:docDefaults>
     <w:rPrDefault>
       <w:rPr>
@@ -13239,11 +13544,11 @@
       <w:szCs w:val="24"/>
     </w:rPr>
   </w:style>
-  <w:style w:type="paragraph" w:styleId="Titre1">
+  <w:style w:type="paragraph" w:styleId="Heading1">
     <w:name w:val="heading 1"/>
     <w:basedOn w:val="Normal"/>
     <w:next w:val="Normal"/>
-    <w:link w:val="Titre1Car"/>
+    <w:link w:val="Heading1Char"/>
     <w:uiPriority w:val="9"/>
     <w:qFormat/>
     <w:rsid w:val="002F2825"/>
@@ -13260,11 +13565,11 @@
       <w:szCs w:val="22"/>
     </w:rPr>
   </w:style>
-  <w:style w:type="paragraph" w:styleId="Titre2">
+  <w:style w:type="paragraph" w:styleId="Heading2">
     <w:name w:val="heading 2"/>
     <w:basedOn w:val="Normal"/>
     <w:next w:val="Normal"/>
-    <w:link w:val="Titre2Car"/>
+    <w:link w:val="Heading2Char"/>
     <w:uiPriority w:val="9"/>
     <w:rsid w:val="00D45D40"/>
     <w:pPr>
@@ -13280,11 +13585,11 @@
       <w:szCs w:val="22"/>
     </w:rPr>
   </w:style>
-  <w:style w:type="paragraph" w:styleId="Titre3">
+  <w:style w:type="paragraph" w:styleId="Heading3">
     <w:name w:val="heading 3"/>
     <w:basedOn w:val="Normal"/>
     <w:next w:val="Normal"/>
-    <w:link w:val="Titre3Car"/>
+    <w:link w:val="Heading3Char"/>
     <w:uiPriority w:val="9"/>
     <w:semiHidden/>
     <w:rsid w:val="00C96ED5"/>
@@ -13304,11 +13609,11 @@
       <w:szCs w:val="22"/>
     </w:rPr>
   </w:style>
-  <w:style w:type="paragraph" w:styleId="Titre4">
+  <w:style w:type="paragraph" w:styleId="Heading4">
     <w:name w:val="heading 4"/>
     <w:basedOn w:val="Normal"/>
     <w:next w:val="Normal"/>
-    <w:link w:val="Titre4Car"/>
+    <w:link w:val="Heading4Char"/>
     <w:uiPriority w:val="9"/>
     <w:semiHidden/>
     <w:rsid w:val="00C96ED5"/>
@@ -13328,11 +13633,11 @@
       <w:szCs w:val="22"/>
     </w:rPr>
   </w:style>
-  <w:style w:type="paragraph" w:styleId="Titre5">
+  <w:style w:type="paragraph" w:styleId="Heading5">
     <w:name w:val="heading 5"/>
     <w:basedOn w:val="Normal"/>
     <w:next w:val="Normal"/>
-    <w:link w:val="Titre5Car"/>
+    <w:link w:val="Heading5Char"/>
     <w:uiPriority w:val="9"/>
     <w:semiHidden/>
     <w:rsid w:val="00C96ED5"/>
@@ -13351,11 +13656,11 @@
       <w:szCs w:val="22"/>
     </w:rPr>
   </w:style>
-  <w:style w:type="paragraph" w:styleId="Titre6">
+  <w:style w:type="paragraph" w:styleId="Heading6">
     <w:name w:val="heading 6"/>
     <w:basedOn w:val="Normal"/>
     <w:next w:val="Normal"/>
-    <w:link w:val="Titre6Car"/>
+    <w:link w:val="Heading6Char"/>
     <w:uiPriority w:val="9"/>
     <w:semiHidden/>
     <w:qFormat/>
@@ -13375,11 +13680,11 @@
       <w:szCs w:val="22"/>
     </w:rPr>
   </w:style>
-  <w:style w:type="paragraph" w:styleId="Titre7">
+  <w:style w:type="paragraph" w:styleId="Heading7">
     <w:name w:val="heading 7"/>
     <w:basedOn w:val="Normal"/>
     <w:next w:val="Normal"/>
-    <w:link w:val="Titre7Car"/>
+    <w:link w:val="Heading7Char"/>
     <w:uiPriority w:val="9"/>
     <w:semiHidden/>
     <w:qFormat/>
@@ -13396,11 +13701,11 @@
       <w:szCs w:val="22"/>
     </w:rPr>
   </w:style>
-  <w:style w:type="paragraph" w:styleId="Titre8">
+  <w:style w:type="paragraph" w:styleId="Heading8">
     <w:name w:val="heading 8"/>
     <w:basedOn w:val="Normal"/>
     <w:next w:val="Normal"/>
-    <w:link w:val="Titre8Car"/>
+    <w:link w:val="Heading8Char"/>
     <w:uiPriority w:val="9"/>
     <w:semiHidden/>
     <w:qFormat/>
@@ -13416,11 +13721,11 @@
       <w:szCs w:val="18"/>
     </w:rPr>
   </w:style>
-  <w:style w:type="paragraph" w:styleId="Titre9">
+  <w:style w:type="paragraph" w:styleId="Heading9">
     <w:name w:val="heading 9"/>
     <w:basedOn w:val="Normal"/>
     <w:next w:val="Normal"/>
-    <w:link w:val="Titre9Car"/>
+    <w:link w:val="Heading9Char"/>
     <w:uiPriority w:val="9"/>
     <w:semiHidden/>
     <w:qFormat/>
@@ -13437,13 +13742,13 @@
       <w:szCs w:val="18"/>
     </w:rPr>
   </w:style>
-  <w:style w:type="character" w:default="1" w:styleId="Policepardfaut">
+  <w:style w:type="character" w:default="1" w:styleId="DefaultParagraphFont">
     <w:name w:val="Default Paragraph Font"/>
     <w:uiPriority w:val="1"/>
     <w:semiHidden/>
     <w:unhideWhenUsed/>
   </w:style>
-  <w:style w:type="table" w:default="1" w:styleId="TableauNormal">
+  <w:style w:type="table" w:default="1" w:styleId="TableNormal">
     <w:name w:val="Normal Table"/>
     <w:uiPriority w:val="99"/>
     <w:semiHidden/>
@@ -13458,17 +13763,17 @@
       </w:tblCellMar>
     </w:tblPr>
   </w:style>
-  <w:style w:type="numbering" w:default="1" w:styleId="Aucuneliste">
+  <w:style w:type="numbering" w:default="1" w:styleId="NoList">
     <w:name w:val="No List"/>
     <w:uiPriority w:val="99"/>
     <w:semiHidden/>
     <w:unhideWhenUsed/>
   </w:style>
-  <w:style w:type="paragraph" w:styleId="Titre">
+  <w:style w:type="paragraph" w:styleId="Title">
     <w:name w:val="Title"/>
     <w:basedOn w:val="Normal"/>
     <w:next w:val="Normal"/>
-    <w:link w:val="TitreCar"/>
+    <w:link w:val="TitleChar"/>
     <w:uiPriority w:val="10"/>
     <w:qFormat/>
     <w:rsid w:val="00D47C02"/>
@@ -13483,10 +13788,10 @@
       <w:szCs w:val="110"/>
     </w:rPr>
   </w:style>
-  <w:style w:type="character" w:customStyle="1" w:styleId="TitreCar">
-    <w:name w:val="Titre Car"/>
-    <w:basedOn w:val="Policepardfaut"/>
-    <w:link w:val="Titre"/>
+  <w:style w:type="character" w:customStyle="1" w:styleId="TitleChar">
+    <w:name w:val="Title Char"/>
+    <w:basedOn w:val="DefaultParagraphFont"/>
+    <w:link w:val="Title"/>
     <w:uiPriority w:val="10"/>
     <w:rsid w:val="00D47C02"/>
     <w:rPr>
@@ -13498,10 +13803,10 @@
       <w:szCs w:val="110"/>
     </w:rPr>
   </w:style>
-  <w:style w:type="character" w:customStyle="1" w:styleId="Titre1Car">
-    <w:name w:val="Titre 1 Car"/>
-    <w:basedOn w:val="Policepardfaut"/>
-    <w:link w:val="Titre1"/>
+  <w:style w:type="character" w:customStyle="1" w:styleId="Heading1Char">
+    <w:name w:val="Heading 1 Char"/>
+    <w:basedOn w:val="DefaultParagraphFont"/>
+    <w:link w:val="Heading1"/>
     <w:uiPriority w:val="9"/>
     <w:rsid w:val="002F2825"/>
     <w:rPr>
@@ -13513,10 +13818,10 @@
       <w:sz w:val="28"/>
     </w:rPr>
   </w:style>
-  <w:style w:type="character" w:customStyle="1" w:styleId="Titre2Car">
-    <w:name w:val="Titre 2 Car"/>
-    <w:basedOn w:val="Policepardfaut"/>
-    <w:link w:val="Titre2"/>
+  <w:style w:type="character" w:customStyle="1" w:styleId="Heading2Char">
+    <w:name w:val="Heading 2 Char"/>
+    <w:basedOn w:val="DefaultParagraphFont"/>
+    <w:link w:val="Heading2"/>
     <w:uiPriority w:val="9"/>
     <w:rsid w:val="00D45D40"/>
     <w:rPr>
@@ -13528,10 +13833,10 @@
       <w:sz w:val="56"/>
     </w:rPr>
   </w:style>
-  <w:style w:type="character" w:customStyle="1" w:styleId="Titre3Car">
-    <w:name w:val="Titre 3 Car"/>
-    <w:basedOn w:val="Policepardfaut"/>
-    <w:link w:val="Titre3"/>
+  <w:style w:type="character" w:customStyle="1" w:styleId="Heading3Char">
+    <w:name w:val="Heading 3 Char"/>
+    <w:basedOn w:val="DefaultParagraphFont"/>
+    <w:link w:val="Heading3"/>
     <w:uiPriority w:val="9"/>
     <w:semiHidden/>
     <w:rsid w:val="00FC2165"/>
@@ -13542,10 +13847,10 @@
       <w:spacing w:val="15"/>
     </w:rPr>
   </w:style>
-  <w:style w:type="character" w:customStyle="1" w:styleId="Titre4Car">
-    <w:name w:val="Titre 4 Car"/>
-    <w:basedOn w:val="Policepardfaut"/>
-    <w:link w:val="Titre4"/>
+  <w:style w:type="character" w:customStyle="1" w:styleId="Heading4Char">
+    <w:name w:val="Heading 4 Char"/>
+    <w:basedOn w:val="DefaultParagraphFont"/>
+    <w:link w:val="Heading4"/>
     <w:uiPriority w:val="9"/>
     <w:semiHidden/>
     <w:rsid w:val="00FC2165"/>
@@ -13556,10 +13861,10 @@
       <w:spacing w:val="10"/>
     </w:rPr>
   </w:style>
-  <w:style w:type="character" w:customStyle="1" w:styleId="Titre5Car">
-    <w:name w:val="Titre 5 Car"/>
-    <w:basedOn w:val="Policepardfaut"/>
-    <w:link w:val="Titre5"/>
+  <w:style w:type="character" w:customStyle="1" w:styleId="Heading5Char">
+    <w:name w:val="Heading 5 Char"/>
+    <w:basedOn w:val="DefaultParagraphFont"/>
+    <w:link w:val="Heading5"/>
     <w:uiPriority w:val="9"/>
     <w:semiHidden/>
     <w:rsid w:val="00FC2165"/>
@@ -13570,10 +13875,10 @@
       <w:spacing w:val="10"/>
     </w:rPr>
   </w:style>
-  <w:style w:type="character" w:customStyle="1" w:styleId="Titre6Car">
-    <w:name w:val="Titre 6 Car"/>
-    <w:basedOn w:val="Policepardfaut"/>
-    <w:link w:val="Titre6"/>
+  <w:style w:type="character" w:customStyle="1" w:styleId="Heading6Char">
+    <w:name w:val="Heading 6 Char"/>
+    <w:basedOn w:val="DefaultParagraphFont"/>
+    <w:link w:val="Heading6"/>
     <w:uiPriority w:val="9"/>
     <w:semiHidden/>
     <w:rsid w:val="00FC2165"/>
@@ -13584,10 +13889,10 @@
       <w:spacing w:val="10"/>
     </w:rPr>
   </w:style>
-  <w:style w:type="character" w:customStyle="1" w:styleId="Titre7Car">
-    <w:name w:val="Titre 7 Car"/>
-    <w:basedOn w:val="Policepardfaut"/>
-    <w:link w:val="Titre7"/>
+  <w:style w:type="character" w:customStyle="1" w:styleId="Heading7Char">
+    <w:name w:val="Heading 7 Char"/>
+    <w:basedOn w:val="DefaultParagraphFont"/>
+    <w:link w:val="Heading7"/>
     <w:uiPriority w:val="9"/>
     <w:semiHidden/>
     <w:rsid w:val="00FC2165"/>
@@ -13598,10 +13903,10 @@
       <w:spacing w:val="10"/>
     </w:rPr>
   </w:style>
-  <w:style w:type="character" w:customStyle="1" w:styleId="Titre8Car">
-    <w:name w:val="Titre 8 Car"/>
-    <w:basedOn w:val="Policepardfaut"/>
-    <w:link w:val="Titre8"/>
+  <w:style w:type="character" w:customStyle="1" w:styleId="Heading8Char">
+    <w:name w:val="Heading 8 Char"/>
+    <w:basedOn w:val="DefaultParagraphFont"/>
+    <w:link w:val="Heading8"/>
     <w:uiPriority w:val="9"/>
     <w:semiHidden/>
     <w:rsid w:val="00FC2165"/>
@@ -13613,10 +13918,10 @@
       <w:szCs w:val="18"/>
     </w:rPr>
   </w:style>
-  <w:style w:type="character" w:customStyle="1" w:styleId="Titre9Car">
-    <w:name w:val="Titre 9 Car"/>
-    <w:basedOn w:val="Policepardfaut"/>
-    <w:link w:val="Titre9"/>
+  <w:style w:type="character" w:customStyle="1" w:styleId="Heading9Char">
+    <w:name w:val="Heading 9 Char"/>
+    <w:basedOn w:val="DefaultParagraphFont"/>
+    <w:link w:val="Heading9"/>
     <w:uiPriority w:val="9"/>
     <w:semiHidden/>
     <w:rsid w:val="00FC2165"/>
@@ -13629,7 +13934,7 @@
       <w:szCs w:val="18"/>
     </w:rPr>
   </w:style>
-  <w:style w:type="paragraph" w:styleId="Lgende">
+  <w:style w:type="paragraph" w:styleId="Caption">
     <w:name w:val="caption"/>
     <w:basedOn w:val="Normal"/>
     <w:next w:val="Normal"/>
@@ -13646,11 +13951,11 @@
       <w:szCs w:val="16"/>
     </w:rPr>
   </w:style>
-  <w:style w:type="paragraph" w:styleId="Sous-titre">
+  <w:style w:type="paragraph" w:styleId="Subtitle">
     <w:name w:val="Subtitle"/>
     <w:basedOn w:val="Normal"/>
     <w:next w:val="Normal"/>
-    <w:link w:val="Sous-titreCar"/>
+    <w:link w:val="SubtitleChar"/>
     <w:uiPriority w:val="11"/>
     <w:qFormat/>
     <w:rsid w:val="00D47C02"/>
@@ -13665,10 +13970,10 @@
       <w:sz w:val="90"/>
     </w:rPr>
   </w:style>
-  <w:style w:type="character" w:customStyle="1" w:styleId="Sous-titreCar">
-    <w:name w:val="Sous-titre Car"/>
-    <w:basedOn w:val="Policepardfaut"/>
-    <w:link w:val="Sous-titre"/>
+  <w:style w:type="character" w:customStyle="1" w:styleId="SubtitleChar">
+    <w:name w:val="Subtitle Char"/>
+    <w:basedOn w:val="DefaultParagraphFont"/>
+    <w:link w:val="Subtitle"/>
     <w:uiPriority w:val="11"/>
     <w:rsid w:val="00D47C02"/>
     <w:rPr>
@@ -13681,7 +13986,7 @@
       <w:szCs w:val="24"/>
     </w:rPr>
   </w:style>
-  <w:style w:type="character" w:styleId="lev">
+  <w:style w:type="character" w:styleId="Strong">
     <w:name w:val="Strong"/>
     <w:uiPriority w:val="22"/>
     <w:semiHidden/>
@@ -13692,7 +13997,7 @@
       <w:bCs/>
     </w:rPr>
   </w:style>
-  <w:style w:type="character" w:styleId="Accentuation">
+  <w:style w:type="character" w:styleId="Emphasis">
     <w:name w:val="Emphasis"/>
     <w:uiPriority w:val="20"/>
     <w:semiHidden/>
@@ -13704,10 +14009,10 @@
       <w:spacing w:val="5"/>
     </w:rPr>
   </w:style>
-  <w:style w:type="paragraph" w:styleId="Sansinterligne">
+  <w:style w:type="paragraph" w:styleId="NoSpacing">
     <w:name w:val="No Spacing"/>
     <w:basedOn w:val="Normal"/>
-    <w:link w:val="SansinterligneCar"/>
+    <w:link w:val="NoSpacingChar"/>
     <w:uiPriority w:val="1"/>
     <w:qFormat/>
     <w:rsid w:val="00C96ED5"/>
@@ -13715,10 +14020,10 @@
       <w:spacing w:before="0" w:after="0"/>
     </w:pPr>
   </w:style>
-  <w:style w:type="character" w:customStyle="1" w:styleId="SansinterligneCar">
-    <w:name w:val="Sans interligne Car"/>
-    <w:basedOn w:val="Policepardfaut"/>
-    <w:link w:val="Sansinterligne"/>
+  <w:style w:type="character" w:customStyle="1" w:styleId="NoSpacingChar">
+    <w:name w:val="No Spacing Char"/>
+    <w:basedOn w:val="DefaultParagraphFont"/>
+    <w:link w:val="NoSpacing"/>
     <w:uiPriority w:val="1"/>
     <w:rsid w:val="00EA50F5"/>
     <w:rPr>
@@ -13727,7 +14032,7 @@
       <w:szCs w:val="24"/>
     </w:rPr>
   </w:style>
-  <w:style w:type="paragraph" w:styleId="Paragraphedeliste">
+  <w:style w:type="paragraph" w:styleId="ListParagraph">
     <w:name w:val="List Paragraph"/>
     <w:basedOn w:val="Normal"/>
     <w:uiPriority w:val="34"/>
@@ -13739,11 +14044,11 @@
       <w:contextualSpacing/>
     </w:pPr>
   </w:style>
-  <w:style w:type="paragraph" w:styleId="Citation">
+  <w:style w:type="paragraph" w:styleId="Quote">
     <w:name w:val="Quote"/>
     <w:basedOn w:val="Normal"/>
     <w:next w:val="Normal"/>
-    <w:link w:val="CitationCar"/>
+    <w:link w:val="QuoteChar"/>
     <w:uiPriority w:val="29"/>
     <w:qFormat/>
     <w:rsid w:val="003750FA"/>
@@ -13757,10 +14062,10 @@
       <w:szCs w:val="60"/>
     </w:rPr>
   </w:style>
-  <w:style w:type="character" w:customStyle="1" w:styleId="CitationCar">
-    <w:name w:val="Citation Car"/>
-    <w:basedOn w:val="Policepardfaut"/>
-    <w:link w:val="Citation"/>
+  <w:style w:type="character" w:customStyle="1" w:styleId="QuoteChar">
+    <w:name w:val="Quote Char"/>
+    <w:basedOn w:val="DefaultParagraphFont"/>
+    <w:link w:val="Quote"/>
     <w:uiPriority w:val="29"/>
     <w:rsid w:val="003750FA"/>
     <w:rPr>
@@ -13770,11 +14075,11 @@
       <w:szCs w:val="60"/>
     </w:rPr>
   </w:style>
-  <w:style w:type="paragraph" w:styleId="Citationintense">
+  <w:style w:type="paragraph" w:styleId="IntenseQuote">
     <w:name w:val="Intense Quote"/>
     <w:basedOn w:val="Normal"/>
     <w:next w:val="Normal"/>
-    <w:link w:val="CitationintenseCar"/>
+    <w:link w:val="IntenseQuoteChar"/>
     <w:uiPriority w:val="30"/>
     <w:semiHidden/>
     <w:qFormat/>
@@ -13794,10 +14099,10 @@
       <w:color w:val="492A86" w:themeColor="accent1"/>
     </w:rPr>
   </w:style>
-  <w:style w:type="character" w:customStyle="1" w:styleId="CitationintenseCar">
-    <w:name w:val="Citation intense Car"/>
-    <w:basedOn w:val="Policepardfaut"/>
-    <w:link w:val="Citationintense"/>
+  <w:style w:type="character" w:customStyle="1" w:styleId="IntenseQuoteChar">
+    <w:name w:val="Intense Quote Char"/>
+    <w:basedOn w:val="DefaultParagraphFont"/>
+    <w:link w:val="IntenseQuote"/>
     <w:uiPriority w:val="30"/>
     <w:semiHidden/>
     <w:rsid w:val="008E2B6D"/>
@@ -13810,7 +14115,7 @@
       <w:szCs w:val="24"/>
     </w:rPr>
   </w:style>
-  <w:style w:type="character" w:styleId="Accentuationlgre">
+  <w:style w:type="character" w:styleId="SubtleEmphasis">
     <w:name w:val="Subtle Emphasis"/>
     <w:uiPriority w:val="19"/>
     <w:semiHidden/>
@@ -13822,7 +14127,7 @@
       <w:color w:val="241542" w:themeColor="accent1" w:themeShade="7F"/>
     </w:rPr>
   </w:style>
-  <w:style w:type="character" w:styleId="Accentuationintense">
+  <w:style w:type="character" w:styleId="IntenseEmphasis">
     <w:name w:val="Intense Emphasis"/>
     <w:uiPriority w:val="21"/>
     <w:semiHidden/>
@@ -13836,7 +14141,7 @@
       <w:spacing w:val="10"/>
     </w:rPr>
   </w:style>
-  <w:style w:type="character" w:styleId="Rfrencelgre">
+  <w:style w:type="character" w:styleId="SubtleReference">
     <w:name w:val="Subtle Reference"/>
     <w:uiPriority w:val="31"/>
     <w:semiHidden/>
@@ -13848,7 +14153,7 @@
       <w:color w:val="492A86" w:themeColor="accent1"/>
     </w:rPr>
   </w:style>
-  <w:style w:type="character" w:styleId="Rfrenceintense">
+  <w:style w:type="character" w:styleId="IntenseReference">
     <w:name w:val="Intense Reference"/>
     <w:uiPriority w:val="32"/>
     <w:semiHidden/>
@@ -13863,7 +14168,7 @@
       <w:color w:val="492A86" w:themeColor="accent1"/>
     </w:rPr>
   </w:style>
-  <w:style w:type="character" w:styleId="Titredulivre">
+  <w:style w:type="character" w:styleId="BookTitle">
     <w:name w:val="Book Title"/>
     <w:uiPriority w:val="33"/>
     <w:semiHidden/>
@@ -13877,7 +14182,7 @@
       <w:spacing w:val="9"/>
     </w:rPr>
   </w:style>
-  <w:style w:type="paragraph" w:styleId="En-ttedetabledesmatires">
+  <w:style w:type="paragraph" w:styleId="TOCHeading">
     <w:name w:val="TOC Heading"/>
     <w:basedOn w:val="Normal"/>
     <w:next w:val="Normal"/>
@@ -13894,10 +14199,10 @@
       <w:lang w:eastAsia="ja-JP"/>
     </w:rPr>
   </w:style>
-  <w:style w:type="paragraph" w:styleId="Pieddepage">
+  <w:style w:type="paragraph" w:styleId="Footer">
     <w:name w:val="footer"/>
     <w:basedOn w:val="Normal"/>
-    <w:link w:val="PieddepageCar"/>
+    <w:link w:val="FooterChar"/>
     <w:uiPriority w:val="99"/>
     <w:rsid w:val="0018361D"/>
     <w:pPr>
@@ -13908,10 +14213,10 @@
       <w:spacing w:before="0" w:after="0"/>
     </w:pPr>
   </w:style>
-  <w:style w:type="character" w:customStyle="1" w:styleId="PieddepageCar">
-    <w:name w:val="Pied de page Car"/>
-    <w:basedOn w:val="Policepardfaut"/>
-    <w:link w:val="Pieddepage"/>
+  <w:style w:type="character" w:customStyle="1" w:styleId="FooterChar">
+    <w:name w:val="Footer Char"/>
+    <w:basedOn w:val="DefaultParagraphFont"/>
+    <w:link w:val="Footer"/>
     <w:uiPriority w:val="99"/>
     <w:rsid w:val="008E2B6D"/>
     <w:rPr>
@@ -13920,18 +14225,18 @@
       <w:szCs w:val="24"/>
     </w:rPr>
   </w:style>
-  <w:style w:type="character" w:styleId="Numrodepage">
+  <w:style w:type="character" w:styleId="PageNumber">
     <w:name w:val="page number"/>
-    <w:basedOn w:val="Policepardfaut"/>
+    <w:basedOn w:val="DefaultParagraphFont"/>
     <w:uiPriority w:val="99"/>
     <w:semiHidden/>
     <w:unhideWhenUsed/>
     <w:rsid w:val="0018361D"/>
   </w:style>
-  <w:style w:type="paragraph" w:styleId="En-tte">
+  <w:style w:type="paragraph" w:styleId="Header">
     <w:name w:val="header"/>
     <w:basedOn w:val="Normal"/>
-    <w:link w:val="En-tteCar"/>
+    <w:link w:val="HeaderChar"/>
     <w:uiPriority w:val="99"/>
     <w:semiHidden/>
     <w:rsid w:val="0018361D"/>
@@ -13943,10 +14248,10 @@
       <w:spacing w:before="0" w:after="0"/>
     </w:pPr>
   </w:style>
-  <w:style w:type="character" w:customStyle="1" w:styleId="En-tteCar">
-    <w:name w:val="En-tête Car"/>
-    <w:basedOn w:val="Policepardfaut"/>
-    <w:link w:val="En-tte"/>
+  <w:style w:type="character" w:customStyle="1" w:styleId="HeaderChar">
+    <w:name w:val="Header Char"/>
+    <w:basedOn w:val="DefaultParagraphFont"/>
+    <w:link w:val="Header"/>
     <w:uiPriority w:val="99"/>
     <w:semiHidden/>
     <w:rsid w:val="008E2B6D"/>
@@ -13956,9 +14261,9 @@
       <w:szCs w:val="24"/>
     </w:rPr>
   </w:style>
-  <w:style w:type="table" w:styleId="Grilledutableau">
+  <w:style w:type="table" w:styleId="TableGrid">
     <w:name w:val="Table Grid"/>
-    <w:basedOn w:val="TableauNormal"/>
+    <w:basedOn w:val="TableNormal"/>
     <w:uiPriority w:val="39"/>
     <w:rsid w:val="00890A94"/>
     <w:pPr>
@@ -13975,10 +14280,10 @@
       </w:tblBorders>
     </w:tblPr>
   </w:style>
-  <w:style w:type="paragraph" w:styleId="TM1">
+  <w:style w:type="paragraph" w:styleId="TOC1">
     <w:name w:val="toc 1"/>
     <w:basedOn w:val="Normal"/>
-    <w:next w:val="TM2"/>
+    <w:next w:val="TOC2"/>
     <w:uiPriority w:val="39"/>
     <w:rsid w:val="00763BCC"/>
     <w:pPr>
@@ -13991,7 +14296,7 @@
       <w:lang w:eastAsia="ja-JP"/>
     </w:rPr>
   </w:style>
-  <w:style w:type="paragraph" w:styleId="TM2">
+  <w:style w:type="paragraph" w:styleId="TOC2">
     <w:name w:val="toc 2"/>
     <w:basedOn w:val="Normal"/>
     <w:next w:val="Normal"/>
@@ -14021,9 +14326,9 @@
       <w:szCs w:val="72"/>
     </w:rPr>
   </w:style>
-  <w:style w:type="character" w:styleId="Textedelespacerserv">
+  <w:style w:type="character" w:styleId="PlaceholderText">
     <w:name w:val="Placeholder Text"/>
-    <w:basedOn w:val="Policepardfaut"/>
+    <w:basedOn w:val="DefaultParagraphFont"/>
     <w:uiPriority w:val="99"/>
     <w:semiHidden/>
     <w:rsid w:val="00DA3E92"/>
@@ -14045,7 +14350,7 @@
   </w:style>
   <w:style w:type="paragraph" w:customStyle="1" w:styleId="Sourcedelacitation">
     <w:name w:val="Source de la citation"/>
-    <w:basedOn w:val="Sansinterligne"/>
+    <w:basedOn w:val="NoSpacing"/>
     <w:qFormat/>
     <w:rsid w:val="003750FA"/>
     <w:rPr>
@@ -14066,9 +14371,9 @@
       <w:sz w:val="22"/>
     </w:rPr>
   </w:style>
-  <w:style w:type="character" w:styleId="Lienhypertexte">
+  <w:style w:type="character" w:styleId="Hyperlink">
     <w:name w:val="Hyperlink"/>
-    <w:basedOn w:val="Policepardfaut"/>
+    <w:basedOn w:val="DefaultParagraphFont"/>
     <w:uiPriority w:val="99"/>
     <w:unhideWhenUsed/>
     <w:rsid w:val="00F27609"/>
@@ -14079,9 +14384,9 @@
       <w:u w:val="none"/>
     </w:rPr>
   </w:style>
-  <w:style w:type="character" w:styleId="Mentionnonrsolue">
+  <w:style w:type="character" w:styleId="UnresolvedMention">
     <w:name w:val="Unresolved Mention"/>
-    <w:basedOn w:val="Policepardfaut"/>
+    <w:basedOn w:val="DefaultParagraphFont"/>
     <w:uiPriority w:val="99"/>
     <w:semiHidden/>
     <w:rsid w:val="000624BD"/>
@@ -14108,17 +14413,17 @@
   </w:style>
   <w:style w:type="character" w:customStyle="1" w:styleId="coords">
     <w:name w:val="coords"/>
-    <w:basedOn w:val="Policepardfaut"/>
+    <w:basedOn w:val="DefaultParagraphFont"/>
     <w:rsid w:val="00266F86"/>
   </w:style>
   <w:style w:type="character" w:customStyle="1" w:styleId="value2">
     <w:name w:val="value2"/>
-    <w:basedOn w:val="Policepardfaut"/>
+    <w:basedOn w:val="DefaultParagraphFont"/>
     <w:rsid w:val="00266F86"/>
   </w:style>
   <w:style w:type="character" w:customStyle="1" w:styleId="unit2">
     <w:name w:val="unit2"/>
-    <w:basedOn w:val="Policepardfaut"/>
+    <w:basedOn w:val="DefaultParagraphFont"/>
     <w:rsid w:val="00266F86"/>
   </w:style>
   <w:style w:type="paragraph" w:customStyle="1" w:styleId="Obsahtabulky">
@@ -14138,9 +14443,9 @@
       <w:lang w:val="cs-CZ" w:eastAsia="zh-CN" w:bidi="hi-IN"/>
     </w:rPr>
   </w:style>
-  <w:style w:type="table" w:styleId="Tableausimple2">
+  <w:style w:type="table" w:styleId="PlainTable2">
     <w:name w:val="Plain Table 2"/>
-    <w:basedOn w:val="TableauNormal"/>
+    <w:basedOn w:val="TableNormal"/>
     <w:uiPriority w:val="42"/>
     <w:rsid w:val="00845A92"/>
     <w:pPr>
@@ -14218,9 +14523,9 @@
       </w:tcPr>
     </w:tblStylePr>
   </w:style>
-  <w:style w:type="table" w:styleId="TableauListe6Couleur-Accentuation3">
+  <w:style w:type="table" w:styleId="ListTable6ColourfulAccent3">
     <w:name w:val="List Table 6 Colorful Accent 3"/>
-    <w:basedOn w:val="TableauNormal"/>
+    <w:basedOn w:val="TableNormal"/>
     <w:uiPriority w:val="51"/>
     <w:rsid w:val="00101E5E"/>
     <w:pPr>
@@ -14286,9 +14591,9 @@
       </w:tcPr>
     </w:tblStylePr>
   </w:style>
-  <w:style w:type="table" w:styleId="TableauGrille2-Accentuation3">
+  <w:style w:type="table" w:styleId="GridTable2-Accent3">
     <w:name w:val="Grid Table 2 Accent 3"/>
-    <w:basedOn w:val="TableauNormal"/>
+    <w:basedOn w:val="TableNormal"/>
     <w:uiPriority w:val="47"/>
     <w:rsid w:val="000A59FB"/>
     <w:pPr>
@@ -14360,6 +14665,18 @@
         <w:shd w:val="clear" w:color="auto" w:fill="CDD9F1" w:themeFill="accent3" w:themeFillTint="33"/>
       </w:tcPr>
     </w:tblStylePr>
+  </w:style>
+  <w:style w:type="character" w:styleId="FollowedHyperlink">
+    <w:name w:val="FollowedHyperlink"/>
+    <w:basedOn w:val="DefaultParagraphFont"/>
+    <w:uiPriority w:val="99"/>
+    <w:semiHidden/>
+    <w:unhideWhenUsed/>
+    <w:rsid w:val="004C1FAC"/>
+    <w:rPr>
+      <w:color w:val="939597" w:themeColor="followedHyperlink"/>
+      <w:u w:val="single"/>
+    </w:rPr>
   </w:style>
 </w:styles>
 </file>
@@ -14566,6 +14883,15 @@
 </file>
 
 <file path=customXml/item1.xml><?xml version="1.0" encoding="utf-8"?>
+<?mso-contentType ?>
+<FormTemplates xmlns="http://schemas.microsoft.com/sharepoint/v3/contenttype/forms">
+  <Display>DocumentLibraryForm</Display>
+  <Edit>DocumentLibraryForm</Edit>
+  <New>DocumentLibraryForm</New>
+</FormTemplates>
+</file>
+
+<file path=customXml/item2.xml><?xml version="1.0" encoding="utf-8"?>
 <ct:contentTypeSchema xmlns:ct="http://schemas.microsoft.com/office/2006/metadata/contentType" xmlns:ma="http://schemas.microsoft.com/office/2006/metadata/properties/metaAttributes" ct:_="" ma:_="" ma:contentTypeName="Document" ma:contentTypeID="0x010100DEEA25CC0A0AC24199CDC46C25B8B0BC" ma:contentTypeVersion="10" ma:contentTypeDescription="Create a new document." ma:contentTypeScope="" ma:versionID="e3b47856d4cf355c0dacb39e1084d14f">
   <xsd:schema xmlns:xsd="http://www.w3.org/2001/XMLSchema" xmlns:xs="http://www.w3.org/2001/XMLSchema" xmlns:p="http://schemas.microsoft.com/office/2006/metadata/properties" xmlns:ns1="http://schemas.microsoft.com/sharepoint/v3" xmlns:ns2="6dc4bcd6-49db-4c07-9060-8acfc67cef9f" xmlns:ns3="fb0879af-3eba-417a-a55a-ffe6dcd6ca77" targetNamespace="http://schemas.microsoft.com/office/2006/metadata/properties" ma:root="true" ma:fieldsID="a845a615265fdb1f7b12cc65ac20ecbd" ns1:_="" ns2:_="" ns3:_="">
     <xsd:import namespace="http://schemas.microsoft.com/sharepoint/v3"/>
@@ -14773,20 +15099,7 @@
 </ct:contentTypeSchema>
 </file>
 
-<file path=customXml/item2.xml><?xml version="1.0" encoding="utf-8"?>
-<?mso-contentType ?>
-<FormTemplates xmlns="http://schemas.microsoft.com/sharepoint/v3/contenttype/forms">
-  <Display>DocumentLibraryForm</Display>
-  <Edit>DocumentLibraryForm</Edit>
-  <New>DocumentLibraryForm</New>
-</FormTemplates>
-</file>
-
 <file path=customXml/item3.xml><?xml version="1.0" encoding="utf-8"?>
-<b:Sources xmlns:b="http://schemas.openxmlformats.org/officeDocument/2006/bibliography" xmlns="http://schemas.openxmlformats.org/officeDocument/2006/bibliography" SelectedStyle="/APASixthEditionOfficeOnline.xsl" StyleName="APA"/>
-</file>
-
-<file path=customXml/item4.xml><?xml version="1.0" encoding="utf-8"?>
 <p:properties xmlns:p="http://schemas.microsoft.com/office/2006/metadata/properties" xmlns:xsi="http://www.w3.org/2001/XMLSchema-instance" xmlns:pc="http://schemas.microsoft.com/office/infopath/2007/PartnerControls">
   <documentManagement>
     <_ip_UnifiedCompliancePolicyUIAction xmlns="http://schemas.microsoft.com/sharepoint/v3" xsi:nil="true"/>
@@ -14795,7 +15108,19 @@
 </p:properties>
 </file>
 
+<file path=customXml/item4.xml><?xml version="1.0" encoding="utf-8"?>
+<b:Sources xmlns:b="http://schemas.openxmlformats.org/officeDocument/2006/bibliography" xmlns="http://schemas.openxmlformats.org/officeDocument/2006/bibliography" SelectedStyle="/APASixthEditionOfficeOnline.xsl" StyleName="APA"/>
+</file>
+
 <file path=customXml/itemProps1.xml><?xml version="1.0" encoding="utf-8"?>
+<ds:datastoreItem xmlns:ds="http://schemas.openxmlformats.org/officeDocument/2006/customXml" ds:itemID="{B7BD6E96-7F2F-4BF6-96E5-092A4FF07498}">
+  <ds:schemaRefs>
+    <ds:schemaRef ds:uri="http://schemas.microsoft.com/sharepoint/v3/contenttype/forms"/>
+  </ds:schemaRefs>
+</ds:datastoreItem>
+</file>
+
+<file path=customXml/itemProps2.xml><?xml version="1.0" encoding="utf-8"?>
 <ds:datastoreItem xmlns:ds="http://schemas.openxmlformats.org/officeDocument/2006/customXml" ds:itemID="{7A25D6CD-424A-45B8-9E13-0180CE70E627}">
   <ds:schemaRefs>
     <ds:schemaRef ds:uri="http://schemas.microsoft.com/office/2006/metadata/contentType"/>
@@ -14815,23 +15140,7 @@
 </ds:datastoreItem>
 </file>
 
-<file path=customXml/itemProps2.xml><?xml version="1.0" encoding="utf-8"?>
-<ds:datastoreItem xmlns:ds="http://schemas.openxmlformats.org/officeDocument/2006/customXml" ds:itemID="{B7BD6E96-7F2F-4BF6-96E5-092A4FF07498}">
-  <ds:schemaRefs>
-    <ds:schemaRef ds:uri="http://schemas.microsoft.com/sharepoint/v3/contenttype/forms"/>
-  </ds:schemaRefs>
-</ds:datastoreItem>
-</file>
-
 <file path=customXml/itemProps3.xml><?xml version="1.0" encoding="utf-8"?>
-<ds:datastoreItem xmlns:ds="http://schemas.openxmlformats.org/officeDocument/2006/customXml" ds:itemID="{65E91B86-8DDE-46BD-91F6-613944CA2AD9}">
-  <ds:schemaRefs>
-    <ds:schemaRef ds:uri="http://schemas.openxmlformats.org/officeDocument/2006/bibliography"/>
-  </ds:schemaRefs>
-</ds:datastoreItem>
-</file>
-
-<file path=customXml/itemProps4.xml><?xml version="1.0" encoding="utf-8"?>
 <ds:datastoreItem xmlns:ds="http://schemas.openxmlformats.org/officeDocument/2006/customXml" ds:itemID="{E2F3C714-A796-4127-A6E6-03F54C70DCB9}">
   <ds:schemaRefs>
     <ds:schemaRef ds:uri="http://schemas.microsoft.com/office/2006/metadata/properties"/>
@@ -14839,4 +15148,12 @@
     <ds:schemaRef ds:uri="http://schemas.microsoft.com/sharepoint/v3"/>
   </ds:schemaRefs>
 </ds:datastoreItem>
+</file>
+
+<file path=customXml/itemProps4.xml><?xml version="1.0" encoding="utf-8"?>
+<ds:datastoreItem xmlns:ds="http://schemas.openxmlformats.org/officeDocument/2006/customXml" ds:itemID="{65E91B86-8DDE-46BD-91F6-613944CA2AD9}">
+  <ds:schemaRefs>
+    <ds:schemaRef ds:uri="http://schemas.openxmlformats.org/officeDocument/2006/bibliography"/>
+  </ds:schemaRefs>
+</ds:datastoreItem>
 </file>
</xml_diff>